<commit_message>
Polish EmotionCam for release
</commit_message>
<xml_diff>
--- a/emotioncam/docs/EmotionCam_User_Manual.docx
+++ b/emotioncam/docs/EmotionCam_User_Manual.docx
@@ -73,20 +73,12 @@
         <w:jc w:val="center"/>
       </w:pPr>
       <w:r>
-        <w:t>Version 1.0.0 | Updated June 15, 2026</w:t>
+        <w:t>Version 1.0.0 | Updated June 16, 2026</w:t>
       </w:r>
     </w:p>
     <w:p>
       <w:r>
         <w:br w:type="page"/>
-      </w:r>
-    </w:p>
-    <w:p>
-      <w:pPr>
-        <w:pStyle w:val="Heading1"/>
-      </w:pPr>
-      <w:r>
-        <w:t>1. Cover Page</w:t>
       </w:r>
     </w:p>
     <w:p>
@@ -130,17 +122,17 @@
     </w:p>
     <w:p>
       <w:r>
-        <w:t>EmotionCam</w:t>
+        <w:t>EmotionCam 1.0.0</w:t>
       </w:r>
     </w:p>
     <w:p>
       <w:r>
-        <w:t>*Local visible-expression estimates, with privacy-first personalized calibration*</w:t>
+        <w:t>Local visible-expression estimates with privacy-first personalized calibration</w:t>
       </w:r>
     </w:p>
     <w:p>
       <w:r>
-        <w:t>Version 1.0.0 | Updated June 15, 2026</w:t>
+        <w:t>Updated June 16, 2026</w:t>
       </w:r>
     </w:p>
     <w:p>
@@ -152,7 +144,19 @@
           <w:b/>
           <w:color w:val="7A5A00"/>
         </w:rPr>
-        <w:t>EmotionCam estimates visible facial expressions. It does not know or guarantee a person's true emotions.</w:t>
+        <w:t>EmotionCam estimates visible facial expressions. It does not know or</w:t>
+      </w:r>
+    </w:p>
+    <w:p>
+      <w:pPr>
+        <w:ind w:left="360"/>
+      </w:pPr>
+      <w:r>
+        <w:rPr>
+          <w:b/>
+          <w:color w:val="7A5A00"/>
+        </w:rPr>
+        <w:t>guarantee a person's true emotions.</w:t>
       </w:r>
     </w:p>
     <w:p>
@@ -160,17 +164,42 @@
         <w:pStyle w:val="Heading1"/>
       </w:pPr>
       <w:r>
-        <w:t>2. Introduction</w:t>
+        <w:t>1. Introduction</w:t>
       </w:r>
     </w:p>
     <w:p>
       <w:r>
-        <w:t>EmotionCam is a Windows desktop app for one person using a laptop webcam. It processes the live preview locally, estimates visible facial expressions, and presents a smoothed label, group, confidence estimate, interaction message, and timeline.</w:t>
+        <w:t>EmotionCam is a Windows desktop app for one person using a laptop webcam. It</w:t>
       </w:r>
     </w:p>
     <w:p>
       <w:r>
-        <w:t>The app can learn the user's visible facial movements through personalized calibration, run locally in the Windows system tray, and optionally save metadata-only expression history.</w:t>
+        <w:t>shows a local camera preview, estimates visible facial expressions, smooths the</w:t>
+      </w:r>
+    </w:p>
+    <w:p>
+      <w:r>
+        <w:t>result, and displays a label, group, confidence estimate, safe interaction</w:t>
+      </w:r>
+    </w:p>
+    <w:p>
+      <w:r>
+        <w:t>message, and recent timeline.</w:t>
+      </w:r>
+    </w:p>
+    <w:p>
+      <w:r>
+        <w:t>EmotionCam can also be personalized through local calibration, run in the</w:t>
+      </w:r>
+    </w:p>
+    <w:p>
+      <w:r>
+        <w:t>Windows tray, save metadata-only logs, show local Statistics, and optionally send</w:t>
+      </w:r>
+    </w:p>
+    <w:p>
+      <w:r>
+        <w:t>daily text summaries when explicitly enabled.</w:t>
       </w:r>
     </w:p>
     <w:p>
@@ -178,7 +207,7 @@
         <w:pStyle w:val="Heading1"/>
       </w:pPr>
       <w:r>
-        <w:t>3. Privacy and Safety</w:t>
+        <w:t>2. Privacy and Safety</w:t>
       </w:r>
     </w:p>
     <w:p>
@@ -186,7 +215,7 @@
         <w:pStyle w:val="ListBullet"/>
       </w:pPr>
       <w:r>
-        <w:t>Webcam processing is local. The current implementation has no cloud calls.</w:t>
+        <w:t>Webcam frames are processed locally by default.</w:t>
       </w:r>
     </w:p>
     <w:p>
@@ -202,7 +231,12 @@
         <w:pStyle w:val="ListBullet"/>
       </w:pPr>
       <w:r>
-        <w:t>There is no account, telemetry, analytics, automatic screenshot, or video-recording feature.</w:t>
+        <w:t>There is no account system, telemetry, analytics, automatic screenshot, or</w:t>
+      </w:r>
+    </w:p>
+    <w:p>
+      <w:r>
+        <w:t>video-recording feature.</w:t>
       </w:r>
     </w:p>
     <w:p>
@@ -210,7 +244,12 @@
         <w:pStyle w:val="ListBullet"/>
       </w:pPr>
       <w:r>
-        <w:t>Optional logs contain timestamps, visible-expression labels/groups, confidence, status, messages, popup status, and FPS.</w:t>
+        <w:t>Metadata logs contain expression labels/groups, confidence, status, messages,</w:t>
+      </w:r>
+    </w:p>
+    <w:p>
+      <w:r>
+        <w:t>popup status, and FPS.</w:t>
       </w:r>
     </w:p>
     <w:p>
@@ -218,7 +257,7 @@
         <w:pStyle w:val="ListBullet"/>
       </w:pPr>
       <w:r>
-        <w:t>Calibration stores normalized landmark feature vectors and labels locally.</w:t>
+        <w:t>Calibration stores local normalized feature data and labels.</w:t>
       </w:r>
     </w:p>
     <w:p>
@@ -226,7 +265,12 @@
         <w:pStyle w:val="ListBullet"/>
       </w:pPr>
       <w:r>
-        <w:t>Raw calibration frames are not saved unless Store raw calibration images for debugging is explicitly enabled.</w:t>
+        <w:t>Raw calibration frames are not saved unless the explicit debugging option is</w:t>
+      </w:r>
+    </w:p>
+    <w:p>
+      <w:r>
+        <w:t>enabled.</w:t>
       </w:r>
     </w:p>
     <w:p>
@@ -234,19 +278,17 @@
         <w:pStyle w:val="ListBullet"/>
       </w:pPr>
       <w:r>
-        <w:t>The disabled External AI agent option is a future placeholder and cannot send frames.</w:t>
+        <w:t>Daily email summaries are off by default and send text only if enabled.</w:t>
       </w:r>
     </w:p>
     <w:p>
-      <w:pPr>
-        <w:ind w:left="360"/>
-      </w:pPr>
       <w:r>
-        <w:rPr>
-          <w:b/>
-          <w:color w:val="7A5A00"/>
-        </w:rPr>
-        <w:t>Do not use EmotionCam for medical, psychological, legal, hiring, security, surveillance, or lie-detection decisions.</w:t>
+        <w:t>Do not use EmotionCam for medical, psychological, legal, hiring, security,</w:t>
+      </w:r>
+    </w:p>
+    <w:p>
+      <w:r>
+        <w:t>surveillance, or lie-detection decisions.</w:t>
       </w:r>
     </w:p>
     <w:p>
@@ -254,7 +296,7 @@
         <w:pStyle w:val="Heading1"/>
       </w:pPr>
       <w:r>
-        <w:t>4. Installation</w:t>
+        <w:t>3. Installation</w:t>
       </w:r>
     </w:p>
     <w:p>
@@ -270,7 +312,7 @@
         <w:pStyle w:val="ListNumber"/>
       </w:pPr>
       <w:r>
-        <w:t>Open EmotionCam-Setup-1.0.0.exe.</w:t>
+        <w:t>Open the repository Releases page.</w:t>
       </w:r>
     </w:p>
     <w:p>
@@ -278,7 +320,7 @@
         <w:pStyle w:val="ListNumber"/>
       </w:pPr>
       <w:r>
-        <w:t>Complete the per-user installer.</w:t>
+        <w:t>Download EmotionCam_Setup.exe from the latest release.</w:t>
       </w:r>
     </w:p>
     <w:p>
@@ -286,7 +328,7 @@
         <w:pStyle w:val="ListNumber"/>
       </w:pPr>
       <w:r>
-        <w:t>Choose the optional desktop shortcut if desired.</w:t>
+        <w:t>Run the installer.</w:t>
       </w:r>
     </w:p>
     <w:p>
@@ -294,12 +336,40 @@
         <w:pStyle w:val="ListNumber"/>
       </w:pPr>
       <w:r>
-        <w:t>Launch EmotionCam from the Start Menu or desktop shortcut.</w:t>
+        <w:t>Launch EmotionCam from the Start Menu or optional desktop shortcut.</w:t>
+      </w:r>
+    </w:p>
+    <w:p>
+      <w:pPr>
+        <w:pStyle w:val="ListNumber"/>
+      </w:pPr>
+      <w:r>
+        <w:t>Allow Windows camera access for desktop apps if prompted.</w:t>
       </w:r>
     </w:p>
     <w:p>
       <w:r>
-        <w:t>The installer uses the simplified smiling camera-lens icon for the installer, executable, shortcuts, taskbar, and tray.</w:t>
+        <w:t>The app installs per user under:</w:t>
+      </w:r>
+    </w:p>
+    <w:p>
+      <w:pPr/>
+      <w:r>
+        <w:rPr>
+          <w:rFonts w:ascii="Consolas" w:hAnsi="Consolas"/>
+          <w:sz w:val="18"/>
+        </w:rPr>
+        <w:t>%LOCALAPPDATA%\Programs\EmotionCam</w:t>
+      </w:r>
+    </w:p>
+    <w:p>
+      <w:r>
+        <w:t>The installer is unsigned, so Windows SmartScreen may show a warning. Choose</w:t>
+      </w:r>
+    </w:p>
+    <w:p>
+      <w:r>
+        <w:t>More info &gt; Run anyway only if you trust the downloaded file.</w:t>
       </w:r>
     </w:p>
     <w:p>
@@ -317,8 +387,6 @@
           <w:rFonts w:ascii="Consolas" w:hAnsi="Consolas"/>
           <w:sz w:val="18"/>
         </w:rPr>
-        <w:t>cd "C:\path\to\AI webcam emotion detector\emotioncam"</w:t>
-        <w:br/>
         <w:t>py -3.12 -m venv .venv</w:t>
         <w:br/>
         <w:t>.\.venv\Scripts\Activate.ps1</w:t>
@@ -331,53 +399,21 @@
       </w:r>
     </w:p>
     <w:p>
-      <w:r>
-        <w:t>Allow camera access for desktop apps in Windows Settings. Close Camera, Teams, Zoom, browser calls, and other apps using the webcam.</w:t>
-      </w:r>
-    </w:p>
-    <w:p>
       <w:pPr>
         <w:pStyle w:val="Heading1"/>
       </w:pPr>
       <w:r>
-        <w:t>5. First Launch</w:t>
+        <w:t>4. First Launch</w:t>
       </w:r>
     </w:p>
     <w:p>
       <w:r>
-        <w:t>The startup screen shows the local-processing privacy notice and approximation notice. Save local expression metadata history is enabled by default but can be disabled before starting.</w:t>
+        <w:t>The startup screen shows the local-processing privacy notice, approximation</w:t>
       </w:r>
     </w:p>
     <w:p>
-      <w:pPr>
-        <w:pStyle w:val="ListBullet"/>
-      </w:pPr>
       <w:r>
-        <w:t>Start Camera saves the logging choice, opens the dashboard, and starts the webcam.</w:t>
-      </w:r>
-    </w:p>
-    <w:p>
-      <w:pPr>
-        <w:pStyle w:val="ListBullet"/>
-      </w:pPr>
-      <w:r>
-        <w:t>Settings opens configuration before starting.</w:t>
-      </w:r>
-    </w:p>
-    <w:p>
-      <w:pPr>
-        <w:pStyle w:val="ListBullet"/>
-      </w:pPr>
-      <w:r>
-        <w:t>Exit closes EmotionCam.</w:t>
-      </w:r>
-    </w:p>
-    <w:p>
-      <w:pPr>
-        <w:pStyle w:val="ListBullet"/>
-      </w:pPr>
-      <w:r>
-        <w:t>Help &gt; Start Demo Guide opens the offline demo page.</w:t>
+        <w:t>notice, metadata-history checkbox, Start Camera, Settings, and Exit.</w:t>
       </w:r>
     </w:p>
     <w:p>
@@ -387,7 +423,7 @@
       <w:r>
         <w:drawing>
           <wp:inline xmlns:a="http://schemas.openxmlformats.org/drawingml/2006/main" xmlns:pic="http://schemas.openxmlformats.org/drawingml/2006/picture">
-            <wp:extent cx="5394960" cy="3034665"/>
+            <wp:extent cx="5394960" cy="3371850"/>
             <wp:docPr id="3" name="Picture 3"/>
             <wp:cNvGraphicFramePr>
               <a:graphicFrameLocks noChangeAspect="1"/>
@@ -408,7 +444,7 @@
                   <pic:spPr>
                     <a:xfrm>
                       <a:off x="0" y="0"/>
-                      <a:ext cx="5394960" cy="3034665"/>
+                      <a:ext cx="5394960" cy="3371850"/>
                     </a:xfrm>
                     <a:prstGeom prst="rect"/>
                   </pic:spPr>
@@ -421,383 +457,35 @@
     </w:p>
     <w:p>
       <w:pPr>
-        <w:ind w:left="360"/>
+        <w:pStyle w:val="Heading1"/>
       </w:pPr>
       <w:r>
-        <w:rPr>
-          <w:b/>
-          <w:color w:val="7A5A00"/>
-        </w:rPr>
-        <w:t>Placeholder screen example: capture the real startup screen as docs/screenshots/01_startup_screen.png.</w:t>
+        <w:t>5. Main Dashboard</w:t>
       </w:r>
     </w:p>
     <w:p>
-      <w:pPr>
-        <w:pStyle w:val="Heading1"/>
-      </w:pPr>
       <w:r>
-        <w:t>6. Main Dashboard</w:t>
+        <w:t>The dashboard contains the camera preview, face rectangle, current likely</w:t>
       </w:r>
     </w:p>
-    <w:tbl>
-      <w:tblPr>
-        <w:tblStyle w:val="TableGrid"/>
-        <w:tblW w:type="auto" w:w="0"/>
-        <w:tblLayout w:type="fixed"/>
-        <w:tblLook w:firstColumn="1" w:firstRow="1" w:lastColumn="0" w:lastRow="0" w:noHBand="0" w:noVBand="1" w:val="04A0"/>
-      </w:tblPr>
-      <w:tblGrid>
-        <w:gridCol w:w="4680"/>
-        <w:gridCol w:w="4680"/>
-      </w:tblGrid>
-      <w:tr>
-        <w:tc>
-          <w:tcPr>
-            <w:tcW w:type="dxa" w:w="4680"/>
-            <w:vAlign w:val="center"/>
-            <w:shd w:fill="E8EEF5"/>
-          </w:tcPr>
-          <w:p>
-            <w:r>
-              <w:rPr>
-                <w:b/>
-              </w:rPr>
-              <w:t>Area or control</w:t>
-            </w:r>
-          </w:p>
-        </w:tc>
-        <w:tc>
-          <w:tcPr>
-            <w:tcW w:type="dxa" w:w="4680"/>
-            <w:vAlign w:val="center"/>
-            <w:shd w:fill="E8EEF5"/>
-          </w:tcPr>
-          <w:p>
-            <w:r>
-              <w:rPr>
-                <w:b/>
-              </w:rPr>
-              <w:t>Purpose</w:t>
-            </w:r>
-          </w:p>
-        </w:tc>
-      </w:tr>
-      <w:tr>
-        <w:tc>
-          <w:tcPr>
-            <w:tcW w:type="dxa" w:w="4680"/>
-            <w:vAlign w:val="center"/>
-          </w:tcPr>
-          <w:p>
-            <w:r>
-              <w:t>Webcam preview</w:t>
-            </w:r>
-          </w:p>
-        </w:tc>
-        <w:tc>
-          <w:tcPr>
-            <w:tcW w:type="dxa" w:w="4680"/>
-            <w:vAlign w:val="center"/>
-          </w:tcPr>
-          <w:p>
-            <w:r>
-              <w:t>Live local preview and optional face rectangle</w:t>
-            </w:r>
-          </w:p>
-        </w:tc>
-      </w:tr>
-      <w:tr>
-        <w:tc>
-          <w:tcPr>
-            <w:tcW w:type="dxa" w:w="4680"/>
-            <w:vAlign w:val="center"/>
-          </w:tcPr>
-          <w:p>
-            <w:r>
-              <w:t>Current likely expression</w:t>
-            </w:r>
-          </w:p>
-        </w:tc>
-        <w:tc>
-          <w:tcPr>
-            <w:tcW w:type="dxa" w:w="4680"/>
-            <w:vAlign w:val="center"/>
-          </w:tcPr>
-          <w:p>
-            <w:r>
-              <w:t>Smoothed visible-expression estimate</w:t>
-            </w:r>
-          </w:p>
-        </w:tc>
-      </w:tr>
-      <w:tr>
-        <w:tc>
-          <w:tcPr>
-            <w:tcW w:type="dxa" w:w="4680"/>
-            <w:vAlign w:val="center"/>
-          </w:tcPr>
-          <w:p>
-            <w:r>
-              <w:t>Expression group / confidence</w:t>
-            </w:r>
-          </w:p>
-        </w:tc>
-        <w:tc>
-          <w:tcPr>
-            <w:tcW w:type="dxa" w:w="4680"/>
-            <w:vAlign w:val="center"/>
-          </w:tcPr>
-          <w:p>
-            <w:r>
-              <w:t>Positive, negative, or neutral group and estimated confidence</w:t>
-            </w:r>
-          </w:p>
-        </w:tc>
-      </w:tr>
-      <w:tr>
-        <w:tc>
-          <w:tcPr>
-            <w:tcW w:type="dxa" w:w="4680"/>
-            <w:vAlign w:val="center"/>
-          </w:tcPr>
-          <w:p>
-            <w:r>
-              <w:t>Interaction message / timeline</w:t>
-            </w:r>
-          </w:p>
-        </w:tc>
-        <w:tc>
-          <w:tcPr>
-            <w:tcW w:type="dxa" w:w="4680"/>
-            <w:vAlign w:val="center"/>
-          </w:tcPr>
-          <w:p>
-            <w:r>
-              <w:t>Safe text message and recent smoothed labels</w:t>
-            </w:r>
-          </w:p>
-        </w:tc>
-      </w:tr>
-      <w:tr>
-        <w:tc>
-          <w:tcPr>
-            <w:tcW w:type="dxa" w:w="4680"/>
-            <w:vAlign w:val="center"/>
-          </w:tcPr>
-          <w:p>
-            <w:r>
-              <w:t>Detection mode / profile status</w:t>
-            </w:r>
-          </w:p>
-        </w:tc>
-        <w:tc>
-          <w:tcPr>
-            <w:tcW w:type="dxa" w:w="4680"/>
-            <w:vAlign w:val="center"/>
-          </w:tcPr>
-          <w:p>
-            <w:r>
-              <w:t>Heuristic, Personalized, or Hybrid; profile active/inactive</w:t>
-            </w:r>
-          </w:p>
-        </w:tc>
-      </w:tr>
-      <w:tr>
-        <w:tc>
-          <w:tcPr>
-            <w:tcW w:type="dxa" w:w="4680"/>
-            <w:vAlign w:val="center"/>
-          </w:tcPr>
-          <w:p>
-            <w:r>
-              <w:t>Start Camera / Stop Camera</w:t>
-            </w:r>
-          </w:p>
-        </w:tc>
-        <w:tc>
-          <w:tcPr>
-            <w:tcW w:type="dxa" w:w="4680"/>
-            <w:vAlign w:val="center"/>
-          </w:tcPr>
-          <w:p>
-            <w:r>
-              <w:t>Opens or releases the webcam</w:t>
-            </w:r>
-          </w:p>
-        </w:tc>
-      </w:tr>
-      <w:tr>
-        <w:tc>
-          <w:tcPr>
-            <w:tcW w:type="dxa" w:w="4680"/>
-            <w:vAlign w:val="center"/>
-          </w:tcPr>
-          <w:p>
-            <w:r>
-              <w:t>Pause Analysis</w:t>
-            </w:r>
-          </w:p>
-        </w:tc>
-        <w:tc>
-          <w:tcPr>
-            <w:tcW w:type="dxa" w:w="4680"/>
-            <w:vAlign w:val="center"/>
-          </w:tcPr>
-          <w:p>
-            <w:r>
-              <w:t>Keeps preview active while pausing classification</w:t>
-            </w:r>
-          </w:p>
-        </w:tc>
-      </w:tr>
-      <w:tr>
-        <w:tc>
-          <w:tcPr>
-            <w:tcW w:type="dxa" w:w="4680"/>
-            <w:vAlign w:val="center"/>
-          </w:tcPr>
-          <w:p>
-            <w:r>
-              <w:t>Settings / Open Logs</w:t>
-            </w:r>
-          </w:p>
-        </w:tc>
-        <w:tc>
-          <w:tcPr>
-            <w:tcW w:type="dxa" w:w="4680"/>
-            <w:vAlign w:val="center"/>
-          </w:tcPr>
-          <w:p>
-            <w:r>
-              <w:t>Opens configuration or the local logs folder</w:t>
-            </w:r>
-          </w:p>
-        </w:tc>
-      </w:tr>
-      <w:tr>
-        <w:tc>
-          <w:tcPr>
-            <w:tcW w:type="dxa" w:w="4680"/>
-            <w:vAlign w:val="center"/>
-          </w:tcPr>
-          <w:p>
-            <w:r>
-              <w:t>Statistics</w:t>
-            </w:r>
-          </w:p>
-        </w:tc>
-        <w:tc>
-          <w:tcPr>
-            <w:tcW w:type="dxa" w:w="4680"/>
-            <w:vAlign w:val="center"/>
-          </w:tcPr>
-          <w:p>
-            <w:r>
-              <w:t>Opens local metadata-derived charts and summary cards</w:t>
-            </w:r>
-          </w:p>
-        </w:tc>
-      </w:tr>
-      <w:tr>
-        <w:tc>
-          <w:tcPr>
-            <w:tcW w:type="dxa" w:w="4680"/>
-            <w:vAlign w:val="center"/>
-          </w:tcPr>
-          <w:p>
-            <w:r>
-              <w:t>Run in background</w:t>
-            </w:r>
-          </w:p>
-        </w:tc>
-        <w:tc>
-          <w:tcPr>
-            <w:tcW w:type="dxa" w:w="4680"/>
-            <w:vAlign w:val="center"/>
-          </w:tcPr>
-          <w:p>
-            <w:r>
-              <w:t>Keeps local analysis active in tray/taskbar mode</w:t>
-            </w:r>
-          </w:p>
-        </w:tc>
-      </w:tr>
-      <w:tr>
-        <w:tc>
-          <w:tcPr>
-            <w:tcW w:type="dxa" w:w="4680"/>
-            <w:vAlign w:val="center"/>
-          </w:tcPr>
-          <w:p>
-            <w:r>
-              <w:t>Toggle Debug</w:t>
-            </w:r>
-          </w:p>
-        </w:tc>
-        <w:tc>
-          <w:tcPr>
-            <w:tcW w:type="dxa" w:w="4680"/>
-            <w:vAlign w:val="center"/>
-          </w:tcPr>
-          <w:p>
-            <w:r>
-              <w:t>Shows raw/smoothed estimates and detector details</w:t>
-            </w:r>
-          </w:p>
-        </w:tc>
-      </w:tr>
-      <w:tr>
-        <w:tc>
-          <w:tcPr>
-            <w:tcW w:type="dxa" w:w="4680"/>
-            <w:vAlign w:val="center"/>
-          </w:tcPr>
-          <w:p>
-            <w:r>
-              <w:t>Improve detection with calibration</w:t>
-            </w:r>
-          </w:p>
-        </w:tc>
-        <w:tc>
-          <w:tcPr>
-            <w:tcW w:type="dxa" w:w="4680"/>
-            <w:vAlign w:val="center"/>
-          </w:tcPr>
-          <w:p>
-            <w:r>
-              <w:t>Opens personalized calibration</w:t>
-            </w:r>
-          </w:p>
-        </w:tc>
-      </w:tr>
-      <w:tr>
-        <w:tc>
-          <w:tcPr>
-            <w:tcW w:type="dxa" w:w="4680"/>
-            <w:vAlign w:val="center"/>
-          </w:tcPr>
-          <w:p>
-            <w:r>
-              <w:t>Exit</w:t>
-            </w:r>
-          </w:p>
-        </w:tc>
-        <w:tc>
-          <w:tcPr>
-            <w:tcW w:type="dxa" w:w="4680"/>
-            <w:vAlign w:val="center"/>
-          </w:tcPr>
-          <w:p>
-            <w:r>
-              <w:t>Stops the camera and closes the app</w:t>
-            </w:r>
-          </w:p>
-        </w:tc>
-      </w:tr>
-    </w:tbl>
     <w:p>
       <w:r>
-        <w:t>Rectangle colors use the smoothed group:</w:t>
+        <w:t>expression, expression group, confidence, interaction message, timeline, logging</w:t>
+      </w:r>
+    </w:p>
+    <w:p>
+      <w:r>
+        <w:t>status, privacy status, detection mode, personalized profile status, Statistics,</w:t>
+      </w:r>
+    </w:p>
+    <w:p>
+      <w:r>
+        <w:t>Settings, Open Logs, Run in background, and Exit controls.</w:t>
+      </w:r>
+    </w:p>
+    <w:p>
+      <w:r>
+        <w:t>Rectangle colors use the smoothed expression group:</w:t>
       </w:r>
     </w:p>
     <w:p>
@@ -831,7 +519,7 @@
       <w:r>
         <w:drawing>
           <wp:inline xmlns:a="http://schemas.openxmlformats.org/drawingml/2006/main" xmlns:pic="http://schemas.openxmlformats.org/drawingml/2006/picture">
-            <wp:extent cx="5394960" cy="3034665"/>
+            <wp:extent cx="5394960" cy="3371850"/>
             <wp:docPr id="4" name="Picture 4"/>
             <wp:cNvGraphicFramePr>
               <a:graphicFrameLocks noChangeAspect="1"/>
@@ -852,7 +540,7 @@
                   <pic:spPr>
                     <a:xfrm>
                       <a:off x="0" y="0"/>
-                      <a:ext cx="5394960" cy="3034665"/>
+                      <a:ext cx="5394960" cy="3371850"/>
                     </a:xfrm>
                     <a:prstGeom prst="rect"/>
                   </pic:spPr>
@@ -865,24 +553,12 @@
     </w:p>
     <w:p>
       <w:pPr>
-        <w:ind w:left="360"/>
-      </w:pPr>
-      <w:r>
-        <w:rPr>
-          <w:b/>
-          <w:color w:val="7A5A00"/>
-        </w:rPr>
-        <w:t>Placeholder: dark dashboard.</w:t>
-      </w:r>
-    </w:p>
-    <w:p>
-      <w:pPr>
         <w:jc w:val="center"/>
       </w:pPr>
       <w:r>
         <w:drawing>
           <wp:inline xmlns:a="http://schemas.openxmlformats.org/drawingml/2006/main" xmlns:pic="http://schemas.openxmlformats.org/drawingml/2006/picture">
-            <wp:extent cx="5394960" cy="3034665"/>
+            <wp:extent cx="5394960" cy="3371850"/>
             <wp:docPr id="5" name="Picture 5"/>
             <wp:cNvGraphicFramePr>
               <a:graphicFrameLocks noChangeAspect="1"/>
@@ -903,7 +579,7 @@
                   <pic:spPr>
                     <a:xfrm>
                       <a:off x="0" y="0"/>
-                      <a:ext cx="5394960" cy="3034665"/>
+                      <a:ext cx="5394960" cy="3371850"/>
                     </a:xfrm>
                     <a:prstGeom prst="rect"/>
                   </pic:spPr>
@@ -916,22 +592,10 @@
     </w:p>
     <w:p>
       <w:pPr>
-        <w:ind w:left="360"/>
-      </w:pPr>
-      <w:r>
-        <w:rPr>
-          <w:b/>
-          <w:color w:val="7A5A00"/>
-        </w:rPr>
-        <w:t>Placeholder: light dashboard after changing Settings &gt; Theme &gt; Light and saving.</w:t>
-      </w:r>
-    </w:p>
-    <w:p>
-      <w:pPr>
         <w:pStyle w:val="Heading1"/>
       </w:pPr>
       <w:r>
-        <w:t>7. Starting and Stopping Camera</w:t>
+        <w:t>6. Starting and Stopping the Camera</w:t>
       </w:r>
     </w:p>
     <w:p>
@@ -939,7 +603,7 @@
         <w:pStyle w:val="ListNumber"/>
       </w:pPr>
       <w:r>
-        <w:t>Select Start Camera.</w:t>
+        <w:t>Click Start Camera.</w:t>
       </w:r>
     </w:p>
     <w:p>
@@ -947,7 +611,7 @@
         <w:pStyle w:val="ListNumber"/>
       </w:pPr>
       <w:r>
-        <w:t>Wait for Camera running - analysis is local.</w:t>
+        <w:t>Wait for the dashboard preview and local analysis status.</w:t>
       </w:r>
     </w:p>
     <w:p>
@@ -955,7 +619,12 @@
         <w:pStyle w:val="ListNumber"/>
       </w:pPr>
       <w:r>
-        <w:t>Use Pause Analysis to pause classification while the preview remains active.</w:t>
+        <w:t>Use Pause Analysis to pause classification while the preview remains</w:t>
+      </w:r>
+    </w:p>
+    <w:p>
+      <w:r>
+        <w:t>active.</w:t>
       </w:r>
     </w:p>
     <w:p>
@@ -963,7 +632,12 @@
         <w:pStyle w:val="ListNumber"/>
       </w:pPr>
       <w:r>
-        <w:t>Use Stop Camera to stop analysis, release the webcam, and remove the last frame.</w:t>
+        <w:t>Click Stop Camera to stop analysis, release the camera, and clear the</w:t>
+      </w:r>
+    </w:p>
+    <w:p>
+      <w:r>
+        <w:t>last frame.</w:t>
       </w:r>
     </w:p>
     <w:p>
@@ -971,7 +645,7 @@
         <w:pStyle w:val="ListNumber"/>
       </w:pPr>
       <w:r>
-        <w:t>Confirm the preview is black with centered Camera stopped.</w:t>
+        <w:t>The preview shows a black Camera stopped screen.</w:t>
       </w:r>
     </w:p>
     <w:p>
@@ -979,7 +653,7 @@
         <w:pStyle w:val="ListNumber"/>
       </w:pPr>
       <w:r>
-        <w:t>Select Start Camera to restart.</w:t>
+        <w:t>Click Start Camera again to restart.</w:t>
       </w:r>
     </w:p>
     <w:p>
@@ -989,7 +663,7 @@
       <w:r>
         <w:drawing>
           <wp:inline xmlns:a="http://schemas.openxmlformats.org/drawingml/2006/main" xmlns:pic="http://schemas.openxmlformats.org/drawingml/2006/picture">
-            <wp:extent cx="5394960" cy="3034665"/>
+            <wp:extent cx="5394960" cy="3371850"/>
             <wp:docPr id="6" name="Picture 6"/>
             <wp:cNvGraphicFramePr>
               <a:graphicFrameLocks noChangeAspect="1"/>
@@ -998,7 +672,7 @@
               <a:graphicData uri="http://schemas.openxmlformats.org/drawingml/2006/picture">
                 <pic:pic>
                   <pic:nvPicPr>
-                    <pic:cNvPr id="0" name="13_camera_stopped_screen.png"/>
+                    <pic:cNvPr id="0" name="04_camera_stopped_screen.png"/>
                     <pic:cNvPicPr/>
                   </pic:nvPicPr>
                   <pic:blipFill>
@@ -1010,7 +684,7 @@
                   <pic:spPr>
                     <a:xfrm>
                       <a:off x="0" y="0"/>
-                      <a:ext cx="5394960" cy="3034665"/>
+                      <a:ext cx="5394960" cy="3371850"/>
                     </a:xfrm>
                     <a:prstGeom prst="rect"/>
                   </pic:spPr>
@@ -1023,32 +697,35 @@
     </w:p>
     <w:p>
       <w:pPr>
-        <w:ind w:left="360"/>
-      </w:pPr>
-      <w:r>
-        <w:rPr>
-          <w:b/>
-          <w:color w:val="7A5A00"/>
-        </w:rPr>
-        <w:t>Placeholder: black stopped-camera screen.</w:t>
-      </w:r>
-    </w:p>
-    <w:p>
-      <w:pPr>
         <w:pStyle w:val="Heading1"/>
       </w:pPr>
       <w:r>
-        <w:t>8. Expression Detection</w:t>
+        <w:t>7. Expression Detection</w:t>
       </w:r>
     </w:p>
     <w:p>
       <w:r>
-        <w:t>Heuristic labels include neutral, happy, smile, laughing, surprised, sad, angry, fearful, disgusted, confused, focused, tired, unknown, low_confidence, and no_face.</w:t>
+        <w:t>Heuristic labels include neutral, happy, smile, laughing, surprised,</w:t>
       </w:r>
     </w:p>
     <w:p>
       <w:r>
-        <w:t>Personalized calibration additionally supports smile_small, smile_big, amused, bored, frustrated, concerned, skeptical, thinking, and relaxed.</w:t>
+        <w:t>sad, angry, fearful, disgusted, confused, focused, tired,</w:t>
+      </w:r>
+    </w:p>
+    <w:p>
+      <w:r>
+        <w:t>unknown, low_confidence, and no_face.</w:t>
+      </w:r>
+    </w:p>
+    <w:p>
+      <w:r>
+        <w:t>Personalized calibration also supports smile_small, smile_big, amused,</w:t>
+      </w:r>
+    </w:p>
+    <w:p>
+      <w:r>
+        <w:t>bored, frustrated, concerned, skeptical, thinking, and relaxed.</w:t>
       </w:r>
     </w:p>
     <w:tbl>
@@ -1169,12 +846,17 @@
     </w:tbl>
     <w:p>
       <w:r>
-        <w:t>Confidence is an estimate, not a guarantee. Temporal smoothing and a stable-expression duration reduce flicker. Strong negative labels require more confidence, while uncertain results fall back toward neutral or unknown.</w:t>
+        <w:t>Confidence is an estimate. Temporal smoothing and stable-expression timing</w:t>
       </w:r>
     </w:p>
     <w:p>
       <w:r>
-        <w:t>Lighting, blur, distance, glasses, occlusion, and head angle can affect results. MediaPipe landmarks improve moderate-angle handling; OpenCV is a fallback. Calibration helps because it learns local normalized feature patterns from the user's own visible movements.</w:t>
+        <w:t>reduce flicker. Strong negative labels require higher confidence, while</w:t>
+      </w:r>
+    </w:p>
+    <w:p>
+      <w:r>
+        <w:t>uncertain results fall back toward neutral or unknown.</w:t>
       </w:r>
     </w:p>
     <w:p>
@@ -1182,17 +864,22 @@
         <w:pStyle w:val="Heading1"/>
       </w:pPr>
       <w:r>
-        <w:t>9. Personalized Calibration</w:t>
+        <w:t>8. Personalized Calibration</w:t>
       </w:r>
     </w:p>
     <w:p>
       <w:r>
-        <w:t>Open calibration from Improve detection with calibration or Settings &gt; Train / Calibrate Expressions.</w:t>
+        <w:t>Open calibration from Improve detection with calibration or Settings &gt;</w:t>
       </w:r>
     </w:p>
     <w:p>
       <w:r>
-        <w:t>The unified calibration screen includes:</w:t>
+        <w:t>Train / Calibrate Expressions.</w:t>
+      </w:r>
+    </w:p>
+    <w:p>
+      <w:r>
+        <w:t>The calibration screen includes:</w:t>
       </w:r>
     </w:p>
     <w:p>
@@ -1200,7 +887,7 @@
         <w:pStyle w:val="ListBullet"/>
       </w:pPr>
       <w:r>
-        <w:t>Target-expression dropdown</w:t>
+        <w:t>Target expression dropdown</w:t>
       </w:r>
     </w:p>
     <w:p>
@@ -1216,7 +903,7 @@
         <w:pStyle w:val="ListBullet"/>
       </w:pPr>
       <w:r>
-        <w:t>Live webcam preview</w:t>
+        <w:t>Demo/live preview area</w:t>
       </w:r>
     </w:p>
     <w:p>
@@ -1248,81 +935,17 @@
         <w:pStyle w:val="ListBullet"/>
       </w:pPr>
       <w:r>
-        <w:t>Capture progress, valid/rejected/stored counts, rejection reason, and quality summary</w:t>
+        <w:t>Progress, valid sample count, rejected sample count, and quality summary</w:t>
       </w:r>
     </w:p>
     <w:p>
       <w:r>
-        <w:t>The match helper shows when the current smoothed estimate roughly matches the target or a related expression family. It is guidance only and never blocks capture. Example graphics are local guides and do not need to be copied perfectly.</w:t>
-      </w:r>
-    </w:p>
-    <w:p>
-      <w:pPr>
-        <w:pStyle w:val="Heading2"/>
-      </w:pPr>
-      <w:r>
-        <w:t>Capture an expression</w:t>
-      </w:r>
-    </w:p>
-    <w:p>
-      <w:pPr>
-        <w:pStyle w:val="ListNumber"/>
-      </w:pPr>
-      <w:r>
-        <w:t>Choose a target from the dropdown.</w:t>
-      </w:r>
-    </w:p>
-    <w:p>
-      <w:pPr>
-        <w:pStyle w:val="ListNumber"/>
-      </w:pPr>
-      <w:r>
-        <w:t>Prepare the visible expression.</w:t>
-      </w:r>
-    </w:p>
-    <w:p>
-      <w:pPr>
-        <w:pStyle w:val="ListNumber"/>
-      </w:pPr>
-      <w:r>
-        <w:t>Select Start Capture.</w:t>
-      </w:r>
-    </w:p>
-    <w:p>
-      <w:pPr>
-        <w:pStyle w:val="ListNumber"/>
-      </w:pPr>
-      <w:r>
-        <w:t>Review valid/rejected counts and quality.</w:t>
-      </w:r>
-    </w:p>
-    <w:p>
-      <w:pPr>
-        <w:pStyle w:val="ListNumber"/>
-      </w:pPr>
-      <w:r>
-        <w:t>Select Re-capture to remove and replace that target's previous batch.</w:t>
-      </w:r>
-    </w:p>
-    <w:p>
-      <w:pPr>
-        <w:pStyle w:val="ListNumber"/>
-      </w:pPr>
-      <w:r>
-        <w:t>Navigate with Previous, Next, or the dropdown.</w:t>
-      </w:r>
-    </w:p>
-    <w:p>
-      <w:pPr>
-        <w:pStyle w:val="ListNumber"/>
-      </w:pPr>
-      <w:r>
-        <w:t>Select Finish after at least one valid target is stored.</w:t>
+        <w:t>The old Skip button and separate Label Unknown Expression flow were</w:t>
       </w:r>
     </w:p>
     <w:p>
       <w:r>
-        <w:t>The old Skip button and separate Label Unknown Expression flow were removed. Users now choose the target directly from the unified dropdown.</w:t>
+        <w:t>removed. Users now choose the target expression directly from the dropdown.</w:t>
       </w:r>
     </w:p>
     <w:p>
@@ -1332,7 +955,7 @@
       <w:r>
         <w:drawing>
           <wp:inline xmlns:a="http://schemas.openxmlformats.org/drawingml/2006/main" xmlns:pic="http://schemas.openxmlformats.org/drawingml/2006/picture">
-            <wp:extent cx="5394960" cy="3034665"/>
+            <wp:extent cx="5394960" cy="3371850"/>
             <wp:docPr id="7" name="Picture 7"/>
             <wp:cNvGraphicFramePr>
               <a:graphicFrameLocks noChangeAspect="1"/>
@@ -1341,7 +964,7 @@
               <a:graphicData uri="http://schemas.openxmlformats.org/drawingml/2006/picture">
                 <pic:pic>
                   <pic:nvPicPr>
-                    <pic:cNvPr id="0" name="07_calibration_expression_dropdown.png"/>
+                    <pic:cNvPr id="0" name="09_calibration_overview.png"/>
                     <pic:cNvPicPr/>
                   </pic:nvPicPr>
                   <pic:blipFill>
@@ -1353,7 +976,7 @@
                   <pic:spPr>
                     <a:xfrm>
                       <a:off x="0" y="0"/>
-                      <a:ext cx="5394960" cy="3034665"/>
+                      <a:ext cx="5394960" cy="3371850"/>
                     </a:xfrm>
                     <a:prstGeom prst="rect"/>
                   </pic:spPr>
@@ -1371,7 +994,7 @@
       <w:r>
         <w:drawing>
           <wp:inline xmlns:a="http://schemas.openxmlformats.org/drawingml/2006/main" xmlns:pic="http://schemas.openxmlformats.org/drawingml/2006/picture">
-            <wp:extent cx="5394960" cy="3034665"/>
+            <wp:extent cx="5394960" cy="3371850"/>
             <wp:docPr id="8" name="Picture 8"/>
             <wp:cNvGraphicFramePr>
               <a:graphicFrameLocks noChangeAspect="1"/>
@@ -1380,7 +1003,7 @@
               <a:graphicData uri="http://schemas.openxmlformats.org/drawingml/2006/picture">
                 <pic:pic>
                   <pic:nvPicPr>
-                    <pic:cNvPr id="0" name="08_calibration_example_graphic.png"/>
+                    <pic:cNvPr id="0" name="10_calibration_expression_dropdown.png"/>
                     <pic:cNvPicPr/>
                   </pic:nvPicPr>
                   <pic:blipFill>
@@ -1392,7 +1015,7 @@
                   <pic:spPr>
                     <a:xfrm>
                       <a:off x="0" y="0"/>
-                      <a:ext cx="5394960" cy="3034665"/>
+                      <a:ext cx="5394960" cy="3371850"/>
                     </a:xfrm>
                     <a:prstGeom prst="rect"/>
                   </pic:spPr>
@@ -1410,7 +1033,7 @@
       <w:r>
         <w:drawing>
           <wp:inline xmlns:a="http://schemas.openxmlformats.org/drawingml/2006/main" xmlns:pic="http://schemas.openxmlformats.org/drawingml/2006/picture">
-            <wp:extent cx="5394960" cy="3034665"/>
+            <wp:extent cx="5394960" cy="3371850"/>
             <wp:docPr id="9" name="Picture 9"/>
             <wp:cNvGraphicFramePr>
               <a:graphicFrameLocks noChangeAspect="1"/>
@@ -1419,7 +1042,7 @@
               <a:graphicData uri="http://schemas.openxmlformats.org/drawingml/2006/picture">
                 <pic:pic>
                   <pic:nvPicPr>
-                    <pic:cNvPr id="0" name="09_calibration_match_checkmark.png"/>
+                    <pic:cNvPr id="0" name="11_calibration_example_graphic.png"/>
                     <pic:cNvPicPr/>
                   </pic:nvPicPr>
                   <pic:blipFill>
@@ -1431,7 +1054,7 @@
                   <pic:spPr>
                     <a:xfrm>
                       <a:off x="0" y="0"/>
-                      <a:ext cx="5394960" cy="3034665"/>
+                      <a:ext cx="5394960" cy="3371850"/>
                     </a:xfrm>
                     <a:prstGeom prst="rect"/>
                   </pic:spPr>
@@ -1449,7 +1072,7 @@
       <w:r>
         <w:drawing>
           <wp:inline xmlns:a="http://schemas.openxmlformats.org/drawingml/2006/main" xmlns:pic="http://schemas.openxmlformats.org/drawingml/2006/picture">
-            <wp:extent cx="5394960" cy="3034665"/>
+            <wp:extent cx="5394960" cy="3371850"/>
             <wp:docPr id="10" name="Picture 10"/>
             <wp:cNvGraphicFramePr>
               <a:graphicFrameLocks noChangeAspect="1"/>
@@ -1458,7 +1081,7 @@
               <a:graphicData uri="http://schemas.openxmlformats.org/drawingml/2006/picture">
                 <pic:pic>
                   <pic:nvPicPr>
-                    <pic:cNvPr id="0" name="10_calibration_capture_progress.png"/>
+                    <pic:cNvPr id="0" name="12_calibration_match_checkmark.png"/>
                     <pic:cNvPicPr/>
                   </pic:nvPicPr>
                   <pic:blipFill>
@@ -1470,7 +1093,94 @@
                   <pic:spPr>
                     <a:xfrm>
                       <a:off x="0" y="0"/>
-                      <a:ext cx="5394960" cy="3034665"/>
+                      <a:ext cx="5394960" cy="3371850"/>
+                    </a:xfrm>
+                    <a:prstGeom prst="rect"/>
+                  </pic:spPr>
+                </pic:pic>
+              </a:graphicData>
+            </a:graphic>
+          </wp:inline>
+        </w:drawing>
+      </w:r>
+    </w:p>
+    <w:p>
+      <w:pPr>
+        <w:pStyle w:val="Heading1"/>
+      </w:pPr>
+      <w:r>
+        <w:t>9. Settings</w:t>
+      </w:r>
+    </w:p>
+    <w:p>
+      <w:r>
+        <w:t>Settings include Appearance, User Profile, Daily Email Summary, Camera and</w:t>
+      </w:r>
+    </w:p>
+    <w:p>
+      <w:r>
+        <w:t>Detection, Personalized calibration, Background, Privacy/logging, and Debug</w:t>
+      </w:r>
+    </w:p>
+    <w:p>
+      <w:r>
+        <w:t>options.</w:t>
+      </w:r>
+    </w:p>
+    <w:p>
+      <w:r>
+        <w:t>Use Appearance &gt; Theme to switch between Dark and Light. The theme is saved</w:t>
+      </w:r>
+    </w:p>
+    <w:p>
+      <w:r>
+        <w:t>locally and applies across the dashboard, Settings, calibration, Statistics,</w:t>
+      </w:r>
+    </w:p>
+    <w:p>
+      <w:r>
+        <w:t>buttons, inputs, progress bars, and message areas.</w:t>
+      </w:r>
+    </w:p>
+    <w:p>
+      <w:r>
+        <w:t>All numeric fields use spinner controls. You can type values or use the visible</w:t>
+      </w:r>
+    </w:p>
+    <w:p>
+      <w:r>
+        <w:t>up/down arrows.</w:t>
+      </w:r>
+    </w:p>
+    <w:p>
+      <w:pPr>
+        <w:jc w:val="center"/>
+      </w:pPr>
+      <w:r>
+        <w:drawing>
+          <wp:inline xmlns:a="http://schemas.openxmlformats.org/drawingml/2006/main" xmlns:pic="http://schemas.openxmlformats.org/drawingml/2006/picture">
+            <wp:extent cx="5394960" cy="3371850"/>
+            <wp:docPr id="11" name="Picture 11"/>
+            <wp:cNvGraphicFramePr>
+              <a:graphicFrameLocks noChangeAspect="1"/>
+            </wp:cNvGraphicFramePr>
+            <a:graphic>
+              <a:graphicData uri="http://schemas.openxmlformats.org/drawingml/2006/picture">
+                <pic:pic>
+                  <pic:nvPicPr>
+                    <pic:cNvPr id="0" name="05_settings_general_dark.png"/>
+                    <pic:cNvPicPr/>
+                  </pic:nvPicPr>
+                  <pic:blipFill>
+                    <a:blip r:embed="rId18"/>
+                    <a:stretch>
+                      <a:fillRect/>
+                    </a:stretch>
+                  </pic:blipFill>
+                  <pic:spPr>
+                    <a:xfrm>
+                      <a:off x="0" y="0"/>
+                      <a:ext cx="5394960" cy="3371850"/>
                     </a:xfrm>
                     <a:prstGeom prst="rect"/>
                   </pic:spPr>
@@ -1488,8 +1198,8 @@
       <w:r>
         <w:drawing>
           <wp:inline xmlns:a="http://schemas.openxmlformats.org/drawingml/2006/main" xmlns:pic="http://schemas.openxmlformats.org/drawingml/2006/picture">
-            <wp:extent cx="5394960" cy="3034665"/>
-            <wp:docPr id="11" name="Picture 11"/>
+            <wp:extent cx="5394960" cy="3371850"/>
+            <wp:docPr id="12" name="Picture 12"/>
             <wp:cNvGraphicFramePr>
               <a:graphicFrameLocks noChangeAspect="1"/>
             </wp:cNvGraphicFramePr>
@@ -1497,11 +1207,11 @@
               <a:graphicData uri="http://schemas.openxmlformats.org/drawingml/2006/picture">
                 <pic:pic>
                   <pic:nvPicPr>
-                    <pic:cNvPr id="0" name="11_calibration_recapture_button.png"/>
+                    <pic:cNvPr id="0" name="06_settings_general_light.png"/>
                     <pic:cNvPicPr/>
                   </pic:nvPicPr>
                   <pic:blipFill>
-                    <a:blip r:embed="rId18"/>
+                    <a:blip r:embed="rId19"/>
                     <a:stretch>
                       <a:fillRect/>
                     </a:stretch>
@@ -1509,7 +1219,7 @@
                   <pic:spPr>
                     <a:xfrm>
                       <a:off x="0" y="0"/>
-                      <a:ext cx="5394960" cy="3034665"/>
+                      <a:ext cx="5394960" cy="3371850"/>
                     </a:xfrm>
                     <a:prstGeom prst="rect"/>
                   </pic:spPr>
@@ -1527,84 +1237,7 @@
       <w:r>
         <w:drawing>
           <wp:inline xmlns:a="http://schemas.openxmlformats.org/drawingml/2006/main" xmlns:pic="http://schemas.openxmlformats.org/drawingml/2006/picture">
-            <wp:extent cx="5394960" cy="3034665"/>
-            <wp:docPr id="12" name="Picture 12"/>
-            <wp:cNvGraphicFramePr>
-              <a:graphicFrameLocks noChangeAspect="1"/>
-            </wp:cNvGraphicFramePr>
-            <a:graphic>
-              <a:graphicData uri="http://schemas.openxmlformats.org/drawingml/2006/picture">
-                <pic:pic>
-                  <pic:nvPicPr>
-                    <pic:cNvPr id="0" name="12_calibration_previous_next_buttons.png"/>
-                    <pic:cNvPicPr/>
-                  </pic:nvPicPr>
-                  <pic:blipFill>
-                    <a:blip r:embed="rId19"/>
-                    <a:stretch>
-                      <a:fillRect/>
-                    </a:stretch>
-                  </pic:blipFill>
-                  <pic:spPr>
-                    <a:xfrm>
-                      <a:off x="0" y="0"/>
-                      <a:ext cx="5394960" cy="3034665"/>
-                    </a:xfrm>
-                    <a:prstGeom prst="rect"/>
-                  </pic:spPr>
-                </pic:pic>
-              </a:graphicData>
-            </a:graphic>
-          </wp:inline>
-        </w:drawing>
-      </w:r>
-    </w:p>
-    <w:p>
-      <w:pPr>
-        <w:ind w:left="360"/>
-      </w:pPr>
-      <w:r>
-        <w:rPr>
-          <w:b/>
-          <w:color w:val="7A5A00"/>
-        </w:rPr>
-        <w:t>These are placeholder references until real screenshots are captured.</w:t>
-      </w:r>
-    </w:p>
-    <w:p>
-      <w:pPr>
-        <w:pStyle w:val="Heading1"/>
-      </w:pPr>
-      <w:r>
-        <w:t>10. Settings</w:t>
-      </w:r>
-    </w:p>
-    <w:p>
-      <w:pPr>
-        <w:pStyle w:val="Heading2"/>
-      </w:pPr>
-      <w:r>
-        <w:t>Appearance and numeric controls</w:t>
-      </w:r>
-    </w:p>
-    <w:p>
-      <w:r>
-        <w:t>Use Settings &gt; Appearance &gt; Theme to select Dark or Light, then select Save. The theme choice is saved locally and applied app-wide to the startup screen, dashboard, settings, calibration, menus, buttons, panels, inputs, dropdowns, progress bars, and messages.</w:t>
-      </w:r>
-    </w:p>
-    <w:p>
-      <w:r>
-        <w:t>All numeric fields are spinner controls. Type a value or use the visible up/down arrow buttons. The arrow area is wide, clickable, and styled for both themes.</w:t>
-      </w:r>
-    </w:p>
-    <w:p>
-      <w:pPr>
-        <w:jc w:val="center"/>
-      </w:pPr>
-      <w:r>
-        <w:drawing>
-          <wp:inline xmlns:a="http://schemas.openxmlformats.org/drawingml/2006/main" xmlns:pic="http://schemas.openxmlformats.org/drawingml/2006/picture">
-            <wp:extent cx="5394960" cy="3034665"/>
+            <wp:extent cx="5394960" cy="3371850"/>
             <wp:docPr id="13" name="Picture 13"/>
             <wp:cNvGraphicFramePr>
               <a:graphicFrameLocks noChangeAspect="1"/>
@@ -1613,7 +1246,7 @@
               <a:graphicData uri="http://schemas.openxmlformats.org/drawingml/2006/picture">
                 <pic:pic>
                   <pic:nvPicPr>
-                    <pic:cNvPr id="0" name="04_settings_numeric_arrows_dark.png"/>
+                    <pic:cNvPr id="0" name="07_settings_numeric_arrows.png"/>
                     <pic:cNvPicPr/>
                   </pic:nvPicPr>
                   <pic:blipFill>
@@ -1625,7 +1258,7 @@
                   <pic:spPr>
                     <a:xfrm>
                       <a:off x="0" y="0"/>
-                      <a:ext cx="5394960" cy="3034665"/>
+                      <a:ext cx="5394960" cy="3371850"/>
                     </a:xfrm>
                     <a:prstGeom prst="rect"/>
                   </pic:spPr>
@@ -1643,7 +1276,7 @@
       <w:r>
         <w:drawing>
           <wp:inline xmlns:a="http://schemas.openxmlformats.org/drawingml/2006/main" xmlns:pic="http://schemas.openxmlformats.org/drawingml/2006/picture">
-            <wp:extent cx="5394960" cy="3034665"/>
+            <wp:extent cx="5394960" cy="3371850"/>
             <wp:docPr id="14" name="Picture 14"/>
             <wp:cNvGraphicFramePr>
               <a:graphicFrameLocks noChangeAspect="1"/>
@@ -1652,7 +1285,133 @@
               <a:graphicData uri="http://schemas.openxmlformats.org/drawingml/2006/picture">
                 <pic:pic>
                   <pic:nvPicPr>
-                    <pic:cNvPr id="0" name="05_settings_numeric_arrows_light.png"/>
+                    <pic:cNvPr id="0" name="06_settings_general_light.png"/>
+                    <pic:cNvPicPr/>
+                  </pic:nvPicPr>
+                  <pic:blipFill>
+                    <a:blip r:embed="rId19"/>
+                    <a:stretch>
+                      <a:fillRect/>
+                    </a:stretch>
+                  </pic:blipFill>
+                  <pic:spPr>
+                    <a:xfrm>
+                      <a:off x="0" y="0"/>
+                      <a:ext cx="5394960" cy="3371850"/>
+                    </a:xfrm>
+                    <a:prstGeom prst="rect"/>
+                  </pic:spPr>
+                </pic:pic>
+              </a:graphicData>
+            </a:graphic>
+          </wp:inline>
+        </w:drawing>
+      </w:r>
+    </w:p>
+    <w:p>
+      <w:pPr>
+        <w:pStyle w:val="Heading1"/>
+      </w:pPr>
+      <w:r>
+        <w:t>10. Statistics</w:t>
+      </w:r>
+    </w:p>
+    <w:p>
+      <w:r>
+        <w:t>Click Statistics on the dashboard to open local visual summaries generated</w:t>
+      </w:r>
+    </w:p>
+    <w:p>
+      <w:r>
+        <w:t>from expression metadata logs only.</w:t>
+      </w:r>
+    </w:p>
+    <w:p>
+      <w:r>
+        <w:t>The Statistics window includes:</w:t>
+      </w:r>
+    </w:p>
+    <w:p>
+      <w:pPr>
+        <w:pStyle w:val="ListBullet"/>
+      </w:pPr>
+      <w:r>
+        <w:t>Selected-day positive / neutral / serious-expression balance</w:t>
+      </w:r>
+    </w:p>
+    <w:p>
+      <w:pPr>
+        <w:pStyle w:val="ListBullet"/>
+      </w:pPr>
+      <w:r>
+        <w:t>Daily expression-group timeline</w:t>
+      </w:r>
+    </w:p>
+    <w:p>
+      <w:pPr>
+        <w:pStyle w:val="ListBullet"/>
+      </w:pPr>
+      <w:r>
+        <w:t>Expression counts by label</w:t>
+      </w:r>
+    </w:p>
+    <w:p>
+      <w:pPr>
+        <w:pStyle w:val="ListBullet"/>
+      </w:pPr>
+      <w:r>
+        <w:t>Last-7-days balance</w:t>
+      </w:r>
+    </w:p>
+    <w:p>
+      <w:pPr>
+        <w:pStyle w:val="ListBullet"/>
+      </w:pPr>
+      <w:r>
+        <w:t>Most frequent expression</w:t>
+      </w:r>
+    </w:p>
+    <w:p>
+      <w:pPr>
+        <w:pStyle w:val="ListBullet"/>
+      </w:pPr>
+      <w:r>
+        <w:t>Approximate analyzed entries/minutes</w:t>
+      </w:r>
+    </w:p>
+    <w:p>
+      <w:pPr>
+        <w:pStyle w:val="ListBullet"/>
+      </w:pPr>
+      <w:r>
+        <w:t>Most positive and most serious-expression periods when available</w:t>
+      </w:r>
+    </w:p>
+    <w:p>
+      <w:pPr>
+        <w:pStyle w:val="ListBullet"/>
+      </w:pPr>
+      <w:r>
+        <w:t>Refresh and Export Summary controls</w:t>
+      </w:r>
+    </w:p>
+    <w:p>
+      <w:pPr>
+        <w:jc w:val="center"/>
+      </w:pPr>
+      <w:r>
+        <w:drawing>
+          <wp:inline xmlns:a="http://schemas.openxmlformats.org/drawingml/2006/main" xmlns:pic="http://schemas.openxmlformats.org/drawingml/2006/picture">
+            <wp:extent cx="5394960" cy="3371850"/>
+            <wp:docPr id="15" name="Picture 15"/>
+            <wp:cNvGraphicFramePr>
+              <a:graphicFrameLocks noChangeAspect="1"/>
+            </wp:cNvGraphicFramePr>
+            <a:graphic>
+              <a:graphicData uri="http://schemas.openxmlformats.org/drawingml/2006/picture">
+                <pic:pic>
+                  <pic:nvPicPr>
+                    <pic:cNvPr id="0" name="13_statistics_overview.png"/>
                     <pic:cNvPicPr/>
                   </pic:nvPicPr>
                   <pic:blipFill>
@@ -1664,7 +1423,7 @@
                   <pic:spPr>
                     <a:xfrm>
                       <a:off x="0" y="0"/>
-                      <a:ext cx="5394960" cy="3034665"/>
+                      <a:ext cx="5394960" cy="3371850"/>
                     </a:xfrm>
                     <a:prstGeom prst="rect"/>
                   </pic:spPr>
@@ -1682,8 +1441,8 @@
       <w:r>
         <w:drawing>
           <wp:inline xmlns:a="http://schemas.openxmlformats.org/drawingml/2006/main" xmlns:pic="http://schemas.openxmlformats.org/drawingml/2006/picture">
-            <wp:extent cx="5394960" cy="3034665"/>
-            <wp:docPr id="15" name="Picture 15"/>
+            <wp:extent cx="5394960" cy="3371850"/>
+            <wp:docPr id="16" name="Picture 16"/>
             <wp:cNvGraphicFramePr>
               <a:graphicFrameLocks noChangeAspect="1"/>
             </wp:cNvGraphicFramePr>
@@ -1691,11 +1450,11 @@
               <a:graphicData uri="http://schemas.openxmlformats.org/drawingml/2006/picture">
                 <pic:pic>
                   <pic:nvPicPr>
-                    <pic:cNvPr id="0" name="06_settings_theme_toggle.png"/>
+                    <pic:cNvPr id="0" name="13_statistics_overview.png"/>
                     <pic:cNvPicPr/>
                   </pic:nvPicPr>
                   <pic:blipFill>
-                    <a:blip r:embed="rId22"/>
+                    <a:blip r:embed="rId21"/>
                     <a:stretch>
                       <a:fillRect/>
                     </a:stretch>
@@ -1703,7 +1462,7 @@
                   <pic:spPr>
                     <a:xfrm>
                       <a:off x="0" y="0"/>
-                      <a:ext cx="5394960" cy="3034665"/>
+                      <a:ext cx="5394960" cy="3371850"/>
                     </a:xfrm>
                     <a:prstGeom prst="rect"/>
                   </pic:spPr>
@@ -1716,681 +1475,13 @@
     </w:p>
     <w:p>
       <w:pPr>
-        <w:ind w:left="360"/>
-      </w:pPr>
-      <w:r>
-        <w:rPr>
-          <w:b/>
-          <w:color w:val="7A5A00"/>
-        </w:rPr>
-        <w:t>Placeholder screen examples: capture Settings in both themes with the spinner arrow area visible.</w:t>
-      </w:r>
-    </w:p>
-    <w:p>
-      <w:pPr>
-        <w:pStyle w:val="Heading2"/>
-      </w:pPr>
-      <w:r>
-        <w:t>Actual defaults</w:t>
-      </w:r>
-    </w:p>
-    <w:tbl>
-      <w:tblPr>
-        <w:tblStyle w:val="TableGrid"/>
-        <w:tblW w:type="auto" w:w="0"/>
-        <w:tblLayout w:type="fixed"/>
-        <w:tblLook w:firstColumn="1" w:firstRow="1" w:lastColumn="0" w:lastRow="0" w:noHBand="0" w:noVBand="1" w:val="04A0"/>
-      </w:tblPr>
-      <w:tblGrid>
-        <w:gridCol w:w="4680"/>
-        <w:gridCol w:w="4680"/>
-      </w:tblGrid>
-      <w:tr>
-        <w:tc>
-          <w:tcPr>
-            <w:tcW w:type="dxa" w:w="4680"/>
-            <w:vAlign w:val="center"/>
-            <w:shd w:fill="E8EEF5"/>
-          </w:tcPr>
-          <w:p>
-            <w:r>
-              <w:rPr>
-                <w:b/>
-              </w:rPr>
-              <w:t>Setting / config key</w:t>
-            </w:r>
-          </w:p>
-        </w:tc>
-        <w:tc>
-          <w:tcPr>
-            <w:tcW w:type="dxa" w:w="4680"/>
-            <w:vAlign w:val="center"/>
-            <w:shd w:fill="E8EEF5"/>
-          </w:tcPr>
-          <w:p>
-            <w:r>
-              <w:rPr>
-                <w:b/>
-              </w:rPr>
-              <w:t>Default</w:t>
-            </w:r>
-          </w:p>
-        </w:tc>
-      </w:tr>
-      <w:tr>
-        <w:tc>
-          <w:tcPr>
-            <w:tcW w:type="dxa" w:w="4680"/>
-            <w:vAlign w:val="center"/>
-          </w:tcPr>
-          <w:p>
-            <w:r>
-              <w:t>Theme (theme)</w:t>
-            </w:r>
-          </w:p>
-        </w:tc>
-        <w:tc>
-          <w:tcPr>
-            <w:tcW w:type="dxa" w:w="4680"/>
-            <w:vAlign w:val="center"/>
-          </w:tcPr>
-          <w:p>
-            <w:r>
-              <w:t>dark</w:t>
-            </w:r>
-          </w:p>
-        </w:tc>
-      </w:tr>
-      <w:tr>
-        <w:tc>
-          <w:tcPr>
-            <w:tcW w:type="dxa" w:w="4680"/>
-            <w:vAlign w:val="center"/>
-          </w:tcPr>
-          <w:p>
-            <w:r>
-              <w:t>Camera index (camera_index)</w:t>
-            </w:r>
-          </w:p>
-        </w:tc>
-        <w:tc>
-          <w:tcPr>
-            <w:tcW w:type="dxa" w:w="4680"/>
-            <w:vAlign w:val="center"/>
-          </w:tcPr>
-          <w:p>
-            <w:r>
-              <w:t>0</w:t>
-            </w:r>
-          </w:p>
-        </w:tc>
-      </w:tr>
-      <w:tr>
-        <w:tc>
-          <w:tcPr>
-            <w:tcW w:type="dxa" w:w="4680"/>
-            <w:vAlign w:val="center"/>
-          </w:tcPr>
-          <w:p>
-            <w:r>
-              <w:t>Detection confidence (detection_confidence_threshold)</w:t>
-            </w:r>
-          </w:p>
-        </w:tc>
-        <w:tc>
-          <w:tcPr>
-            <w:tcW w:type="dxa" w:w="4680"/>
-            <w:vAlign w:val="center"/>
-          </w:tcPr>
-          <w:p>
-            <w:r>
-              <w:t>0.45</w:t>
-            </w:r>
-          </w:p>
-        </w:tc>
-      </w:tr>
-      <w:tr>
-        <w:tc>
-          <w:tcPr>
-            <w:tcW w:type="dxa" w:w="4680"/>
-            <w:vAlign w:val="center"/>
-          </w:tcPr>
-          <w:p>
-            <w:r>
-              <w:t>Expression confidence (expression_confidence_threshold)</w:t>
-            </w:r>
-          </w:p>
-        </w:tc>
-        <w:tc>
-          <w:tcPr>
-            <w:tcW w:type="dxa" w:w="4680"/>
-            <w:vAlign w:val="center"/>
-          </w:tcPr>
-          <w:p>
-            <w:r>
-              <w:t>0.45</w:t>
-            </w:r>
-          </w:p>
-        </w:tc>
-      </w:tr>
-      <w:tr>
-        <w:tc>
-          <w:tcPr>
-            <w:tcW w:type="dxa" w:w="4680"/>
-            <w:vAlign w:val="center"/>
-          </w:tcPr>
-          <w:p>
-            <w:r>
-              <w:t>Smoothing window (smoothing_window_seconds)</w:t>
-            </w:r>
-          </w:p>
-        </w:tc>
-        <w:tc>
-          <w:tcPr>
-            <w:tcW w:type="dxa" w:w="4680"/>
-            <w:vAlign w:val="center"/>
-          </w:tcPr>
-          <w:p>
-            <w:r>
-              <w:t>1.5 s</w:t>
-            </w:r>
-          </w:p>
-        </w:tc>
-      </w:tr>
-      <w:tr>
-        <w:tc>
-          <w:tcPr>
-            <w:tcW w:type="dxa" w:w="4680"/>
-            <w:vAlign w:val="center"/>
-          </w:tcPr>
-          <w:p>
-            <w:r>
-              <w:t>Stable expression (stable_expression_seconds)</w:t>
-            </w:r>
-          </w:p>
-        </w:tc>
-        <w:tc>
-          <w:tcPr>
-            <w:tcW w:type="dxa" w:w="4680"/>
-            <w:vAlign w:val="center"/>
-          </w:tcPr>
-          <w:p>
-            <w:r>
-              <w:t>0.8 s</w:t>
-            </w:r>
-          </w:p>
-        </w:tc>
-      </w:tr>
-      <w:tr>
-        <w:tc>
-          <w:tcPr>
-            <w:tcW w:type="dxa" w:w="4680"/>
-            <w:vAlign w:val="center"/>
-          </w:tcPr>
-          <w:p>
-            <w:r>
-              <w:t>Message cooldown (message_cooldown_seconds)</w:t>
-            </w:r>
-          </w:p>
-        </w:tc>
-        <w:tc>
-          <w:tcPr>
-            <w:tcW w:type="dxa" w:w="4680"/>
-            <w:vAlign w:val="center"/>
-          </w:tcPr>
-          <w:p>
-            <w:r>
-              <w:t>8 s</w:t>
-            </w:r>
-          </w:p>
-        </w:tc>
-      </w:tr>
-      <w:tr>
-        <w:tc>
-          <w:tcPr>
-            <w:tcW w:type="dxa" w:w="4680"/>
-            <w:vAlign w:val="center"/>
-          </w:tcPr>
-          <w:p>
-            <w:r>
-              <w:t>Face-missing grace (face_missing_grace_seconds)</w:t>
-            </w:r>
-          </w:p>
-        </w:tc>
-        <w:tc>
-          <w:tcPr>
-            <w:tcW w:type="dxa" w:w="4680"/>
-            <w:vAlign w:val="center"/>
-          </w:tcPr>
-          <w:p>
-            <w:r>
-              <w:t>1.0 s</w:t>
-            </w:r>
-          </w:p>
-        </w:tc>
-      </w:tr>
-      <w:tr>
-        <w:tc>
-          <w:tcPr>
-            <w:tcW w:type="dxa" w:w="4680"/>
-            <w:vAlign w:val="center"/>
-          </w:tcPr>
-          <w:p>
-            <w:r>
-              <w:t>Negative minimum confidence</w:t>
-            </w:r>
-          </w:p>
-        </w:tc>
-        <w:tc>
-          <w:tcPr>
-            <w:tcW w:type="dxa" w:w="4680"/>
-            <w:vAlign w:val="center"/>
-          </w:tcPr>
-          <w:p>
-            <w:r>
-              <w:t>0.65</w:t>
-            </w:r>
-          </w:p>
-        </w:tc>
-      </w:tr>
-      <w:tr>
-        <w:tc>
-          <w:tcPr>
-            <w:tcW w:type="dxa" w:w="4680"/>
-            <w:vAlign w:val="center"/>
-          </w:tcPr>
-          <w:p>
-            <w:r>
-              <w:t>Positive minimum confidence</w:t>
-            </w:r>
-          </w:p>
-        </w:tc>
-        <w:tc>
-          <w:tcPr>
-            <w:tcW w:type="dxa" w:w="4680"/>
-            <w:vAlign w:val="center"/>
-          </w:tcPr>
-          <w:p>
-            <w:r>
-              <w:t>0.50</w:t>
-            </w:r>
-          </w:p>
-        </w:tc>
-      </w:tr>
-      <w:tr>
-        <w:tc>
-          <w:tcPr>
-            <w:tcW w:type="dxa" w:w="4680"/>
-            <w:vAlign w:val="center"/>
-          </w:tcPr>
-          <w:p>
-            <w:r>
-              <w:t>Show face rectangle / confidence / messages</w:t>
-            </w:r>
-          </w:p>
-        </w:tc>
-        <w:tc>
-          <w:tcPr>
-            <w:tcW w:type="dxa" w:w="4680"/>
-            <w:vAlign w:val="center"/>
-          </w:tcPr>
-          <w:p>
-            <w:r>
-              <w:t>On</w:t>
-            </w:r>
-          </w:p>
-        </w:tc>
-      </w:tr>
-      <w:tr>
-        <w:tc>
-          <w:tcPr>
-            <w:tcW w:type="dxa" w:w="4680"/>
-            <w:vAlign w:val="center"/>
-          </w:tcPr>
-          <w:p>
-            <w:r>
-              <w:t>Local metadata logging</w:t>
-            </w:r>
-          </w:p>
-        </w:tc>
-        <w:tc>
-          <w:tcPr>
-            <w:tcW w:type="dxa" w:w="4680"/>
-            <w:vAlign w:val="center"/>
-          </w:tcPr>
-          <w:p>
-            <w:r>
-              <w:t>On</w:t>
-            </w:r>
-          </w:p>
-        </w:tc>
-      </w:tr>
-      <w:tr>
-        <w:tc>
-          <w:tcPr>
-            <w:tcW w:type="dxa" w:w="4680"/>
-            <w:vAlign w:val="center"/>
-          </w:tcPr>
-          <w:p>
-            <w:r>
-              <w:t>Background popups</w:t>
-            </w:r>
-          </w:p>
-        </w:tc>
-        <w:tc>
-          <w:tcPr>
-            <w:tcW w:type="dxa" w:w="4680"/>
-            <w:vAlign w:val="center"/>
-          </w:tcPr>
-          <w:p>
-            <w:r>
-              <w:t>On</w:t>
-            </w:r>
-          </w:p>
-        </w:tc>
-      </w:tr>
-      <w:tr>
-        <w:tc>
-          <w:tcPr>
-            <w:tcW w:type="dxa" w:w="4680"/>
-            <w:vAlign w:val="center"/>
-          </w:tcPr>
-          <w:p>
-            <w:r>
-              <w:t>Negative popup cooldown</w:t>
-            </w:r>
-          </w:p>
-        </w:tc>
-        <w:tc>
-          <w:tcPr>
-            <w:tcW w:type="dxa" w:w="4680"/>
-            <w:vAlign w:val="center"/>
-          </w:tcPr>
-          <w:p>
-            <w:r>
-              <w:t>600 s</w:t>
-            </w:r>
-          </w:p>
-        </w:tc>
-      </w:tr>
-      <w:tr>
-        <w:tc>
-          <w:tcPr>
-            <w:tcW w:type="dxa" w:w="4680"/>
-            <w:vAlign w:val="center"/>
-          </w:tcPr>
-          <w:p>
-            <w:r>
-              <w:t>Positive recovery cooldown</w:t>
-            </w:r>
-          </w:p>
-        </w:tc>
-        <w:tc>
-          <w:tcPr>
-            <w:tcW w:type="dxa" w:w="4680"/>
-            <w:vAlign w:val="center"/>
-          </w:tcPr>
-          <w:p>
-            <w:r>
-              <w:t>300 s</w:t>
-            </w:r>
-          </w:p>
-        </w:tc>
-      </w:tr>
-      <w:tr>
-        <w:tc>
-          <w:tcPr>
-            <w:tcW w:type="dxa" w:w="4680"/>
-            <w:vAlign w:val="center"/>
-          </w:tcPr>
-          <w:p>
-            <w:r>
-              <w:t>Debug panel</w:t>
-            </w:r>
-          </w:p>
-        </w:tc>
-        <w:tc>
-          <w:tcPr>
-            <w:tcW w:type="dxa" w:w="4680"/>
-            <w:vAlign w:val="center"/>
-          </w:tcPr>
-          <w:p>
-            <w:r>
-              <w:t>Off</w:t>
-            </w:r>
-          </w:p>
-        </w:tc>
-      </w:tr>
-      <w:tr>
-        <w:tc>
-          <w:tcPr>
-            <w:tcW w:type="dxa" w:w="4680"/>
-            <w:vAlign w:val="center"/>
-          </w:tcPr>
-          <w:p>
-            <w:r>
-              <w:t>Detection mode</w:t>
-            </w:r>
-          </w:p>
-        </w:tc>
-        <w:tc>
-          <w:tcPr>
-            <w:tcW w:type="dxa" w:w="4680"/>
-            <w:vAlign w:val="center"/>
-          </w:tcPr>
-          <w:p>
-            <w:r>
-              <w:t>heuristic initially; Hybrid after calibration</w:t>
-            </w:r>
-          </w:p>
-        </w:tc>
-      </w:tr>
-      <w:tr>
-        <w:tc>
-          <w:tcPr>
-            <w:tcW w:type="dxa" w:w="4680"/>
-            <w:vAlign w:val="center"/>
-          </w:tcPr>
-          <w:p>
-            <w:r>
-              <w:t>Personalized profile enabled</w:t>
-            </w:r>
-          </w:p>
-        </w:tc>
-        <w:tc>
-          <w:tcPr>
-            <w:tcW w:type="dxa" w:w="4680"/>
-            <w:vAlign w:val="center"/>
-          </w:tcPr>
-          <w:p>
-            <w:r>
-              <w:t>On</w:t>
-            </w:r>
-          </w:p>
-        </w:tc>
-      </w:tr>
-      <w:tr>
-        <w:tc>
-          <w:tcPr>
-            <w:tcW w:type="dxa" w:w="4680"/>
-            <w:vAlign w:val="center"/>
-          </w:tcPr>
-          <w:p>
-            <w:r>
-              <w:t>Calibration target samples</w:t>
-            </w:r>
-          </w:p>
-        </w:tc>
-        <w:tc>
-          <w:tcPr>
-            <w:tcW w:type="dxa" w:w="4680"/>
-            <w:vAlign w:val="center"/>
-          </w:tcPr>
-          <w:p>
-            <w:r>
-              <w:t>45</w:t>
-            </w:r>
-          </w:p>
-        </w:tc>
-      </w:tr>
-      <w:tr>
-        <w:tc>
-          <w:tcPr>
-            <w:tcW w:type="dxa" w:w="4680"/>
-            <w:vAlign w:val="center"/>
-          </w:tcPr>
-          <w:p>
-            <w:r>
-              <w:t>Calibration capture duration</w:t>
-            </w:r>
-          </w:p>
-        </w:tc>
-        <w:tc>
-          <w:tcPr>
-            <w:tcW w:type="dxa" w:w="4680"/>
-            <w:vAlign w:val="center"/>
-          </w:tcPr>
-          <w:p>
-            <w:r>
-              <w:t>4.0 s</w:t>
-            </w:r>
-          </w:p>
-        </w:tc>
-      </w:tr>
-      <w:tr>
-        <w:tc>
-          <w:tcPr>
-            <w:tcW w:type="dxa" w:w="4680"/>
-            <w:vAlign w:val="center"/>
-          </w:tcPr>
-          <w:p>
-            <w:r>
-              <w:t>Calibration preparation countdown</w:t>
-            </w:r>
-          </w:p>
-        </w:tc>
-        <w:tc>
-          <w:tcPr>
-            <w:tcW w:type="dxa" w:w="4680"/>
-            <w:vAlign w:val="center"/>
-          </w:tcPr>
-          <w:p>
-            <w:r>
-              <w:t>2.0 s stored; current capture is manual</w:t>
-            </w:r>
-          </w:p>
-        </w:tc>
-      </w:tr>
-      <w:tr>
-        <w:tc>
-          <w:tcPr>
-            <w:tcW w:type="dxa" w:w="4680"/>
-            <w:vAlign w:val="center"/>
-          </w:tcPr>
-          <w:p>
-            <w:r>
-              <w:t>Minimum good samples</w:t>
-            </w:r>
-          </w:p>
-        </w:tc>
-        <w:tc>
-          <w:tcPr>
-            <w:tcW w:type="dxa" w:w="4680"/>
-            <w:vAlign w:val="center"/>
-          </w:tcPr>
-          <w:p>
-            <w:r>
-              <w:t>15</w:t>
-            </w:r>
-          </w:p>
-        </w:tc>
-      </w:tr>
-      <w:tr>
-        <w:tc>
-          <w:tcPr>
-            <w:tcW w:type="dxa" w:w="4680"/>
-            <w:vAlign w:val="center"/>
-          </w:tcPr>
-          <w:p>
-            <w:r>
-              <w:t>Store raw calibration images</w:t>
-            </w:r>
-          </w:p>
-        </w:tc>
-        <w:tc>
-          <w:tcPr>
-            <w:tcW w:type="dxa" w:w="4680"/>
-            <w:vAlign w:val="center"/>
-          </w:tcPr>
-          <w:p>
-            <w:r>
-              <w:t>Off</w:t>
-            </w:r>
-          </w:p>
-        </w:tc>
-      </w:tr>
-      <w:tr>
-        <w:tc>
-          <w:tcPr>
-            <w:tcW w:type="dxa" w:w="4680"/>
-            <w:vAlign w:val="center"/>
-          </w:tcPr>
-          <w:p>
-            <w:r>
-              <w:t>External AI backend</w:t>
-            </w:r>
-          </w:p>
-        </w:tc>
-        <w:tc>
-          <w:tcPr>
-            <w:tcW w:type="dxa" w:w="4680"/>
-            <w:vAlign w:val="center"/>
-          </w:tcPr>
-          <w:p>
-            <w:r>
-              <w:t>Off and disabled</w:t>
-            </w:r>
-          </w:p>
-        </w:tc>
-      </w:tr>
-    </w:tbl>
-    <w:p>
-      <w:r>
-        <w:t>Settings also provide local profile train/retrain/add/delete/export/import controls, log controls, and reset-to-default.</w:t>
-      </w:r>
-    </w:p>
-    <w:p>
-      <w:pPr>
-        <w:pStyle w:val="Heading1"/>
-      </w:pPr>
-      <w:r>
-        <w:t>11. Background Mode</w:t>
-      </w:r>
-    </w:p>
-    <w:p>
-      <w:r>
-        <w:t>Select Run in background to keep camera analysis and optional metadata logging active locally. EmotionCam hides to the Windows tray when available, or minimizes to the taskbar.</w:t>
-      </w:r>
-    </w:p>
-    <w:p>
-      <w:r>
-        <w:t>The tray menu contains Show EmotionCam, Stop Camera, and Exit. Double-click the tray icon to restore the app.</w:t>
-      </w:r>
-    </w:p>
-    <w:p>
-      <w:r>
-        <w:t>With background popups enabled, a stable negative group can show a cooldown-controlled supportive notification. A later stable positive group can show a positive-recovery notification. These are expression estimates, not diagnoses.</w:t>
-      </w:r>
-    </w:p>
-    <w:p>
-      <w:pPr>
         <w:jc w:val="center"/>
       </w:pPr>
       <w:r>
         <w:drawing>
           <wp:inline xmlns:a="http://schemas.openxmlformats.org/drawingml/2006/main" xmlns:pic="http://schemas.openxmlformats.org/drawingml/2006/picture">
-            <wp:extent cx="5394960" cy="3034665"/>
-            <wp:docPr id="16" name="Picture 16"/>
+            <wp:extent cx="5394960" cy="3371850"/>
+            <wp:docPr id="17" name="Picture 17"/>
             <wp:cNvGraphicFramePr>
               <a:graphicFrameLocks noChangeAspect="1"/>
             </wp:cNvGraphicFramePr>
@@ -2398,11 +1489,11 @@
               <a:graphicData uri="http://schemas.openxmlformats.org/drawingml/2006/picture">
                 <pic:pic>
                   <pic:nvPicPr>
-                    <pic:cNvPr id="0" name="14_background_mode_tray.png"/>
+                    <pic:cNvPr id="0" name="13_statistics_overview.png"/>
                     <pic:cNvPicPr/>
                   </pic:nvPicPr>
                   <pic:blipFill>
-                    <a:blip r:embed="rId23"/>
+                    <a:blip r:embed="rId21"/>
                     <a:stretch>
                       <a:fillRect/>
                     </a:stretch>
@@ -2410,7 +1501,7 @@
                   <pic:spPr>
                     <a:xfrm>
                       <a:off x="0" y="0"/>
-                      <a:ext cx="5394960" cy="3034665"/>
+                      <a:ext cx="5394960" cy="3371850"/>
                     </a:xfrm>
                     <a:prstGeom prst="rect"/>
                   </pic:spPr>
@@ -2423,14 +1514,41 @@
     </w:p>
     <w:p>
       <w:pPr>
-        <w:ind w:left="360"/>
+        <w:jc w:val="center"/>
       </w:pPr>
       <w:r>
-        <w:rPr>
-          <w:b/>
-          <w:color w:val="7A5A00"/>
-        </w:rPr>
-        <w:t>Placeholder: tray icon and menu.</w:t>
+        <w:drawing>
+          <wp:inline xmlns:a="http://schemas.openxmlformats.org/drawingml/2006/main" xmlns:pic="http://schemas.openxmlformats.org/drawingml/2006/picture">
+            <wp:extent cx="5394960" cy="3371850"/>
+            <wp:docPr id="18" name="Picture 18"/>
+            <wp:cNvGraphicFramePr>
+              <a:graphicFrameLocks noChangeAspect="1"/>
+            </wp:cNvGraphicFramePr>
+            <a:graphic>
+              <a:graphicData uri="http://schemas.openxmlformats.org/drawingml/2006/picture">
+                <pic:pic>
+                  <pic:nvPicPr>
+                    <pic:cNvPr id="0" name="13_statistics_overview.png"/>
+                    <pic:cNvPicPr/>
+                  </pic:nvPicPr>
+                  <pic:blipFill>
+                    <a:blip r:embed="rId21"/>
+                    <a:stretch>
+                      <a:fillRect/>
+                    </a:stretch>
+                  </pic:blipFill>
+                  <pic:spPr>
+                    <a:xfrm>
+                      <a:off x="0" y="0"/>
+                      <a:ext cx="5394960" cy="3371850"/>
+                    </a:xfrm>
+                    <a:prstGeom prst="rect"/>
+                  </pic:spPr>
+                </pic:pic>
+              </a:graphicData>
+            </a:graphic>
+          </wp:inline>
+        </w:drawing>
       </w:r>
     </w:p>
     <w:p>
@@ -2438,7 +1556,236 @@
         <w:pStyle w:val="Heading1"/>
       </w:pPr>
       <w:r>
-        <w:t>12. Logs and Local Data</w:t>
+        <w:t>11. User Profile and Optional Daily Email</w:t>
+      </w:r>
+    </w:p>
+    <w:p>
+      <w:r>
+        <w:t>Settings and calibration include optional User name and Email address</w:t>
+      </w:r>
+    </w:p>
+    <w:p>
+      <w:r>
+        <w:t>fields. The name can personalize safe messages. Email is used only for the</w:t>
+      </w:r>
+    </w:p>
+    <w:p>
+      <w:r>
+        <w:t>optional daily summary feature.</w:t>
+      </w:r>
+    </w:p>
+    <w:p>
+      <w:r>
+        <w:t>Daily email summaries are disabled by default. If enabled, they send local</w:t>
+      </w:r>
+    </w:p>
+    <w:p>
+      <w:r>
+        <w:t>statistics text only. No webcam frames, face images, videos, raw calibration</w:t>
+      </w:r>
+    </w:p>
+    <w:p>
+      <w:r>
+        <w:t>images, or identity data are included.</w:t>
+      </w:r>
+    </w:p>
+    <w:p>
+      <w:r>
+        <w:t>Delivery modes:</w:t>
+      </w:r>
+    </w:p>
+    <w:p>
+      <w:pPr>
+        <w:pStyle w:val="ListBullet"/>
+      </w:pPr>
+      <w:r>
+        <w:t>Default mail client draft: opens a draft for manual review/send.</w:t>
+      </w:r>
+    </w:p>
+    <w:p>
+      <w:pPr>
+        <w:pStyle w:val="ListBullet"/>
+      </w:pPr>
+      <w:r>
+        <w:t>SMTP automatic sending: sends at the configured time when the app is running</w:t>
+      </w:r>
+    </w:p>
+    <w:p>
+      <w:r>
+        <w:t>and logs exist.</w:t>
+      </w:r>
+    </w:p>
+    <w:p>
+      <w:r>
+        <w:t>SMTP passwords are not stored in profile JSON. When Windows credential storage</w:t>
+      </w:r>
+    </w:p>
+    <w:p>
+      <w:r>
+        <w:t>through keyring is available, the password can be stored securely.</w:t>
+      </w:r>
+    </w:p>
+    <w:p>
+      <w:pPr>
+        <w:jc w:val="center"/>
+      </w:pPr>
+      <w:r>
+        <w:drawing>
+          <wp:inline xmlns:a="http://schemas.openxmlformats.org/drawingml/2006/main" xmlns:pic="http://schemas.openxmlformats.org/drawingml/2006/picture">
+            <wp:extent cx="5394960" cy="3371850"/>
+            <wp:docPr id="19" name="Picture 19"/>
+            <wp:cNvGraphicFramePr>
+              <a:graphicFrameLocks noChangeAspect="1"/>
+            </wp:cNvGraphicFramePr>
+            <a:graphic>
+              <a:graphicData uri="http://schemas.openxmlformats.org/drawingml/2006/picture">
+                <pic:pic>
+                  <pic:nvPicPr>
+                    <pic:cNvPr id="0" name="05_settings_general_dark.png"/>
+                    <pic:cNvPicPr/>
+                  </pic:nvPicPr>
+                  <pic:blipFill>
+                    <a:blip r:embed="rId18"/>
+                    <a:stretch>
+                      <a:fillRect/>
+                    </a:stretch>
+                  </pic:blipFill>
+                  <pic:spPr>
+                    <a:xfrm>
+                      <a:off x="0" y="0"/>
+                      <a:ext cx="5394960" cy="3371850"/>
+                    </a:xfrm>
+                    <a:prstGeom prst="rect"/>
+                  </pic:spPr>
+                </pic:pic>
+              </a:graphicData>
+            </a:graphic>
+          </wp:inline>
+        </w:drawing>
+      </w:r>
+    </w:p>
+    <w:p>
+      <w:pPr>
+        <w:jc w:val="center"/>
+      </w:pPr>
+      <w:r>
+        <w:drawing>
+          <wp:inline xmlns:a="http://schemas.openxmlformats.org/drawingml/2006/main" xmlns:pic="http://schemas.openxmlformats.org/drawingml/2006/picture">
+            <wp:extent cx="5394960" cy="3371850"/>
+            <wp:docPr id="20" name="Picture 20"/>
+            <wp:cNvGraphicFramePr>
+              <a:graphicFrameLocks noChangeAspect="1"/>
+            </wp:cNvGraphicFramePr>
+            <a:graphic>
+              <a:graphicData uri="http://schemas.openxmlformats.org/drawingml/2006/picture">
+                <pic:pic>
+                  <pic:nvPicPr>
+                    <pic:cNvPr id="0" name="05_settings_general_dark.png"/>
+                    <pic:cNvPicPr/>
+                  </pic:nvPicPr>
+                  <pic:blipFill>
+                    <a:blip r:embed="rId18"/>
+                    <a:stretch>
+                      <a:fillRect/>
+                    </a:stretch>
+                  </pic:blipFill>
+                  <pic:spPr>
+                    <a:xfrm>
+                      <a:off x="0" y="0"/>
+                      <a:ext cx="5394960" cy="3371850"/>
+                    </a:xfrm>
+                    <a:prstGeom prst="rect"/>
+                  </pic:spPr>
+                </pic:pic>
+              </a:graphicData>
+            </a:graphic>
+          </wp:inline>
+        </w:drawing>
+      </w:r>
+    </w:p>
+    <w:p>
+      <w:pPr>
+        <w:pStyle w:val="Heading1"/>
+      </w:pPr>
+      <w:r>
+        <w:t>12. Background Mode</w:t>
+      </w:r>
+    </w:p>
+    <w:p>
+      <w:r>
+        <w:t>Click Run in background to keep camera analysis and optional metadata logging</w:t>
+      </w:r>
+    </w:p>
+    <w:p>
+      <w:r>
+        <w:t>active locally while the app hides to the tray when available. The tray menu can</w:t>
+      </w:r>
+    </w:p>
+    <w:p>
+      <w:r>
+        <w:t>show EmotionCam, stop the camera, or exit.</w:t>
+      </w:r>
+    </w:p>
+    <w:p>
+      <w:r>
+        <w:t>Stable serious-expression estimates can show cooldown-controlled supportive</w:t>
+      </w:r>
+    </w:p>
+    <w:p>
+      <w:r>
+        <w:t>notifications. A later positive shift can show a recovery notification. These</w:t>
+      </w:r>
+    </w:p>
+    <w:p>
+      <w:r>
+        <w:t>are visible-expression estimates, not diagnoses.</w:t>
+      </w:r>
+    </w:p>
+    <w:p>
+      <w:pPr>
+        <w:jc w:val="center"/>
+      </w:pPr>
+      <w:r>
+        <w:drawing>
+          <wp:inline xmlns:a="http://schemas.openxmlformats.org/drawingml/2006/main" xmlns:pic="http://schemas.openxmlformats.org/drawingml/2006/picture">
+            <wp:extent cx="5394960" cy="3371850"/>
+            <wp:docPr id="21" name="Picture 21"/>
+            <wp:cNvGraphicFramePr>
+              <a:graphicFrameLocks noChangeAspect="1"/>
+            </wp:cNvGraphicFramePr>
+            <a:graphic>
+              <a:graphicData uri="http://schemas.openxmlformats.org/drawingml/2006/picture">
+                <pic:pic>
+                  <pic:nvPicPr>
+                    <pic:cNvPr id="0" name="19_background_mode_tray.png"/>
+                    <pic:cNvPicPr/>
+                  </pic:nvPicPr>
+                  <pic:blipFill>
+                    <a:blip r:embed="rId22"/>
+                    <a:stretch>
+                      <a:fillRect/>
+                    </a:stretch>
+                  </pic:blipFill>
+                  <pic:spPr>
+                    <a:xfrm>
+                      <a:off x="0" y="0"/>
+                      <a:ext cx="5394960" cy="3371850"/>
+                    </a:xfrm>
+                    <a:prstGeom prst="rect"/>
+                  </pic:spPr>
+                </pic:pic>
+              </a:graphicData>
+            </a:graphic>
+          </wp:inline>
+        </w:drawing>
+      </w:r>
+    </w:p>
+    <w:p>
+      <w:pPr>
+        <w:pStyle w:val="Heading1"/>
+      </w:pPr>
+      <w:r>
+        <w:t>13. Logs and Local Data</w:t>
       </w:r>
     </w:p>
     <w:tbl>
@@ -2479,7 +1826,7 @@
               <w:rPr>
                 <w:b/>
               </w:rPr>
-              <w:t>Actual path</w:t>
+              <w:t>Path</w:t>
             </w:r>
           </w:p>
         </w:tc>
@@ -2492,7 +1839,7 @@
           </w:tcPr>
           <w:p>
             <w:r>
-              <w:t>Configuration</w:t>
+              <w:t>Settings</w:t>
             </w:r>
           </w:p>
         </w:tc>
@@ -2516,7 +1863,7 @@
           </w:tcPr>
           <w:p>
             <w:r>
-              <w:t>Metadata history</w:t>
+              <w:t>Metadata logs</w:t>
             </w:r>
           </w:p>
         </w:tc>
@@ -2564,7 +1911,7 @@
           </w:tcPr>
           <w:p>
             <w:r>
-              <w:t>User profile and email-summary preferences</w:t>
+              <w:t>User profile and email preferences</w:t>
             </w:r>
           </w:p>
         </w:tc>
@@ -2588,7 +1935,7 @@
           </w:tcPr>
           <w:p>
             <w:r>
-              <w:t>Optional debug calibration frames</w:t>
+              <w:t>Optional debug calibration images</w:t>
             </w:r>
           </w:p>
         </w:tc>
@@ -2607,12 +1954,7 @@
     </w:tbl>
     <w:p>
       <w:r>
-        <w:t>The JSONL log stores timestamp, expression label/group, confidence, detection mode, classifier source, profile-active status, face-detected status, displayed message, popup status, and FPS. It does not save frame/image fields or identity data.</w:t>
-      </w:r>
-    </w:p>
-    <w:p>
-      <w:r>
-        <w:t>Use Open Logs, Clear Logs, or disable local logging in Settings. Use Settings to retrain, export, import, or delete the personalized profile.</w:t>
+        <w:t>Logs are metadata-only and never include webcam frame data.</w:t>
       </w:r>
     </w:p>
     <w:p>
@@ -2622,8 +1964,8 @@
       <w:r>
         <w:drawing>
           <wp:inline xmlns:a="http://schemas.openxmlformats.org/drawingml/2006/main" xmlns:pic="http://schemas.openxmlformats.org/drawingml/2006/picture">
-            <wp:extent cx="5394960" cy="3034665"/>
-            <wp:docPr id="17" name="Picture 17"/>
+            <wp:extent cx="5394960" cy="3371850"/>
+            <wp:docPr id="22" name="Picture 22"/>
             <wp:cNvGraphicFramePr>
               <a:graphicFrameLocks noChangeAspect="1"/>
             </wp:cNvGraphicFramePr>
@@ -2631,11 +1973,11 @@
               <a:graphicData uri="http://schemas.openxmlformats.org/drawingml/2006/picture">
                 <pic:pic>
                   <pic:nvPicPr>
-                    <pic:cNvPr id="0" name="15_logs_folder.png"/>
+                    <pic:cNvPr id="0" name="20_logs_folder.png"/>
                     <pic:cNvPicPr/>
                   </pic:nvPicPr>
                   <pic:blipFill>
-                    <a:blip r:embed="rId24"/>
+                    <a:blip r:embed="rId23"/>
                     <a:stretch>
                       <a:fillRect/>
                     </a:stretch>
@@ -2643,7 +1985,7 @@
                   <pic:spPr>
                     <a:xfrm>
                       <a:off x="0" y="0"/>
-                      <a:ext cx="5394960" cy="3034665"/>
+                      <a:ext cx="5394960" cy="3371850"/>
                     </a:xfrm>
                     <a:prstGeom prst="rect"/>
                   </pic:spPr>
@@ -2656,14 +1998,127 @@
     </w:p>
     <w:p>
       <w:pPr>
-        <w:ind w:left="360"/>
+        <w:pStyle w:val="Heading1"/>
       </w:pPr>
       <w:r>
-        <w:rPr>
-          <w:b/>
-          <w:color w:val="7A5A00"/>
-        </w:rPr>
-        <w:t>Placeholder: local logs folder.</w:t>
+        <w:t>14. Demo Walkthrough</w:t>
+      </w:r>
+    </w:p>
+    <w:p>
+      <w:pPr>
+        <w:pStyle w:val="ListNumber"/>
+      </w:pPr>
+      <w:r>
+        <w:t>Launch EmotionCam and show the icon/startup privacy screen.</w:t>
+      </w:r>
+    </w:p>
+    <w:p>
+      <w:pPr>
+        <w:pStyle w:val="ListNumber"/>
+      </w:pPr>
+      <w:r>
+        <w:t>Start the camera and explain visible-expression estimates.</w:t>
+      </w:r>
+    </w:p>
+    <w:p>
+      <w:pPr>
+        <w:pStyle w:val="ListNumber"/>
+      </w:pPr>
+      <w:r>
+        <w:t>Show neutral and positive states; point out the blue positive rectangle.</w:t>
+      </w:r>
+    </w:p>
+    <w:p>
+      <w:pPr>
+        <w:pStyle w:val="ListNumber"/>
+      </w:pPr>
+      <w:r>
+        <w:t>Stop the camera and show Camera stopped.</w:t>
+      </w:r>
+    </w:p>
+    <w:p>
+      <w:pPr>
+        <w:pStyle w:val="ListNumber"/>
+      </w:pPr>
+      <w:r>
+        <w:t>Open Settings and demonstrate spinner arrows.</w:t>
+      </w:r>
+    </w:p>
+    <w:p>
+      <w:pPr>
+        <w:pStyle w:val="ListNumber"/>
+      </w:pPr>
+      <w:r>
+        <w:t>Switch Dark to Light and optionally back to Dark.</w:t>
+      </w:r>
+    </w:p>
+    <w:p>
+      <w:pPr>
+        <w:pStyle w:val="ListNumber"/>
+      </w:pPr>
+      <w:r>
+        <w:t>Open calibration and choose an expression from the dropdown.</w:t>
+      </w:r>
+    </w:p>
+    <w:p>
+      <w:pPr>
+        <w:pStyle w:val="ListNumber"/>
+      </w:pPr>
+      <w:r>
+        <w:t>Show the local example graphic and match helper.</w:t>
+      </w:r>
+    </w:p>
+    <w:p>
+      <w:pPr>
+        <w:pStyle w:val="ListNumber"/>
+      </w:pPr>
+      <w:r>
+        <w:t>Use Start Capture, Re-capture, Previous, Next, and Finish.</w:t>
+      </w:r>
+    </w:p>
+    <w:p>
+      <w:pPr>
+        <w:pStyle w:val="ListNumber"/>
+      </w:pPr>
+      <w:r>
+        <w:t>Return to the dashboard and show personalized/hybrid status.</w:t>
+      </w:r>
+    </w:p>
+    <w:p>
+      <w:pPr>
+        <w:pStyle w:val="ListNumber"/>
+      </w:pPr>
+      <w:r>
+        <w:t>Run in background and explain tray behavior.</w:t>
+      </w:r>
+    </w:p>
+    <w:p>
+      <w:pPr>
+        <w:pStyle w:val="ListNumber"/>
+      </w:pPr>
+      <w:r>
+        <w:t>Open Statistics and show local charts.</w:t>
+      </w:r>
+    </w:p>
+    <w:p>
+      <w:pPr>
+        <w:pStyle w:val="ListNumber"/>
+      </w:pPr>
+      <w:r>
+        <w:t>Show User Profile and disabled-by-default email summary settings.</w:t>
+      </w:r>
+    </w:p>
+    <w:p>
+      <w:pPr>
+        <w:pStyle w:val="ListNumber"/>
+      </w:pPr>
+      <w:r>
+        <w:t>Open Logs and close the app.</w:t>
+      </w:r>
+    </w:p>
+    <w:p>
+      <w:r>
+        <w:t>For a presenter-ready version, open [START_DEMO_HERE.html](START_DEMO_HERE.html).</w:t>
       </w:r>
     </w:p>
     <w:p>
@@ -2671,1792 +2126,7 @@
         <w:pStyle w:val="Heading1"/>
       </w:pPr>
       <w:r>
-        <w:t>13. Statistics</w:t>
-      </w:r>
-    </w:p>
-    <w:p>
-      <w:r>
-        <w:t>Select Statistics on the dashboard to open local visual summaries generated</w:t>
-      </w:r>
-    </w:p>
-    <w:p>
-      <w:r>
-        <w:t>only from expression metadata logs. Bad JSONL lines, old fields, missing values,</w:t>
-      </w:r>
-    </w:p>
-    <w:p>
-      <w:r>
-        <w:t>unknown expressions, and empty histories are handled without crashing.</w:t>
-      </w:r>
-    </w:p>
-    <w:p>
-      <w:r>
-        <w:t>The Statistics window includes:</w:t>
-      </w:r>
-    </w:p>
-    <w:p>
-      <w:pPr>
-        <w:pStyle w:val="ListBullet"/>
-      </w:pPr>
-      <w:r>
-        <w:t>Date selector, Today, Last 7 days, Refresh, and Export Summary controls</w:t>
-      </w:r>
-    </w:p>
-    <w:p>
-      <w:pPr>
-        <w:pStyle w:val="ListBullet"/>
-      </w:pPr>
-      <w:r>
-        <w:t>Positive / neutral / serious-expression balance for the selected day</w:t>
-      </w:r>
-    </w:p>
-    <w:p>
-      <w:pPr>
-        <w:pStyle w:val="ListBullet"/>
-      </w:pPr>
-      <w:r>
-        <w:t>Daily expression-group timeline</w:t>
-      </w:r>
-    </w:p>
-    <w:p>
-      <w:pPr>
-        <w:pStyle w:val="ListBullet"/>
-      </w:pPr>
-      <w:r>
-        <w:t>Expression counts by label</w:t>
-      </w:r>
-    </w:p>
-    <w:p>
-      <w:pPr>
-        <w:pStyle w:val="ListBullet"/>
-      </w:pPr>
-      <w:r>
-        <w:t>Last-7-days balance chart</w:t>
-      </w:r>
-    </w:p>
-    <w:p>
-      <w:pPr>
-        <w:pStyle w:val="ListBullet"/>
-      </w:pPr>
-      <w:r>
-        <w:t>Most frequent expression, valid entry count, estimated analyzed minutes</w:t>
-      </w:r>
-    </w:p>
-    <w:p>
-      <w:pPr>
-        <w:pStyle w:val="ListBullet"/>
-      </w:pPr>
-      <w:r>
-        <w:t>Most positive and most serious-expression periods when available</w:t>
-      </w:r>
-    </w:p>
-    <w:p>
-      <w:r>
-        <w:t>Charts follow the selected dark or light theme. Export Summary writes a local</w:t>
-      </w:r>
-    </w:p>
-    <w:p>
-      <w:r>
-        <w:t>text summary. Statistics are approximate visible-expression estimates, not</w:t>
-      </w:r>
-    </w:p>
-    <w:p>
-      <w:r>
-        <w:t>diagnoses.</w:t>
-      </w:r>
-    </w:p>
-    <w:p>
-      <w:pPr>
-        <w:jc w:val="center"/>
-      </w:pPr>
-      <w:r>
-        <w:drawing>
-          <wp:inline xmlns:a="http://schemas.openxmlformats.org/drawingml/2006/main" xmlns:pic="http://schemas.openxmlformats.org/drawingml/2006/picture">
-            <wp:extent cx="5394960" cy="3034665"/>
-            <wp:docPr id="18" name="Picture 18"/>
-            <wp:cNvGraphicFramePr>
-              <a:graphicFrameLocks noChangeAspect="1"/>
-            </wp:cNvGraphicFramePr>
-            <a:graphic>
-              <a:graphicData uri="http://schemas.openxmlformats.org/drawingml/2006/picture">
-                <pic:pic>
-                  <pic:nvPicPr>
-                    <pic:cNvPr id="0" name="16_statistics_overview.png"/>
-                    <pic:cNvPicPr/>
-                  </pic:nvPicPr>
-                  <pic:blipFill>
-                    <a:blip r:embed="rId25"/>
-                    <a:stretch>
-                      <a:fillRect/>
-                    </a:stretch>
-                  </pic:blipFill>
-                  <pic:spPr>
-                    <a:xfrm>
-                      <a:off x="0" y="0"/>
-                      <a:ext cx="5394960" cy="3034665"/>
-                    </a:xfrm>
-                    <a:prstGeom prst="rect"/>
-                  </pic:spPr>
-                </pic:pic>
-              </a:graphicData>
-            </a:graphic>
-          </wp:inline>
-        </w:drawing>
-      </w:r>
-    </w:p>
-    <w:p>
-      <w:pPr>
-        <w:jc w:val="center"/>
-      </w:pPr>
-      <w:r>
-        <w:drawing>
-          <wp:inline xmlns:a="http://schemas.openxmlformats.org/drawingml/2006/main" xmlns:pic="http://schemas.openxmlformats.org/drawingml/2006/picture">
-            <wp:extent cx="5394960" cy="3034665"/>
-            <wp:docPr id="19" name="Picture 19"/>
-            <wp:cNvGraphicFramePr>
-              <a:graphicFrameLocks noChangeAspect="1"/>
-            </wp:cNvGraphicFramePr>
-            <a:graphic>
-              <a:graphicData uri="http://schemas.openxmlformats.org/drawingml/2006/picture">
-                <pic:pic>
-                  <pic:nvPicPr>
-                    <pic:cNvPr id="0" name="17_statistics_today_balance.png"/>
-                    <pic:cNvPicPr/>
-                  </pic:nvPicPr>
-                  <pic:blipFill>
-                    <a:blip r:embed="rId26"/>
-                    <a:stretch>
-                      <a:fillRect/>
-                    </a:stretch>
-                  </pic:blipFill>
-                  <pic:spPr>
-                    <a:xfrm>
-                      <a:off x="0" y="0"/>
-                      <a:ext cx="5394960" cy="3034665"/>
-                    </a:xfrm>
-                    <a:prstGeom prst="rect"/>
-                  </pic:spPr>
-                </pic:pic>
-              </a:graphicData>
-            </a:graphic>
-          </wp:inline>
-        </w:drawing>
-      </w:r>
-    </w:p>
-    <w:p>
-      <w:pPr>
-        <w:jc w:val="center"/>
-      </w:pPr>
-      <w:r>
-        <w:drawing>
-          <wp:inline xmlns:a="http://schemas.openxmlformats.org/drawingml/2006/main" xmlns:pic="http://schemas.openxmlformats.org/drawingml/2006/picture">
-            <wp:extent cx="5394960" cy="3034665"/>
-            <wp:docPr id="20" name="Picture 20"/>
-            <wp:cNvGraphicFramePr>
-              <a:graphicFrameLocks noChangeAspect="1"/>
-            </wp:cNvGraphicFramePr>
-            <a:graphic>
-              <a:graphicData uri="http://schemas.openxmlformats.org/drawingml/2006/picture">
-                <pic:pic>
-                  <pic:nvPicPr>
-                    <pic:cNvPr id="0" name="18_statistics_weekly_balance.png"/>
-                    <pic:cNvPicPr/>
-                  </pic:nvPicPr>
-                  <pic:blipFill>
-                    <a:blip r:embed="rId27"/>
-                    <a:stretch>
-                      <a:fillRect/>
-                    </a:stretch>
-                  </pic:blipFill>
-                  <pic:spPr>
-                    <a:xfrm>
-                      <a:off x="0" y="0"/>
-                      <a:ext cx="5394960" cy="3034665"/>
-                    </a:xfrm>
-                    <a:prstGeom prst="rect"/>
-                  </pic:spPr>
-                </pic:pic>
-              </a:graphicData>
-            </a:graphic>
-          </wp:inline>
-        </w:drawing>
-      </w:r>
-    </w:p>
-    <w:p>
-      <w:pPr>
-        <w:jc w:val="center"/>
-      </w:pPr>
-      <w:r>
-        <w:drawing>
-          <wp:inline xmlns:a="http://schemas.openxmlformats.org/drawingml/2006/main" xmlns:pic="http://schemas.openxmlformats.org/drawingml/2006/picture">
-            <wp:extent cx="5394960" cy="3034665"/>
-            <wp:docPr id="21" name="Picture 21"/>
-            <wp:cNvGraphicFramePr>
-              <a:graphicFrameLocks noChangeAspect="1"/>
-            </wp:cNvGraphicFramePr>
-            <a:graphic>
-              <a:graphicData uri="http://schemas.openxmlformats.org/drawingml/2006/picture">
-                <pic:pic>
-                  <pic:nvPicPr>
-                    <pic:cNvPr id="0" name="19_statistics_expression_counts.png"/>
-                    <pic:cNvPicPr/>
-                  </pic:nvPicPr>
-                  <pic:blipFill>
-                    <a:blip r:embed="rId28"/>
-                    <a:stretch>
-                      <a:fillRect/>
-                    </a:stretch>
-                  </pic:blipFill>
-                  <pic:spPr>
-                    <a:xfrm>
-                      <a:off x="0" y="0"/>
-                      <a:ext cx="5394960" cy="3034665"/>
-                    </a:xfrm>
-                    <a:prstGeom prst="rect"/>
-                  </pic:spPr>
-                </pic:pic>
-              </a:graphicData>
-            </a:graphic>
-          </wp:inline>
-        </w:drawing>
-      </w:r>
-    </w:p>
-    <w:p>
-      <w:pPr>
-        <w:ind w:left="360"/>
-      </w:pPr>
-      <w:r>
-        <w:rPr>
-          <w:b/>
-          <w:color w:val="7A5A00"/>
-        </w:rPr>
-        <w:t>Placeholder: Statistics window with summary cards and charts.</w:t>
-      </w:r>
-    </w:p>
-    <w:p>
-      <w:pPr>
-        <w:pStyle w:val="Heading1"/>
-      </w:pPr>
-      <w:r>
-        <w:t>14. User Profile and Optional Daily Email</w:t>
-      </w:r>
-    </w:p>
-    <w:p>
-      <w:r>
-        <w:t>Settings and the calibration header include optional User name and Email</w:t>
-      </w:r>
-    </w:p>
-    <w:p>
-      <w:r>
-        <w:t>address fields. The name can personalize safe app messages; leaving it blank</w:t>
-      </w:r>
-    </w:p>
-    <w:p>
-      <w:r>
-        <w:t>keeps generic wording. Only the minimal profile fields are stored locally.</w:t>
-      </w:r>
-    </w:p>
-    <w:p>
-      <w:r>
-        <w:t>Daily email summaries are off by default and require explicit opt-in. They</w:t>
-      </w:r>
-    </w:p>
-    <w:p>
-      <w:r>
-        <w:t>send only local statistics text. No images or webcam frames are sent.</w:t>
-      </w:r>
-    </w:p>
-    <w:p>
-      <w:r>
-        <w:t>Delivery choices:</w:t>
-      </w:r>
-    </w:p>
-    <w:p>
-      <w:pPr>
-        <w:pStyle w:val="ListBullet"/>
-      </w:pPr>
-      <w:r>
-        <w:t>Default mail client draft: opens a pre-filled draft for manual review/send.</w:t>
-      </w:r>
-    </w:p>
-    <w:p>
-      <w:r>
-        <w:t>It never sends automatically.</w:t>
-      </w:r>
-    </w:p>
-    <w:p>
-      <w:pPr>
-        <w:pStyle w:val="ListBullet"/>
-      </w:pPr>
-      <w:r>
-        <w:t>SMTP automatic sending: can send while the app is running at/after the</w:t>
-      </w:r>
-    </w:p>
-    <w:p>
-      <w:r>
-        <w:t>configured time, including background mode. It requires an email, SMTP server,</w:t>
-      </w:r>
-    </w:p>
-    <w:p>
-      <w:r>
-        <w:t>port, username, password, and optional TLS.</w:t>
-      </w:r>
-    </w:p>
-    <w:p>
-      <w:r>
-        <w:t>SMTP passwords are never written to user_profile.json. When Windows credential</w:t>
-      </w:r>
-    </w:p>
-    <w:p>
-      <w:r>
-        <w:t>storage through keyring is available, the password can be stored securely;</w:t>
-      </w:r>
-    </w:p>
-    <w:p>
-      <w:r>
-        <w:t>otherwise it remains session-only and must be entered again.</w:t>
-      </w:r>
-    </w:p>
-    <w:p>
-      <w:r>
-        <w:t>The app sends at most one SMTP summary per date, only when logs exist. A missed</w:t>
-      </w:r>
-    </w:p>
-    <w:p>
-      <w:r>
-        <w:t>summary can be sent when the app next starts. Use Send Test Email / Open Test</w:t>
-      </w:r>
-    </w:p>
-    <w:p>
-      <w:r>
-        <w:t>Draft before enabling automatic delivery.</w:t>
-      </w:r>
-    </w:p>
-    <w:p>
-      <w:pPr>
-        <w:jc w:val="center"/>
-      </w:pPr>
-      <w:r>
-        <w:drawing>
-          <wp:inline xmlns:a="http://schemas.openxmlformats.org/drawingml/2006/main" xmlns:pic="http://schemas.openxmlformats.org/drawingml/2006/picture">
-            <wp:extent cx="5394960" cy="3034665"/>
-            <wp:docPr id="22" name="Picture 22"/>
-            <wp:cNvGraphicFramePr>
-              <a:graphicFrameLocks noChangeAspect="1"/>
-            </wp:cNvGraphicFramePr>
-            <a:graphic>
-              <a:graphicData uri="http://schemas.openxmlformats.org/drawingml/2006/picture">
-                <pic:pic>
-                  <pic:nvPicPr>
-                    <pic:cNvPr id="0" name="20_user_profile_settings.png"/>
-                    <pic:cNvPicPr/>
-                  </pic:nvPicPr>
-                  <pic:blipFill>
-                    <a:blip r:embed="rId29"/>
-                    <a:stretch>
-                      <a:fillRect/>
-                    </a:stretch>
-                  </pic:blipFill>
-                  <pic:spPr>
-                    <a:xfrm>
-                      <a:off x="0" y="0"/>
-                      <a:ext cx="5394960" cy="3034665"/>
-                    </a:xfrm>
-                    <a:prstGeom prst="rect"/>
-                  </pic:spPr>
-                </pic:pic>
-              </a:graphicData>
-            </a:graphic>
-          </wp:inline>
-        </w:drawing>
-      </w:r>
-    </w:p>
-    <w:p>
-      <w:pPr>
-        <w:jc w:val="center"/>
-      </w:pPr>
-      <w:r>
-        <w:drawing>
-          <wp:inline xmlns:a="http://schemas.openxmlformats.org/drawingml/2006/main" xmlns:pic="http://schemas.openxmlformats.org/drawingml/2006/picture">
-            <wp:extent cx="5394960" cy="3034665"/>
-            <wp:docPr id="23" name="Picture 23"/>
-            <wp:cNvGraphicFramePr>
-              <a:graphicFrameLocks noChangeAspect="1"/>
-            </wp:cNvGraphicFramePr>
-            <a:graphic>
-              <a:graphicData uri="http://schemas.openxmlformats.org/drawingml/2006/picture">
-                <pic:pic>
-                  <pic:nvPicPr>
-                    <pic:cNvPr id="0" name="21_daily_email_summary_settings.png"/>
-                    <pic:cNvPicPr/>
-                  </pic:nvPicPr>
-                  <pic:blipFill>
-                    <a:blip r:embed="rId30"/>
-                    <a:stretch>
-                      <a:fillRect/>
-                    </a:stretch>
-                  </pic:blipFill>
-                  <pic:spPr>
-                    <a:xfrm>
-                      <a:off x="0" y="0"/>
-                      <a:ext cx="5394960" cy="3034665"/>
-                    </a:xfrm>
-                    <a:prstGeom prst="rect"/>
-                  </pic:spPr>
-                </pic:pic>
-              </a:graphicData>
-            </a:graphic>
-          </wp:inline>
-        </w:drawing>
-      </w:r>
-    </w:p>
-    <w:p>
-      <w:pPr>
-        <w:jc w:val="center"/>
-      </w:pPr>
-      <w:r>
-        <w:drawing>
-          <wp:inline xmlns:a="http://schemas.openxmlformats.org/drawingml/2006/main" xmlns:pic="http://schemas.openxmlformats.org/drawingml/2006/picture">
-            <wp:extent cx="5394960" cy="3034665"/>
-            <wp:docPr id="24" name="Picture 24"/>
-            <wp:cNvGraphicFramePr>
-              <a:graphicFrameLocks noChangeAspect="1"/>
-            </wp:cNvGraphicFramePr>
-            <a:graphic>
-              <a:graphicData uri="http://schemas.openxmlformats.org/drawingml/2006/picture">
-                <pic:pic>
-                  <pic:nvPicPr>
-                    <pic:cNvPr id="0" name="22_test_email_button.png"/>
-                    <pic:cNvPicPr/>
-                  </pic:nvPicPr>
-                  <pic:blipFill>
-                    <a:blip r:embed="rId31"/>
-                    <a:stretch>
-                      <a:fillRect/>
-                    </a:stretch>
-                  </pic:blipFill>
-                  <pic:spPr>
-                    <a:xfrm>
-                      <a:off x="0" y="0"/>
-                      <a:ext cx="5394960" cy="3034665"/>
-                    </a:xfrm>
-                    <a:prstGeom prst="rect"/>
-                  </pic:spPr>
-                </pic:pic>
-              </a:graphicData>
-            </a:graphic>
-          </wp:inline>
-        </w:drawing>
-      </w:r>
-    </w:p>
-    <w:p>
-      <w:pPr>
-        <w:ind w:left="360"/>
-      </w:pPr>
-      <w:r>
-        <w:rPr>
-          <w:b/>
-          <w:color w:val="7A5A00"/>
-        </w:rPr>
-        <w:t>Placeholder: User Profile and Daily Email Summary settings.</w:t>
-      </w:r>
-    </w:p>
-    <w:p>
-      <w:pPr>
-        <w:pStyle w:val="Heading1"/>
-      </w:pPr>
-      <w:r>
-        <w:t>15. Complete Demo Walkthrough</w:t>
-      </w:r>
-    </w:p>
-    <w:p>
-      <w:r>
-        <w:t>Start from Help &gt; Start Demo Guide, or open docs\START_DEMO_HERE.html.</w:t>
-      </w:r>
-    </w:p>
-    <w:tbl>
-      <w:tblPr>
-        <w:tblStyle w:val="TableGrid"/>
-        <w:tblW w:type="auto" w:w="0"/>
-        <w:tblLayout w:type="fixed"/>
-        <w:tblLook w:firstColumn="1" w:firstRow="1" w:lastColumn="0" w:lastRow="0" w:noHBand="0" w:noVBand="1" w:val="04A0"/>
-      </w:tblPr>
-      <w:tblGrid>
-        <w:gridCol w:w="2340"/>
-        <w:gridCol w:w="2340"/>
-        <w:gridCol w:w="2340"/>
-        <w:gridCol w:w="2340"/>
-      </w:tblGrid>
-      <w:tr>
-        <w:tc>
-          <w:tcPr>
-            <w:tcW w:type="dxa" w:w="2340"/>
-            <w:vAlign w:val="center"/>
-            <w:shd w:fill="E8EEF5"/>
-          </w:tcPr>
-          <w:p>
-            <w:r>
-              <w:rPr>
-                <w:b/>
-              </w:rPr>
-              <w:t>#</w:t>
-            </w:r>
-          </w:p>
-        </w:tc>
-        <w:tc>
-          <w:tcPr>
-            <w:tcW w:type="dxa" w:w="2340"/>
-            <w:vAlign w:val="center"/>
-            <w:shd w:fill="E8EEF5"/>
-          </w:tcPr>
-          <w:p>
-            <w:r>
-              <w:rPr>
-                <w:b/>
-              </w:rPr>
-              <w:t>What to click/do</w:t>
-            </w:r>
-          </w:p>
-        </w:tc>
-        <w:tc>
-          <w:tcPr>
-            <w:tcW w:type="dxa" w:w="2340"/>
-            <w:vAlign w:val="center"/>
-            <w:shd w:fill="E8EEF5"/>
-          </w:tcPr>
-          <w:p>
-            <w:r>
-              <w:rPr>
-                <w:b/>
-              </w:rPr>
-              <w:t>What should appear</w:t>
-            </w:r>
-          </w:p>
-        </w:tc>
-        <w:tc>
-          <w:tcPr>
-            <w:tcW w:type="dxa" w:w="2340"/>
-            <w:vAlign w:val="center"/>
-            <w:shd w:fill="E8EEF5"/>
-          </w:tcPr>
-          <w:p>
-            <w:r>
-              <w:rPr>
-                <w:b/>
-              </w:rPr>
-              <w:t>Expected result / screenshot</w:t>
-            </w:r>
-          </w:p>
-        </w:tc>
-      </w:tr>
-      <w:tr>
-        <w:tc>
-          <w:tcPr>
-            <w:tcW w:type="dxa" w:w="2340"/>
-            <w:vAlign w:val="center"/>
-          </w:tcPr>
-          <w:p>
-            <w:r>
-              <w:t>1</w:t>
-            </w:r>
-          </w:p>
-        </w:tc>
-        <w:tc>
-          <w:tcPr>
-            <w:tcW w:type="dxa" w:w="2340"/>
-            <w:vAlign w:val="center"/>
-          </w:tcPr>
-          <w:p>
-            <w:r>
-              <w:t>Launch EmotionCam</w:t>
-            </w:r>
-          </w:p>
-        </w:tc>
-        <w:tc>
-          <w:tcPr>
-            <w:tcW w:type="dxa" w:w="2340"/>
-            <w:vAlign w:val="center"/>
-          </w:tcPr>
-          <w:p>
-            <w:r>
-              <w:t>Simplified lens icon and startup screen</w:t>
-            </w:r>
-          </w:p>
-        </w:tc>
-        <w:tc>
-          <w:tcPr>
-            <w:tcW w:type="dxa" w:w="2340"/>
-            <w:vAlign w:val="center"/>
-          </w:tcPr>
-          <w:p>
-            <w:r>
-              <w:t>01_startup_screen.png</w:t>
-            </w:r>
-          </w:p>
-        </w:tc>
-      </w:tr>
-      <w:tr>
-        <w:tc>
-          <w:tcPr>
-            <w:tcW w:type="dxa" w:w="2340"/>
-            <w:vAlign w:val="center"/>
-          </w:tcPr>
-          <w:p>
-            <w:r>
-              <w:t>2</w:t>
-            </w:r>
-          </w:p>
-        </w:tc>
-        <w:tc>
-          <w:tcPr>
-            <w:tcW w:type="dxa" w:w="2340"/>
-            <w:vAlign w:val="center"/>
-          </w:tcPr>
-          <w:p>
-            <w:r>
-              <w:t>Point out the icon</w:t>
-            </w:r>
-          </w:p>
-        </w:tc>
-        <w:tc>
-          <w:tcPr>
-            <w:tcW w:type="dxa" w:w="2340"/>
-            <w:vAlign w:val="center"/>
-          </w:tcPr>
-          <w:p>
-            <w:r>
-              <w:t>Same icon in app/taskbar</w:t>
-            </w:r>
-          </w:p>
-        </w:tc>
-        <w:tc>
-          <w:tcPr>
-            <w:tcW w:type="dxa" w:w="2340"/>
-            <w:vAlign w:val="center"/>
-          </w:tcPr>
-          <w:p>
-            <w:r>
-              <w:t>Branding is consistent</w:t>
-            </w:r>
-          </w:p>
-        </w:tc>
-      </w:tr>
-      <w:tr>
-        <w:tc>
-          <w:tcPr>
-            <w:tcW w:type="dxa" w:w="2340"/>
-            <w:vAlign w:val="center"/>
-          </w:tcPr>
-          <w:p>
-            <w:r>
-              <w:t>3</w:t>
-            </w:r>
-          </w:p>
-        </w:tc>
-        <w:tc>
-          <w:tcPr>
-            <w:tcW w:type="dxa" w:w="2340"/>
-            <w:vAlign w:val="center"/>
-          </w:tcPr>
-          <w:p>
-            <w:r>
-              <w:t>Review startup privacy text</w:t>
-            </w:r>
-          </w:p>
-        </w:tc>
-        <w:tc>
-          <w:tcPr>
-            <w:tcW w:type="dxa" w:w="2340"/>
-            <w:vAlign w:val="center"/>
-          </w:tcPr>
-          <w:p>
-            <w:r>
-              <w:t>Logging choice and local-processing notice</w:t>
-            </w:r>
-          </w:p>
-        </w:tc>
-        <w:tc>
-          <w:tcPr>
-            <w:tcW w:type="dxa" w:w="2340"/>
-            <w:vAlign w:val="center"/>
-          </w:tcPr>
-          <w:p>
-            <w:r>
-              <w:t>No camera yet</w:t>
-            </w:r>
-          </w:p>
-        </w:tc>
-      </w:tr>
-      <w:tr>
-        <w:tc>
-          <w:tcPr>
-            <w:tcW w:type="dxa" w:w="2340"/>
-            <w:vAlign w:val="center"/>
-          </w:tcPr>
-          <w:p>
-            <w:r>
-              <w:t>4</w:t>
-            </w:r>
-          </w:p>
-        </w:tc>
-        <w:tc>
-          <w:tcPr>
-            <w:tcW w:type="dxa" w:w="2340"/>
-            <w:vAlign w:val="center"/>
-          </w:tcPr>
-          <w:p>
-            <w:r>
-              <w:t>Select Start Camera</w:t>
-            </w:r>
-          </w:p>
-        </w:tc>
-        <w:tc>
-          <w:tcPr>
-            <w:tcW w:type="dxa" w:w="2340"/>
-            <w:vAlign w:val="center"/>
-          </w:tcPr>
-          <w:p>
-            <w:r>
-              <w:t>Dark dashboard and preview</w:t>
-            </w:r>
-          </w:p>
-        </w:tc>
-        <w:tc>
-          <w:tcPr>
-            <w:tcW w:type="dxa" w:w="2340"/>
-            <w:vAlign w:val="center"/>
-          </w:tcPr>
-          <w:p>
-            <w:r>
-              <w:t>02_main_dashboard_dark_theme.png</w:t>
-            </w:r>
-          </w:p>
-        </w:tc>
-      </w:tr>
-      <w:tr>
-        <w:tc>
-          <w:tcPr>
-            <w:tcW w:type="dxa" w:w="2340"/>
-            <w:vAlign w:val="center"/>
-          </w:tcPr>
-          <w:p>
-            <w:r>
-              <w:t>5</w:t>
-            </w:r>
-          </w:p>
-        </w:tc>
-        <w:tc>
-          <w:tcPr>
-            <w:tcW w:type="dxa" w:w="2340"/>
-            <w:vAlign w:val="center"/>
-          </w:tcPr>
-          <w:p>
-            <w:r>
-              <w:t>Hold neutral, then smile</w:t>
-            </w:r>
-          </w:p>
-        </w:tc>
-        <w:tc>
-          <w:tcPr>
-            <w:tcW w:type="dxa" w:w="2340"/>
-            <w:vAlign w:val="center"/>
-          </w:tcPr>
-          <w:p>
-            <w:r>
-              <w:t>Estimate changes; positive group turns rectangle blue</w:t>
-            </w:r>
-          </w:p>
-        </w:tc>
-        <w:tc>
-          <w:tcPr>
-            <w:tcW w:type="dxa" w:w="2340"/>
-            <w:vAlign w:val="center"/>
-          </w:tcPr>
-          <w:p>
-            <w:r>
-              <w:t>02_main_dashboard_dark_theme.png</w:t>
-            </w:r>
-          </w:p>
-        </w:tc>
-      </w:tr>
-      <w:tr>
-        <w:tc>
-          <w:tcPr>
-            <w:tcW w:type="dxa" w:w="2340"/>
-            <w:vAlign w:val="center"/>
-          </w:tcPr>
-          <w:p>
-            <w:r>
-              <w:t>6</w:t>
-            </w:r>
-          </w:p>
-        </w:tc>
-        <w:tc>
-          <w:tcPr>
-            <w:tcW w:type="dxa" w:w="2340"/>
-            <w:vAlign w:val="center"/>
-          </w:tcPr>
-          <w:p>
-            <w:r>
-              <w:t>Open Settings</w:t>
-            </w:r>
-          </w:p>
-        </w:tc>
-        <w:tc>
-          <w:tcPr>
-            <w:tcW w:type="dxa" w:w="2340"/>
-            <w:vAlign w:val="center"/>
-          </w:tcPr>
-          <w:p>
-            <w:r>
-              <w:t>Scrollable settings dialog</w:t>
-            </w:r>
-          </w:p>
-        </w:tc>
-        <w:tc>
-          <w:tcPr>
-            <w:tcW w:type="dxa" w:w="2340"/>
-            <w:vAlign w:val="center"/>
-          </w:tcPr>
-          <w:p>
-            <w:r>
-              <w:t>Settings visible</w:t>
-            </w:r>
-          </w:p>
-        </w:tc>
-      </w:tr>
-      <w:tr>
-        <w:tc>
-          <w:tcPr>
-            <w:tcW w:type="dxa" w:w="2340"/>
-            <w:vAlign w:val="center"/>
-          </w:tcPr>
-          <w:p>
-            <w:r>
-              <w:t>7</w:t>
-            </w:r>
-          </w:p>
-        </w:tc>
-        <w:tc>
-          <w:tcPr>
-            <w:tcW w:type="dxa" w:w="2340"/>
-            <w:vAlign w:val="center"/>
-          </w:tcPr>
-          <w:p>
-            <w:r>
-              <w:t>Click numeric up/down arrows and type a value</w:t>
-            </w:r>
-          </w:p>
-        </w:tc>
-        <w:tc>
-          <w:tcPr>
-            <w:tcW w:type="dxa" w:w="2340"/>
-            <w:vAlign w:val="center"/>
-          </w:tcPr>
-          <w:p>
-            <w:r>
-              <w:t>Spinner changes both ways</w:t>
-            </w:r>
-          </w:p>
-        </w:tc>
-        <w:tc>
-          <w:tcPr>
-            <w:tcW w:type="dxa" w:w="2340"/>
-            <w:vAlign w:val="center"/>
-          </w:tcPr>
-          <w:p>
-            <w:r>
-              <w:t>04_settings_numeric_arrows_dark.png</w:t>
-            </w:r>
-          </w:p>
-        </w:tc>
-      </w:tr>
-      <w:tr>
-        <w:tc>
-          <w:tcPr>
-            <w:tcW w:type="dxa" w:w="2340"/>
-            <w:vAlign w:val="center"/>
-          </w:tcPr>
-          <w:p>
-            <w:r>
-              <w:t>8</w:t>
-            </w:r>
-          </w:p>
-        </w:tc>
-        <w:tc>
-          <w:tcPr>
-            <w:tcW w:type="dxa" w:w="2340"/>
-            <w:vAlign w:val="center"/>
-          </w:tcPr>
-          <w:p>
-            <w:r>
-              <w:t>Choose Theme: Light and Save</w:t>
-            </w:r>
-          </w:p>
-        </w:tc>
-        <w:tc>
-          <w:tcPr>
-            <w:tcW w:type="dxa" w:w="2340"/>
-            <w:vAlign w:val="center"/>
-          </w:tcPr>
-          <w:p>
-            <w:r>
-              <w:t>Entire app becomes light</w:t>
-            </w:r>
-          </w:p>
-        </w:tc>
-        <w:tc>
-          <w:tcPr>
-            <w:tcW w:type="dxa" w:w="2340"/>
-            <w:vAlign w:val="center"/>
-          </w:tcPr>
-          <w:p>
-            <w:r>
-              <w:t>03_main_dashboard_light_theme.png</w:t>
-            </w:r>
-          </w:p>
-        </w:tc>
-      </w:tr>
-      <w:tr>
-        <w:tc>
-          <w:tcPr>
-            <w:tcW w:type="dxa" w:w="2340"/>
-            <w:vAlign w:val="center"/>
-          </w:tcPr>
-          <w:p>
-            <w:r>
-              <w:t>9</w:t>
-            </w:r>
-          </w:p>
-        </w:tc>
-        <w:tc>
-          <w:tcPr>
-            <w:tcW w:type="dxa" w:w="2340"/>
-            <w:vAlign w:val="center"/>
-          </w:tcPr>
-          <w:p>
-            <w:r>
-              <w:t>Optionally switch back to Dark</w:t>
-            </w:r>
-          </w:p>
-        </w:tc>
-        <w:tc>
-          <w:tcPr>
-            <w:tcW w:type="dxa" w:w="2340"/>
-            <w:vAlign w:val="center"/>
-          </w:tcPr>
-          <w:p>
-            <w:r>
-              <w:t>Entire app returns dark</w:t>
-            </w:r>
-          </w:p>
-        </w:tc>
-        <w:tc>
-          <w:tcPr>
-            <w:tcW w:type="dxa" w:w="2340"/>
-            <w:vAlign w:val="center"/>
-          </w:tcPr>
-          <w:p>
-            <w:r>
-              <w:t>06_settings_theme_toggle.png</w:t>
-            </w:r>
-          </w:p>
-        </w:tc>
-      </w:tr>
-      <w:tr>
-        <w:tc>
-          <w:tcPr>
-            <w:tcW w:type="dxa" w:w="2340"/>
-            <w:vAlign w:val="center"/>
-          </w:tcPr>
-          <w:p>
-            <w:r>
-              <w:t>10</w:t>
-            </w:r>
-          </w:p>
-        </w:tc>
-        <w:tc>
-          <w:tcPr>
-            <w:tcW w:type="dxa" w:w="2340"/>
-            <w:vAlign w:val="center"/>
-          </w:tcPr>
-          <w:p>
-            <w:r>
-              <w:t>Open calibration</w:t>
-            </w:r>
-          </w:p>
-        </w:tc>
-        <w:tc>
-          <w:tcPr>
-            <w:tcW w:type="dxa" w:w="2340"/>
-            <w:vAlign w:val="center"/>
-          </w:tcPr>
-          <w:p>
-            <w:r>
-              <w:t>Unified calibration screen</w:t>
-            </w:r>
-          </w:p>
-        </w:tc>
-        <w:tc>
-          <w:tcPr>
-            <w:tcW w:type="dxa" w:w="2340"/>
-            <w:vAlign w:val="center"/>
-          </w:tcPr>
-          <w:p>
-            <w:r>
-              <w:t>07_calibration_expression_dropdown.png</w:t>
-            </w:r>
-          </w:p>
-        </w:tc>
-      </w:tr>
-      <w:tr>
-        <w:tc>
-          <w:tcPr>
-            <w:tcW w:type="dxa" w:w="2340"/>
-            <w:vAlign w:val="center"/>
-          </w:tcPr>
-          <w:p>
-            <w:r>
-              <w:t>11</w:t>
-            </w:r>
-          </w:p>
-        </w:tc>
-        <w:tc>
-          <w:tcPr>
-            <w:tcW w:type="dxa" w:w="2340"/>
-            <w:vAlign w:val="center"/>
-          </w:tcPr>
-          <w:p>
-            <w:r>
-              <w:t>Select an expression from dropdown</w:t>
-            </w:r>
-          </w:p>
-        </w:tc>
-        <w:tc>
-          <w:tcPr>
-            <w:tcW w:type="dxa" w:w="2340"/>
-            <w:vAlign w:val="center"/>
-          </w:tcPr>
-          <w:p>
-            <w:r>
-              <w:t>Target changes</w:t>
-            </w:r>
-          </w:p>
-        </w:tc>
-        <w:tc>
-          <w:tcPr>
-            <w:tcW w:type="dxa" w:w="2340"/>
-            <w:vAlign w:val="center"/>
-          </w:tcPr>
-          <w:p>
-            <w:r>
-              <w:t>07_calibration_expression_dropdown.png</w:t>
-            </w:r>
-          </w:p>
-        </w:tc>
-      </w:tr>
-      <w:tr>
-        <w:tc>
-          <w:tcPr>
-            <w:tcW w:type="dxa" w:w="2340"/>
-            <w:vAlign w:val="center"/>
-          </w:tcPr>
-          <w:p>
-            <w:r>
-              <w:t>12</w:t>
-            </w:r>
-          </w:p>
-        </w:tc>
-        <w:tc>
-          <w:tcPr>
-            <w:tcW w:type="dxa" w:w="2340"/>
-            <w:vAlign w:val="center"/>
-          </w:tcPr>
-          <w:p>
-            <w:r>
-              <w:t>Point out local example graphic</w:t>
-            </w:r>
-          </w:p>
-        </w:tc>
-        <w:tc>
-          <w:tcPr>
-            <w:tcW w:type="dxa" w:w="2340"/>
-            <w:vAlign w:val="center"/>
-          </w:tcPr>
-          <w:p>
-            <w:r>
-              <w:t>Graphic changes with target</w:t>
-            </w:r>
-          </w:p>
-        </w:tc>
-        <w:tc>
-          <w:tcPr>
-            <w:tcW w:type="dxa" w:w="2340"/>
-            <w:vAlign w:val="center"/>
-          </w:tcPr>
-          <w:p>
-            <w:r>
-              <w:t>08_calibration_example_graphic.png</w:t>
-            </w:r>
-          </w:p>
-        </w:tc>
-      </w:tr>
-      <w:tr>
-        <w:tc>
-          <w:tcPr>
-            <w:tcW w:type="dxa" w:w="2340"/>
-            <w:vAlign w:val="center"/>
-          </w:tcPr>
-          <w:p>
-            <w:r>
-              <w:t>13</w:t>
-            </w:r>
-          </w:p>
-        </w:tc>
-        <w:tc>
-          <w:tcPr>
-            <w:tcW w:type="dxa" w:w="2340"/>
-            <w:vAlign w:val="center"/>
-          </w:tcPr>
-          <w:p>
-            <w:r>
-              <w:t>Perform a roughly matching expression</w:t>
-            </w:r>
-          </w:p>
-        </w:tc>
-        <w:tc>
-          <w:tcPr>
-            <w:tcW w:type="dxa" w:w="2340"/>
-            <w:vAlign w:val="center"/>
-          </w:tcPr>
-          <w:p>
-            <w:r>
-              <w:t>Helper match may appear</w:t>
-            </w:r>
-          </w:p>
-        </w:tc>
-        <w:tc>
-          <w:tcPr>
-            <w:tcW w:type="dxa" w:w="2340"/>
-            <w:vAlign w:val="center"/>
-          </w:tcPr>
-          <w:p>
-            <w:r>
-              <w:t>09_calibration_match_checkmark.png</w:t>
-            </w:r>
-          </w:p>
-        </w:tc>
-      </w:tr>
-      <w:tr>
-        <w:tc>
-          <w:tcPr>
-            <w:tcW w:type="dxa" w:w="2340"/>
-            <w:vAlign w:val="center"/>
-          </w:tcPr>
-          <w:p>
-            <w:r>
-              <w:t>14</w:t>
-            </w:r>
-          </w:p>
-        </w:tc>
-        <w:tc>
-          <w:tcPr>
-            <w:tcW w:type="dxa" w:w="2340"/>
-            <w:vAlign w:val="center"/>
-          </w:tcPr>
-          <w:p>
-            <w:r>
-              <w:t>Select Start Capture</w:t>
-            </w:r>
-          </w:p>
-        </w:tc>
-        <w:tc>
-          <w:tcPr>
-            <w:tcW w:type="dxa" w:w="2340"/>
-            <w:vAlign w:val="center"/>
-          </w:tcPr>
-          <w:p>
-            <w:r>
-              <w:t>Local feature capture starts</w:t>
-            </w:r>
-          </w:p>
-        </w:tc>
-        <w:tc>
-          <w:tcPr>
-            <w:tcW w:type="dxa" w:w="2340"/>
-            <w:vAlign w:val="center"/>
-          </w:tcPr>
-          <w:p>
-            <w:r>
-              <w:t>10_calibration_capture_progress.png</w:t>
-            </w:r>
-          </w:p>
-        </w:tc>
-      </w:tr>
-      <w:tr>
-        <w:tc>
-          <w:tcPr>
-            <w:tcW w:type="dxa" w:w="2340"/>
-            <w:vAlign w:val="center"/>
-          </w:tcPr>
-          <w:p>
-            <w:r>
-              <w:t>15</w:t>
-            </w:r>
-          </w:p>
-        </w:tc>
-        <w:tc>
-          <w:tcPr>
-            <w:tcW w:type="dxa" w:w="2340"/>
-            <w:vAlign w:val="center"/>
-          </w:tcPr>
-          <w:p>
-            <w:r>
-              <w:t>Show capture progress</w:t>
-            </w:r>
-          </w:p>
-        </w:tc>
-        <w:tc>
-          <w:tcPr>
-            <w:tcW w:type="dxa" w:w="2340"/>
-            <w:vAlign w:val="center"/>
-          </w:tcPr>
-          <w:p>
-            <w:r>
-              <w:t>Counts and quality update</w:t>
-            </w:r>
-          </w:p>
-        </w:tc>
-        <w:tc>
-          <w:tcPr>
-            <w:tcW w:type="dxa" w:w="2340"/>
-            <w:vAlign w:val="center"/>
-          </w:tcPr>
-          <w:p>
-            <w:r>
-              <w:t>10_calibration_capture_progress.png</w:t>
-            </w:r>
-          </w:p>
-        </w:tc>
-      </w:tr>
-      <w:tr>
-        <w:tc>
-          <w:tcPr>
-            <w:tcW w:type="dxa" w:w="2340"/>
-            <w:vAlign w:val="center"/>
-          </w:tcPr>
-          <w:p>
-            <w:r>
-              <w:t>16</w:t>
-            </w:r>
-          </w:p>
-        </w:tc>
-        <w:tc>
-          <w:tcPr>
-            <w:tcW w:type="dxa" w:w="2340"/>
-            <w:vAlign w:val="center"/>
-          </w:tcPr>
-          <w:p>
-            <w:r>
-              <w:t>Select Re-capture</w:t>
-            </w:r>
-          </w:p>
-        </w:tc>
-        <w:tc>
-          <w:tcPr>
-            <w:tcW w:type="dxa" w:w="2340"/>
-            <w:vAlign w:val="center"/>
-          </w:tcPr>
-          <w:p>
-            <w:r>
-              <w:t>Current target batch is removed/reset</w:t>
-            </w:r>
-          </w:p>
-        </w:tc>
-        <w:tc>
-          <w:tcPr>
-            <w:tcW w:type="dxa" w:w="2340"/>
-            <w:vAlign w:val="center"/>
-          </w:tcPr>
-          <w:p>
-            <w:r>
-              <w:t>11_calibration_recapture_button.png</w:t>
-            </w:r>
-          </w:p>
-        </w:tc>
-      </w:tr>
-      <w:tr>
-        <w:tc>
-          <w:tcPr>
-            <w:tcW w:type="dxa" w:w="2340"/>
-            <w:vAlign w:val="center"/>
-          </w:tcPr>
-          <w:p>
-            <w:r>
-              <w:t>17</w:t>
-            </w:r>
-          </w:p>
-        </w:tc>
-        <w:tc>
-          <w:tcPr>
-            <w:tcW w:type="dxa" w:w="2340"/>
-            <w:vAlign w:val="center"/>
-          </w:tcPr>
-          <w:p>
-            <w:r>
-              <w:t>Use Previous and Next</w:t>
-            </w:r>
-          </w:p>
-        </w:tc>
-        <w:tc>
-          <w:tcPr>
-            <w:tcW w:type="dxa" w:w="2340"/>
-            <w:vAlign w:val="center"/>
-          </w:tcPr>
-          <w:p>
-            <w:r>
-              <w:t>Target moves in both directions</w:t>
-            </w:r>
-          </w:p>
-        </w:tc>
-        <w:tc>
-          <w:tcPr>
-            <w:tcW w:type="dxa" w:w="2340"/>
-            <w:vAlign w:val="center"/>
-          </w:tcPr>
-          <w:p>
-            <w:r>
-              <w:t>12_calibration_previous_next_buttons.png</w:t>
-            </w:r>
-          </w:p>
-        </w:tc>
-      </w:tr>
-      <w:tr>
-        <w:tc>
-          <w:tcPr>
-            <w:tcW w:type="dxa" w:w="2340"/>
-            <w:vAlign w:val="center"/>
-          </w:tcPr>
-          <w:p>
-            <w:r>
-              <w:t>18</w:t>
-            </w:r>
-          </w:p>
-        </w:tc>
-        <w:tc>
-          <w:tcPr>
-            <w:tcW w:type="dxa" w:w="2340"/>
-            <w:vAlign w:val="center"/>
-          </w:tcPr>
-          <w:p>
-            <w:r>
-              <w:t>Capture valid samples and Finish</w:t>
-            </w:r>
-          </w:p>
-        </w:tc>
-        <w:tc>
-          <w:tcPr>
-            <w:tcW w:type="dxa" w:w="2340"/>
-            <w:vAlign w:val="center"/>
-          </w:tcPr>
-          <w:p>
-            <w:r>
-              <w:t>Completion message/profile saved</w:t>
-            </w:r>
-          </w:p>
-        </w:tc>
-        <w:tc>
-          <w:tcPr>
-            <w:tcW w:type="dxa" w:w="2340"/>
-            <w:vAlign w:val="center"/>
-          </w:tcPr>
-          <w:p>
-            <w:r>
-              <w:t>Profile activates</w:t>
-            </w:r>
-          </w:p>
-        </w:tc>
-      </w:tr>
-      <w:tr>
-        <w:tc>
-          <w:tcPr>
-            <w:tcW w:type="dxa" w:w="2340"/>
-            <w:vAlign w:val="center"/>
-          </w:tcPr>
-          <w:p>
-            <w:r>
-              <w:t>19</w:t>
-            </w:r>
-          </w:p>
-        </w:tc>
-        <w:tc>
-          <w:tcPr>
-            <w:tcW w:type="dxa" w:w="2340"/>
-            <w:vAlign w:val="center"/>
-          </w:tcPr>
-          <w:p>
-            <w:r>
-              <w:t>Return to dashboard</w:t>
-            </w:r>
-          </w:p>
-        </w:tc>
-        <w:tc>
-          <w:tcPr>
-            <w:tcW w:type="dxa" w:w="2340"/>
-            <w:vAlign w:val="center"/>
-          </w:tcPr>
-          <w:p>
-            <w:r>
-              <w:t>Hybrid mode/profile active</w:t>
-            </w:r>
-          </w:p>
-        </w:tc>
-        <w:tc>
-          <w:tcPr>
-            <w:tcW w:type="dxa" w:w="2340"/>
-            <w:vAlign w:val="center"/>
-          </w:tcPr>
-          <w:p>
-            <w:r>
-              <w:t>Dashboard status</w:t>
-            </w:r>
-          </w:p>
-        </w:tc>
-      </w:tr>
-      <w:tr>
-        <w:tc>
-          <w:tcPr>
-            <w:tcW w:type="dxa" w:w="2340"/>
-            <w:vAlign w:val="center"/>
-          </w:tcPr>
-          <w:p>
-            <w:r>
-              <w:t>20</w:t>
-            </w:r>
-          </w:p>
-        </w:tc>
-        <w:tc>
-          <w:tcPr>
-            <w:tcW w:type="dxa" w:w="2340"/>
-            <w:vAlign w:val="center"/>
-          </w:tcPr>
-          <w:p>
-            <w:r>
-              <w:t>Select Run in background</w:t>
-            </w:r>
-          </w:p>
-        </w:tc>
-        <w:tc>
-          <w:tcPr>
-            <w:tcW w:type="dxa" w:w="2340"/>
-            <w:vAlign w:val="center"/>
-          </w:tcPr>
-          <w:p>
-            <w:r>
-              <w:t>Tray icon/menu; analysis continues locally</w:t>
-            </w:r>
-          </w:p>
-        </w:tc>
-        <w:tc>
-          <w:tcPr>
-            <w:tcW w:type="dxa" w:w="2340"/>
-            <w:vAlign w:val="center"/>
-          </w:tcPr>
-          <w:p>
-            <w:r>
-              <w:t>14_background_mode_tray.png</w:t>
-            </w:r>
-          </w:p>
-        </w:tc>
-      </w:tr>
-      <w:tr>
-        <w:tc>
-          <w:tcPr>
-            <w:tcW w:type="dxa" w:w="2340"/>
-            <w:vAlign w:val="center"/>
-          </w:tcPr>
-          <w:p>
-            <w:r>
-              <w:t>21</w:t>
-            </w:r>
-          </w:p>
-        </w:tc>
-        <w:tc>
-          <w:tcPr>
-            <w:tcW w:type="dxa" w:w="2340"/>
-            <w:vAlign w:val="center"/>
-          </w:tcPr>
-          <w:p>
-            <w:r>
-              <w:t>Restore app and select Statistics</w:t>
-            </w:r>
-          </w:p>
-        </w:tc>
-        <w:tc>
-          <w:tcPr>
-            <w:tcW w:type="dxa" w:w="2340"/>
-            <w:vAlign w:val="center"/>
-          </w:tcPr>
-          <w:p>
-            <w:r>
-              <w:t>Local cards and charts</w:t>
-            </w:r>
-          </w:p>
-        </w:tc>
-        <w:tc>
-          <w:tcPr>
-            <w:tcW w:type="dxa" w:w="2340"/>
-            <w:vAlign w:val="center"/>
-          </w:tcPr>
-          <w:p>
-            <w:r>
-              <w:t>16_statistics_overview.png</w:t>
-            </w:r>
-          </w:p>
-        </w:tc>
-      </w:tr>
-      <w:tr>
-        <w:tc>
-          <w:tcPr>
-            <w:tcW w:type="dxa" w:w="2340"/>
-            <w:vAlign w:val="center"/>
-          </w:tcPr>
-          <w:p>
-            <w:r>
-              <w:t>22</w:t>
-            </w:r>
-          </w:p>
-        </w:tc>
-        <w:tc>
-          <w:tcPr>
-            <w:tcW w:type="dxa" w:w="2340"/>
-            <w:vAlign w:val="center"/>
-          </w:tcPr>
-          <w:p>
-            <w:r>
-              <w:t>Show today's balance, weekly chart, and expression counts</w:t>
-            </w:r>
-          </w:p>
-        </w:tc>
-        <w:tc>
-          <w:tcPr>
-            <w:tcW w:type="dxa" w:w="2340"/>
-            <w:vAlign w:val="center"/>
-          </w:tcPr>
-          <w:p>
-            <w:r>
-              <w:t>Local-only visual summaries</w:t>
-            </w:r>
-          </w:p>
-        </w:tc>
-        <w:tc>
-          <w:tcPr>
-            <w:tcW w:type="dxa" w:w="2340"/>
-            <w:vAlign w:val="center"/>
-          </w:tcPr>
-          <w:p>
-            <w:r>
-              <w:t>17_statistics_today_balance.png, 18_statistics_weekly_balance.png, 19_statistics_expression_counts.png</w:t>
-            </w:r>
-          </w:p>
-        </w:tc>
-      </w:tr>
-      <w:tr>
-        <w:tc>
-          <w:tcPr>
-            <w:tcW w:type="dxa" w:w="2340"/>
-            <w:vAlign w:val="center"/>
-          </w:tcPr>
-          <w:p>
-            <w:r>
-              <w:t>23</w:t>
-            </w:r>
-          </w:p>
-        </w:tc>
-        <w:tc>
-          <w:tcPr>
-            <w:tcW w:type="dxa" w:w="2340"/>
-            <w:vAlign w:val="center"/>
-          </w:tcPr>
-          <w:p>
-            <w:r>
-              <w:t>Open Settings / User Profile, enter a name, save, and show a personalized message</w:t>
-            </w:r>
-          </w:p>
-        </w:tc>
-        <w:tc>
-          <w:tcPr>
-            <w:tcW w:type="dxa" w:w="2340"/>
-            <w:vAlign w:val="center"/>
-          </w:tcPr>
-          <w:p>
-            <w:r>
-              <w:t>Optional local name affects safe wording</w:t>
-            </w:r>
-          </w:p>
-        </w:tc>
-        <w:tc>
-          <w:tcPr>
-            <w:tcW w:type="dxa" w:w="2340"/>
-            <w:vAlign w:val="center"/>
-          </w:tcPr>
-          <w:p>
-            <w:r>
-              <w:t>20_user_profile_settings.png</w:t>
-            </w:r>
-          </w:p>
-        </w:tc>
-      </w:tr>
-      <w:tr>
-        <w:tc>
-          <w:tcPr>
-            <w:tcW w:type="dxa" w:w="2340"/>
-            <w:vAlign w:val="center"/>
-          </w:tcPr>
-          <w:p>
-            <w:r>
-              <w:t>24</w:t>
-            </w:r>
-          </w:p>
-        </w:tc>
-        <w:tc>
-          <w:tcPr>
-            <w:tcW w:type="dxa" w:w="2340"/>
-            <w:vAlign w:val="center"/>
-          </w:tcPr>
-          <w:p>
-            <w:r>
-              <w:t>Enter email and explain disabled-by-default daily email summary / Send Test control</w:t>
-            </w:r>
-          </w:p>
-        </w:tc>
-        <w:tc>
-          <w:tcPr>
-            <w:tcW w:type="dxa" w:w="2340"/>
-            <w:vAlign w:val="center"/>
-          </w:tcPr>
-          <w:p>
-            <w:r>
-              <w:t>Opt-in privacy wording</w:t>
-            </w:r>
-          </w:p>
-        </w:tc>
-        <w:tc>
-          <w:tcPr>
-            <w:tcW w:type="dxa" w:w="2340"/>
-            <w:vAlign w:val="center"/>
-          </w:tcPr>
-          <w:p>
-            <w:r>
-              <w:t>21_daily_email_summary_settings.png, 22_test_email_button.png</w:t>
-            </w:r>
-          </w:p>
-        </w:tc>
-      </w:tr>
-      <w:tr>
-        <w:tc>
-          <w:tcPr>
-            <w:tcW w:type="dxa" w:w="2340"/>
-            <w:vAlign w:val="center"/>
-          </w:tcPr>
-          <w:p>
-            <w:r>
-              <w:t>25</w:t>
-            </w:r>
-          </w:p>
-        </w:tc>
-        <w:tc>
-          <w:tcPr>
-            <w:tcW w:type="dxa" w:w="2340"/>
-            <w:vAlign w:val="center"/>
-          </w:tcPr>
-          <w:p>
-            <w:r>
-              <w:t>Select Open Logs</w:t>
-            </w:r>
-          </w:p>
-        </w:tc>
-        <w:tc>
-          <w:tcPr>
-            <w:tcW w:type="dxa" w:w="2340"/>
-            <w:vAlign w:val="center"/>
-          </w:tcPr>
-          <w:p>
-            <w:r>
-              <w:t>Metadata-only logs folder</w:t>
-            </w:r>
-          </w:p>
-        </w:tc>
-        <w:tc>
-          <w:tcPr>
-            <w:tcW w:type="dxa" w:w="2340"/>
-            <w:vAlign w:val="center"/>
-          </w:tcPr>
-          <w:p>
-            <w:r>
-              <w:t>15_logs_folder.png</w:t>
-            </w:r>
-          </w:p>
-        </w:tc>
-      </w:tr>
-      <w:tr>
-        <w:tc>
-          <w:tcPr>
-            <w:tcW w:type="dxa" w:w="2340"/>
-            <w:vAlign w:val="center"/>
-          </w:tcPr>
-          <w:p>
-            <w:r>
-              <w:t>26</w:t>
-            </w:r>
-          </w:p>
-        </w:tc>
-        <w:tc>
-          <w:tcPr>
-            <w:tcW w:type="dxa" w:w="2340"/>
-            <w:vAlign w:val="center"/>
-          </w:tcPr>
-          <w:p>
-            <w:r>
-              <w:t>Select Exit</w:t>
-            </w:r>
-          </w:p>
-        </w:tc>
-        <w:tc>
-          <w:tcPr>
-            <w:tcW w:type="dxa" w:w="2340"/>
-            <w:vAlign w:val="center"/>
-          </w:tcPr>
-          <w:p>
-            <w:r>
-              <w:t>Camera released and app closes</w:t>
-            </w:r>
-          </w:p>
-        </w:tc>
-        <w:tc>
-          <w:tcPr>
-            <w:tcW w:type="dxa" w:w="2340"/>
-            <w:vAlign w:val="center"/>
-          </w:tcPr>
-          <w:p>
-            <w:r>
-              <w:t>Demo complete</w:t>
-            </w:r>
-          </w:p>
-        </w:tc>
-      </w:tr>
-    </w:tbl>
-    <w:p>
-      <w:r>
-        <w:t>See [START_DEMO_HERE.html](START_DEMO_HERE.html) and [demo_script.md](demo_script.md).</w:t>
-      </w:r>
-    </w:p>
-    <w:p>
-      <w:pPr>
-        <w:pStyle w:val="Heading1"/>
-      </w:pPr>
-      <w:r>
-        <w:t>16. Troubleshooting</w:t>
+        <w:t>15. Troubleshooting</w:t>
       </w:r>
     </w:p>
     <w:tbl>
@@ -4582,7 +2252,7 @@
           </w:tcPr>
           <w:p>
             <w:r>
-              <w:t>Too few calibration samples</w:t>
+              <w:t>Calibration has too few samples</w:t>
             </w:r>
           </w:p>
         </w:tc>
@@ -4593,7 +2263,7 @@
           </w:tcPr>
           <w:p>
             <w:r>
-              <w:t>Improve light/position, hold still, or increase capture duration.</w:t>
+              <w:t>Improve lighting, hold still, or increase capture duration.</w:t>
             </w:r>
           </w:p>
         </w:tc>
@@ -4606,55 +2276,7 @@
           </w:tcPr>
           <w:p>
             <w:r>
-              <w:t>Spinner arrows do not appear</w:t>
-            </w:r>
-          </w:p>
-        </w:tc>
-        <w:tc>
-          <w:tcPr>
-            <w:tcW w:type="dxa" w:w="4680"/>
-            <w:vAlign w:val="center"/>
-          </w:tcPr>
-          <w:p>
-            <w:r>
-              <w:t>Restart the updated app/build; confirm the current theme applies and no old executable is running.</w:t>
-            </w:r>
-          </w:p>
-        </w:tc>
-      </w:tr>
-      <w:tr>
-        <w:tc>
-          <w:tcPr>
-            <w:tcW w:type="dxa" w:w="4680"/>
-            <w:vAlign w:val="center"/>
-          </w:tcPr>
-          <w:p>
-            <w:r>
-              <w:t>Theme does not change</w:t>
-            </w:r>
-          </w:p>
-        </w:tc>
-        <w:tc>
-          <w:tcPr>
-            <w:tcW w:type="dxa" w:w="4680"/>
-            <w:vAlign w:val="center"/>
-          </w:tcPr>
-          <w:p>
-            <w:r>
-              <w:t>Select the theme and then **Save**; the choice is stored in local config.</w:t>
-            </w:r>
-          </w:p>
-        </w:tc>
-      </w:tr>
-      <w:tr>
-        <w:tc>
-          <w:tcPr>
-            <w:tcW w:type="dxa" w:w="4680"/>
-            <w:vAlign w:val="center"/>
-          </w:tcPr>
-          <w:p>
-            <w:r>
-              <w:t>Background popup does not show</w:t>
+              <w:t>Background popups do not show</w:t>
             </w:r>
           </w:p>
         </w:tc>
@@ -4678,30 +2300,6 @@
           </w:tcPr>
           <w:p>
             <w:r>
-              <w:t>Logs are missing</w:t>
-            </w:r>
-          </w:p>
-        </w:tc>
-        <w:tc>
-          <w:tcPr>
-            <w:tcW w:type="dxa" w:w="4680"/>
-            <w:vAlign w:val="center"/>
-          </w:tcPr>
-          <w:p>
-            <w:r>
-              <w:t>Enable local metadata logging and run analysis briefly.</w:t>
-            </w:r>
-          </w:p>
-        </w:tc>
-      </w:tr>
-      <w:tr>
-        <w:tc>
-          <w:tcPr>
-            <w:tcW w:type="dxa" w:w="4680"/>
-            <w:vAlign w:val="center"/>
-          </w:tcPr>
-          <w:p>
-            <w:r>
               <w:t>Statistics are empty</w:t>
             </w:r>
           </w:p>
@@ -4713,7 +2311,7 @@
           </w:tcPr>
           <w:p>
             <w:r>
-              <w:t>Enable logging, run analysis, refresh, and select a date with entries.</w:t>
+              <w:t>Enable logging, run analysis briefly, refresh, and select a date with entries.</w:t>
             </w:r>
           </w:p>
         </w:tc>
@@ -4737,7 +2335,7 @@
           </w:tcPr>
           <w:p>
             <w:r>
-              <w:t>Confirm explicit opt-in, valid email, SMTP settings/password, logs for the date, send time, and network access.</w:t>
+              <w:t>Confirm opt-in, valid email, SMTP settings/password, logs, send time, and network access.</w:t>
             </w:r>
           </w:p>
         </w:tc>
@@ -4761,31 +2359,7 @@
           </w:tcPr>
           <w:p>
             <w:r>
-              <w:t>Verify the source before using SmartScreen **More info &gt; Run anyway**.</w:t>
-            </w:r>
-          </w:p>
-        </w:tc>
-      </w:tr>
-      <w:tr>
-        <w:tc>
-          <w:tcPr>
-            <w:tcW w:type="dxa" w:w="4680"/>
-            <w:vAlign w:val="center"/>
-          </w:tcPr>
-          <w:p>
-            <w:r>
-              <w:t>Source dependencies are missing</w:t>
-            </w:r>
-          </w:p>
-        </w:tc>
-        <w:tc>
-          <w:tcPr>
-            <w:tcW w:type="dxa" w:w="4680"/>
-            <w:vAlign w:val="center"/>
-          </w:tcPr>
-          <w:p>
-            <w:r>
-              <w:t>Activate .venv and run python -m pip install -r requirements.txt.</w:t>
+              <w:t>Use SmartScreen **More info &gt; Run anyway** only for a trusted file.</w:t>
             </w:r>
           </w:p>
         </w:tc>
@@ -4796,7 +2370,7 @@
         <w:pStyle w:val="Heading1"/>
       </w:pPr>
       <w:r>
-        <w:t>17. Limitations</w:t>
+        <w:t>16. Limitations</w:t>
       </w:r>
     </w:p>
     <w:p>
@@ -4804,7 +2378,7 @@
         <w:pStyle w:val="ListBullet"/>
       </w:pPr>
       <w:r>
-        <w:t>Visible-expression estimates are approximate and can be wrong.</w:t>
+        <w:t>Detection is approximate and may be wrong.</w:t>
       </w:r>
     </w:p>
     <w:p>
@@ -4820,7 +2394,7 @@
         <w:pStyle w:val="ListBullet"/>
       </w:pPr>
       <w:r>
-        <w:t>Personalized calibration improves estimates but does not guarantee accuracy.</w:t>
+        <w:t>Calibration improves estimates but cannot guarantee accuracy.</w:t>
       </w:r>
     </w:p>
     <w:p>
@@ -4828,7 +2402,7 @@
         <w:pStyle w:val="ListBullet"/>
       </w:pPr>
       <w:r>
-        <w:t>The app is designed for one user and one laptop webcam.</w:t>
+        <w:t>The app is designed for one visible user and one laptop webcam.</w:t>
       </w:r>
     </w:p>
     <w:p>
@@ -4836,39 +2410,7 @@
         <w:pStyle w:val="ListBullet"/>
       </w:pPr>
       <w:r>
-        <w:t>The match helper is permissive guidance and does not validate a true emotion.</w:t>
-      </w:r>
-    </w:p>
-    <w:p>
-      <w:pPr>
-        <w:pStyle w:val="ListBullet"/>
-      </w:pPr>
-      <w:r>
-        <w:t>The preparation-countdown config remains, but capture currently starts manually.</w:t>
-      </w:r>
-    </w:p>
-    <w:p>
-      <w:pPr>
-        <w:pStyle w:val="ListBullet"/>
-      </w:pPr>
-      <w:r>
-        <w:t>EmotionCam does not know true feelings and is not for high-stakes decisions.</w:t>
-      </w:r>
-    </w:p>
-    <w:p>
-      <w:pPr>
-        <w:pStyle w:val="ListBullet"/>
-      </w:pPr>
-      <w:r>
-        <w:t>Estimated analyzed minutes use log-entry frequency and are approximate.</w:t>
-      </w:r>
-    </w:p>
-    <w:p>
-      <w:pPr>
-        <w:pStyle w:val="ListBullet"/>
-      </w:pPr>
-      <w:r>
-        <w:t>Email summaries require network access only when explicitly enabled or a draft is opened.</w:t>
+        <w:t>Email summaries require network access only after explicit opt-in.</w:t>
       </w:r>
     </w:p>
     <w:p>
@@ -4876,17 +2418,22 @@
         <w:pStyle w:val="Heading1"/>
       </w:pPr>
       <w:r>
-        <w:t>18. Uninstall and Data Removal</w:t>
+        <w:t>17. Uninstall and Data Removal</w:t>
       </w:r>
     </w:p>
     <w:p>
       <w:r>
-        <w:t>Uninstall from Windows Settings &gt; Apps &gt; Installed apps &gt; EmotionCam &gt; Uninstall.</w:t>
+        <w:t>Uninstall from Windows Settings &gt; Apps &gt; Installed apps &gt; EmotionCam.</w:t>
       </w:r>
     </w:p>
     <w:p>
       <w:r>
-        <w:t>To remove all remaining local settings, logs, profile features, and optional debug calibration frames, fully exit EmotionCam and delete:</w:t>
+        <w:t>To remove remaining local settings, logs, calibration data, and optional debug</w:t>
+      </w:r>
+    </w:p>
+    <w:p>
+      <w:r>
+        <w:t>frames, fully exit EmotionCam and delete:</w:t>
       </w:r>
     </w:p>
     <w:p>
@@ -4899,53 +2446,8 @@
         <w:t>%LOCALAPPDATA%\EmotionCam</w:t>
       </w:r>
     </w:p>
-    <w:p>
-      <w:pPr>
-        <w:pStyle w:val="Heading1"/>
-      </w:pPr>
-      <w:r>
-        <w:t>19. How to Start the Demo</w:t>
-      </w:r>
-    </w:p>
-    <w:p>
-      <w:pPr>
-        <w:pStyle w:val="ListNumber"/>
-      </w:pPr>
-      <w:r>
-        <w:t>Install or run EmotionCam.</w:t>
-      </w:r>
-    </w:p>
-    <w:p>
-      <w:pPr>
-        <w:pStyle w:val="ListNumber"/>
-      </w:pPr>
-      <w:r>
-        <w:t>Open the app.</w:t>
-      </w:r>
-    </w:p>
-    <w:p>
-      <w:pPr>
-        <w:pStyle w:val="ListNumber"/>
-      </w:pPr>
-      <w:r>
-        <w:t>Select Help &gt; Start Demo Guide.</w:t>
-      </w:r>
-    </w:p>
-    <w:p>
-      <w:pPr>
-        <w:pStyle w:val="ListNumber"/>
-      </w:pPr>
-      <w:r>
-        <w:t>Follow the offline docs\START_DEMO_HERE.html page.</w:t>
-      </w:r>
-    </w:p>
-    <w:p>
-      <w:r>
-        <w:t>Directly opening docs\START_DEMO_HERE.html also works without internet access.</w:t>
-      </w:r>
-    </w:p>
     <w:sectPr>
-      <w:footerReference w:type="default" r:id="rId32"/>
+      <w:footerReference w:type="default" r:id="rId24"/>
       <w:pgSz w:w="12240" w:h="15840"/>
       <w:pgMar w:top="1440" w:right="1440" w:bottom="1440" w:left="1440" w:header="708" w:footer="708" w:gutter="0"/>
       <w:cols w:space="720"/>

</xml_diff>

<commit_message>
Add optional AI expression analysis release
</commit_message>
<xml_diff>
--- a/emotioncam/docs/EmotionCam_User_Manual.docx
+++ b/emotioncam/docs/EmotionCam_User_Manual.docx
@@ -65,7 +65,7 @@
           <w:color w:val="52687C"/>
           <w:sz w:val="28"/>
         </w:rPr>
-        <w:t>Local visible-expression estimates with privacy-first personalized calibration</w:t>
+        <w:t>Local-first visible-expression estimates with optional external AI analysis</w:t>
       </w:r>
     </w:p>
     <w:p>
@@ -73,7 +73,7 @@
         <w:jc w:val="center"/>
       </w:pPr>
       <w:r>
-        <w:t>Version 1.0.0 | Updated June 16, 2026</w:t>
+        <w:t>Version 1.1.0 AI-enabled | Updated June 16, 2026</w:t>
       </w:r>
     </w:p>
     <w:p>
@@ -122,12 +122,12 @@
     </w:p>
     <w:p>
       <w:r>
-        <w:t>EmotionCam 1.0.0</w:t>
+        <w:t>EmotionCam 1.1.0 AI-enabled</w:t>
       </w:r>
     </w:p>
     <w:p>
       <w:r>
-        <w:t>Local visible-expression estimates with privacy-first personalized calibration</w:t>
+        <w:t>Local-first visible-expression estimates with optional external AI analysis</w:t>
       </w:r>
     </w:p>
     <w:p>
@@ -194,12 +194,17 @@
     </w:p>
     <w:p>
       <w:r>
-        <w:t>Windows tray, save metadata-only logs, show local Statistics, and optionally send</w:t>
+        <w:t>Windows tray, save metadata-only logs, show local Statistics, optionally send</w:t>
       </w:r>
     </w:p>
     <w:p>
       <w:r>
-        <w:t>daily text summaries when explicitly enabled.</w:t>
+        <w:t>daily text summaries when explicitly enabled, and optionally use external AI</w:t>
+      </w:r>
+    </w:p>
+    <w:p>
+      <w:r>
+        <w:t>analysis after explicit consent and API-key setup.</w:t>
       </w:r>
     </w:p>
     <w:p>
@@ -216,6 +221,37 @@
       </w:pPr>
       <w:r>
         <w:t>Webcam frames are processed locally by default.</w:t>
+      </w:r>
+    </w:p>
+    <w:p>
+      <w:pPr>
+        <w:pStyle w:val="ListBullet"/>
+      </w:pPr>
+      <w:r>
+        <w:t>External AI analysis is disabled by default and cannot send images unless the</w:t>
+      </w:r>
+    </w:p>
+    <w:p>
+      <w:r>
+        <w:t>user enables it, accepts the consent checkbox, and provides an OpenAI API key.</w:t>
+      </w:r>
+    </w:p>
+    <w:p>
+      <w:pPr>
+        <w:pStyle w:val="ListBullet"/>
+      </w:pPr>
+      <w:r>
+        <w:t>In External AI mode, EmotionCam sends one selected cropped face image by</w:t>
+      </w:r>
+    </w:p>
+    <w:p>
+      <w:r>
+        <w:t>default. Full-frame sending is available only if the user changes the setting,</w:t>
+      </w:r>
+    </w:p>
+    <w:p>
+      <w:r>
+        <w:t>and may include background details.</w:t>
       </w:r>
     </w:p>
     <w:p>
@@ -249,7 +285,7 @@
     </w:p>
     <w:p>
       <w:r>
-        <w:t>popup status, and FPS.</w:t>
+        <w:t>popup status, FPS, AI status fields, and final result source.</w:t>
       </w:r>
     </w:p>
     <w:p>
@@ -279,6 +315,24 @@
       </w:pPr>
       <w:r>
         <w:t>Daily email summaries are off by default and send text only if enabled.</w:t>
+      </w:r>
+    </w:p>
+    <w:p>
+      <w:pPr>
+        <w:pStyle w:val="ListBullet"/>
+      </w:pPr>
+      <w:r>
+        <w:t>API keys are not stored in config.json. Secure storage uses Windows</w:t>
+      </w:r>
+    </w:p>
+    <w:p>
+      <w:r>
+        <w:t>credential storage through keyring when available; otherwise the key can be</w:t>
+      </w:r>
+    </w:p>
+    <w:p>
+      <w:r>
+        <w:t>used for the current session only.</w:t>
       </w:r>
     </w:p>
     <w:p>
@@ -320,7 +374,12 @@
         <w:pStyle w:val="ListNumber"/>
       </w:pPr>
       <w:r>
-        <w:t>Download EmotionCam_Setup.exe from the latest release.</w:t>
+        <w:t>Download EmotionCam_Setup.exe for v1.0.0 local-only or</w:t>
+      </w:r>
+    </w:p>
+    <w:p>
+      <w:r>
+        <w:t>EmotionCam_Setup_v1.1.0_AI.exe for the AI-enabled release.</w:t>
       </w:r>
     </w:p>
     <w:p>
@@ -370,6 +429,39 @@
     <w:p>
       <w:r>
         <w:t>More info &gt; Run anyway only if you trust the downloaded file.</w:t>
+      </w:r>
+    </w:p>
+    <w:p>
+      <w:pPr>
+        <w:pStyle w:val="Heading2"/>
+      </w:pPr>
+      <w:r>
+        <w:t>Which release to choose</w:t>
+      </w:r>
+    </w:p>
+    <w:p>
+      <w:r>
+        <w:t>Choose v1.0.0 Local-only if privacy/offline use matters most and you do not</w:t>
+      </w:r>
+    </w:p>
+    <w:p>
+      <w:r>
+        <w:t>want the External AI option.</w:t>
+      </w:r>
+    </w:p>
+    <w:p>
+      <w:r>
+        <w:t>Choose v1.1.0-ai AI-enabled if you want all local features plus optional</w:t>
+      </w:r>
+    </w:p>
+    <w:p>
+      <w:r>
+        <w:t>AI-assisted visible-expression analysis and accept that enabling External AI may</w:t>
+      </w:r>
+    </w:p>
+    <w:p>
+      <w:r>
+        <w:t>send selected cropped face images or frames to OpenAI.</w:t>
       </w:r>
     </w:p>
     <w:p>
@@ -475,12 +567,12 @@
     </w:p>
     <w:p>
       <w:r>
-        <w:t>status, privacy status, detection mode, personalized profile status, Statistics,</w:t>
+        <w:t>status, privacy status, detection mode, personalized profile status, External AI</w:t>
       </w:r>
     </w:p>
     <w:p>
       <w:r>
-        <w:t>Settings, Open Logs, Run in background, and Exit controls.</w:t>
+        <w:t>status, Statistics, Settings, Open Logs, Run in background, and Exit controls.</w:t>
       </w:r>
     </w:p>
     <w:p>
@@ -860,92 +952,242 @@
       </w:r>
     </w:p>
     <w:p>
-      <w:pPr>
-        <w:pStyle w:val="Heading1"/>
-      </w:pPr>
       <w:r>
-        <w:t>8. Personalized Calibration</w:t>
+        <w:t>Detection modes include Local only, Personalized only,</w:t>
       </w:r>
     </w:p>
     <w:p>
       <w:r>
-        <w:t>Open calibration from Improve detection with calibration or Settings &gt;</w:t>
+        <w:t>Personalized / Hybrid local, External AI only, and Hybrid local + AI.</w:t>
+      </w:r>
+    </w:p>
+    <w:p>
+      <w:pPr>
+        <w:pStyle w:val="Heading1"/>
+      </w:pPr>
+      <w:r>
+        <w:t>8. External AI Analysis</w:t>
       </w:r>
     </w:p>
     <w:p>
       <w:r>
-        <w:t>Train / Calibrate Expressions.</w:t>
+        <w:t>External AI Analysis is available in the AI-enabled release and uses the OpenAI</w:t>
       </w:r>
     </w:p>
     <w:p>
       <w:r>
-        <w:t>The calibration screen includes:</w:t>
-      </w:r>
-    </w:p>
-    <w:p>
-      <w:pPr>
-        <w:pStyle w:val="ListBullet"/>
-      </w:pPr>
-      <w:r>
-        <w:t>Target expression dropdown</w:t>
-      </w:r>
-    </w:p>
-    <w:p>
-      <w:pPr>
-        <w:pStyle w:val="ListBullet"/>
-      </w:pPr>
-      <w:r>
-        <w:t>Local example expression graphic</w:t>
-      </w:r>
-    </w:p>
-    <w:p>
-      <w:pPr>
-        <w:pStyle w:val="ListBullet"/>
-      </w:pPr>
-      <w:r>
-        <w:t>Demo/live preview area</w:t>
-      </w:r>
-    </w:p>
-    <w:p>
-      <w:pPr>
-        <w:pStyle w:val="ListBullet"/>
-      </w:pPr>
-      <w:r>
-        <w:t>Live detected-expression estimate</w:t>
-      </w:r>
-    </w:p>
-    <w:p>
-      <w:pPr>
-        <w:pStyle w:val="ListBullet"/>
-      </w:pPr>
-      <w:r>
-        <w:t>Match helper/checkmark</w:t>
-      </w:r>
-    </w:p>
-    <w:p>
-      <w:pPr>
-        <w:pStyle w:val="ListBullet"/>
-      </w:pPr>
-      <w:r>
-        <w:t>Previous, Start Capture, Re-capture, Next, and Finish</w:t>
-      </w:r>
-    </w:p>
-    <w:p>
-      <w:pPr>
-        <w:pStyle w:val="ListBullet"/>
-      </w:pPr>
-      <w:r>
-        <w:t>Progress, valid sample count, rejected sample count, and quality summary</w:t>
+        <w:t>vision API to estimate the visible expression in one selected image. It may help</w:t>
       </w:r>
     </w:p>
     <w:p>
       <w:r>
-        <w:t>The old Skip button and separate Label Unknown Expression flow were</w:t>
+        <w:t>validate or improve local estimates, but it is still approximate and does not</w:t>
       </w:r>
     </w:p>
     <w:p>
       <w:r>
-        <w:t>removed. Users now choose the target expression directly from the dropdown.</w:t>
+        <w:t>know true internal emotions.</w:t>
+      </w:r>
+    </w:p>
+    <w:p>
+      <w:r>
+        <w:t>External AI is off by default. To enable it:</w:t>
+      </w:r>
+    </w:p>
+    <w:p>
+      <w:pPr>
+        <w:pStyle w:val="ListNumber"/>
+      </w:pPr>
+      <w:r>
+        <w:t>Open Settings.</w:t>
+      </w:r>
+    </w:p>
+    <w:p>
+      <w:pPr>
+        <w:pStyle w:val="ListNumber"/>
+      </w:pPr>
+      <w:r>
+        <w:t>Go to Expression Detection Mode and External AI.</w:t>
+      </w:r>
+    </w:p>
+    <w:p>
+      <w:pPr>
+        <w:pStyle w:val="ListNumber"/>
+      </w:pPr>
+      <w:r>
+        <w:t>Choose External AI only or Hybrid local + AI.</w:t>
+      </w:r>
+    </w:p>
+    <w:p>
+      <w:pPr>
+        <w:pStyle w:val="ListNumber"/>
+      </w:pPr>
+      <w:r>
+        <w:t>Check Enable External AI Analysis.</w:t>
+      </w:r>
+    </w:p>
+    <w:p>
+      <w:pPr>
+        <w:pStyle w:val="ListNumber"/>
+      </w:pPr>
+      <w:r>
+        <w:t>Read and accept the consent checkbox.</w:t>
+      </w:r>
+    </w:p>
+    <w:p>
+      <w:pPr>
+        <w:pStyle w:val="ListNumber"/>
+      </w:pPr>
+      <w:r>
+        <w:t>Enter an OpenAI API key.</w:t>
+      </w:r>
+    </w:p>
+    <w:p>
+      <w:pPr>
+        <w:pStyle w:val="ListNumber"/>
+      </w:pPr>
+      <w:r>
+        <w:t>Keep Send cropped face only enabled unless you intentionally want to send</w:t>
+      </w:r>
+    </w:p>
+    <w:p>
+      <w:r>
+        <w:t>the selected full frame.</w:t>
+      </w:r>
+    </w:p>
+    <w:p>
+      <w:pPr>
+        <w:pStyle w:val="ListNumber"/>
+      </w:pPr>
+      <w:r>
+        <w:t>Click Test Connection.</w:t>
+      </w:r>
+    </w:p>
+    <w:p>
+      <w:pPr>
+        <w:pStyle w:val="ListNumber"/>
+      </w:pPr>
+      <w:r>
+        <w:t>Save Settings.</w:t>
+      </w:r>
+    </w:p>
+    <w:p>
+      <w:r>
+        <w:t>Consent is required even if the checkbox is accidentally enabled. If consent is</w:t>
+      </w:r>
+    </w:p>
+    <w:p>
+      <w:r>
+        <w:t>missing, no request is sent. If the API key is missing, invalid, unavailable, or</w:t>
+      </w:r>
+    </w:p>
+    <w:p>
+      <w:r>
+        <w:t>the request times out, EmotionCam falls back to local detection.</w:t>
+      </w:r>
+    </w:p>
+    <w:p>
+      <w:r>
+        <w:t>The AI request sends only one selected image at a controlled interval. The</w:t>
+      </w:r>
+    </w:p>
+    <w:p>
+      <w:r>
+        <w:t>default interval is 10 seconds, with a minimum of 5 seconds. It never sends every</w:t>
+      </w:r>
+    </w:p>
+    <w:p>
+      <w:r>
+        <w:t>webcam frame. The request asks for structured JSON with a visible-expression</w:t>
+      </w:r>
+    </w:p>
+    <w:p>
+      <w:r>
+        <w:t>label, group, confidence, short reason, and alternatives. EmotionCam validates</w:t>
+      </w:r>
+    </w:p>
+    <w:p>
+      <w:r>
+        <w:t>the JSON, accepts only known labels/groups, clamps confidence to 0-1, and falls</w:t>
+      </w:r>
+    </w:p>
+    <w:p>
+      <w:r>
+        <w:t>back to unknown when the result is invalid or too uncertain.</w:t>
+      </w:r>
+    </w:p>
+    <w:p>
+      <w:r>
+        <w:t>What may be sent when External AI is enabled:</w:t>
+      </w:r>
+    </w:p>
+    <w:p>
+      <w:pPr>
+        <w:pStyle w:val="ListBullet"/>
+      </w:pPr>
+      <w:r>
+        <w:t>One cropped face image by default.</w:t>
+      </w:r>
+    </w:p>
+    <w:p>
+      <w:pPr>
+        <w:pStyle w:val="ListBullet"/>
+      </w:pPr>
+      <w:r>
+        <w:t>One selected full frame only if cropped-face-only mode is turned off.</w:t>
+      </w:r>
+    </w:p>
+    <w:p>
+      <w:r>
+        <w:t>What is never sent or logged:</w:t>
+      </w:r>
+    </w:p>
+    <w:p>
+      <w:pPr>
+        <w:pStyle w:val="ListBullet"/>
+      </w:pPr>
+      <w:r>
+        <w:t>API keys.</w:t>
+      </w:r>
+    </w:p>
+    <w:p>
+      <w:pPr>
+        <w:pStyle w:val="ListBullet"/>
+      </w:pPr>
+      <w:r>
+        <w:t>Raw base64 image data in logs.</w:t>
+      </w:r>
+    </w:p>
+    <w:p>
+      <w:pPr>
+        <w:pStyle w:val="ListBullet"/>
+      </w:pPr>
+      <w:r>
+        <w:t>Saved webcam video.</w:t>
+      </w:r>
+    </w:p>
+    <w:p>
+      <w:pPr>
+        <w:pStyle w:val="ListBullet"/>
+      </w:pPr>
+      <w:r>
+        <w:t>Face identity data.</w:t>
+      </w:r>
+    </w:p>
+    <w:p>
+      <w:pPr>
+        <w:pStyle w:val="ListBullet"/>
+      </w:pPr>
+      <w:r>
+        <w:t>Face matching data.</w:t>
+      </w:r>
+    </w:p>
+    <w:p>
+      <w:pPr>
+        <w:pStyle w:val="ListBullet"/>
+      </w:pPr>
+      <w:r>
+        <w:t>Medical or psychological conclusions.</w:t>
       </w:r>
     </w:p>
     <w:p>
@@ -964,7 +1206,7 @@
               <a:graphicData uri="http://schemas.openxmlformats.org/drawingml/2006/picture">
                 <pic:pic>
                   <pic:nvPicPr>
-                    <pic:cNvPr id="0" name="09_calibration_overview.png"/>
+                    <pic:cNvPr id="0" name="23_external_ai_settings_disabled.png"/>
                     <pic:cNvPicPr/>
                   </pic:nvPicPr>
                   <pic:blipFill>
@@ -1003,7 +1245,7 @@
               <a:graphicData uri="http://schemas.openxmlformats.org/drawingml/2006/picture">
                 <pic:pic>
                   <pic:nvPicPr>
-                    <pic:cNvPr id="0" name="10_calibration_expression_dropdown.png"/>
+                    <pic:cNvPr id="0" name="24_external_ai_consent_warning.png"/>
                     <pic:cNvPicPr/>
                   </pic:nvPicPr>
                   <pic:blipFill>
@@ -1042,7 +1284,7 @@
               <a:graphicData uri="http://schemas.openxmlformats.org/drawingml/2006/picture">
                 <pic:pic>
                   <pic:nvPicPr>
-                    <pic:cNvPr id="0" name="11_calibration_example_graphic.png"/>
+                    <pic:cNvPr id="0" name="25_external_ai_settings_enabled_no_key.png"/>
                     <pic:cNvPicPr/>
                   </pic:nvPicPr>
                   <pic:blipFill>
@@ -1081,7 +1323,7 @@
               <a:graphicData uri="http://schemas.openxmlformats.org/drawingml/2006/picture">
                 <pic:pic>
                   <pic:nvPicPr>
-                    <pic:cNvPr id="0" name="12_calibration_match_checkmark.png"/>
+                    <pic:cNvPr id="0" name="26_dashboard_ai_status.png"/>
                     <pic:cNvPicPr/>
                   </pic:nvPicPr>
                   <pic:blipFill>
@@ -1106,10 +1348,294 @@
     </w:p>
     <w:p>
       <w:pPr>
+        <w:jc w:val="center"/>
+      </w:pPr>
+      <w:r>
+        <w:drawing>
+          <wp:inline xmlns:a="http://schemas.openxmlformats.org/drawingml/2006/main" xmlns:pic="http://schemas.openxmlformats.org/drawingml/2006/picture">
+            <wp:extent cx="5394960" cy="3371850"/>
+            <wp:docPr id="11" name="Picture 11"/>
+            <wp:cNvGraphicFramePr>
+              <a:graphicFrameLocks noChangeAspect="1"/>
+            </wp:cNvGraphicFramePr>
+            <a:graphic>
+              <a:graphicData uri="http://schemas.openxmlformats.org/drawingml/2006/picture">
+                <pic:pic>
+                  <pic:nvPicPr>
+                    <pic:cNvPr id="0" name="27_dashboard_hybrid_local_ai_mode.png"/>
+                    <pic:cNvPicPr/>
+                  </pic:nvPicPr>
+                  <pic:blipFill>
+                    <a:blip r:embed="rId18"/>
+                    <a:stretch>
+                      <a:fillRect/>
+                    </a:stretch>
+                  </pic:blipFill>
+                  <pic:spPr>
+                    <a:xfrm>
+                      <a:off x="0" y="0"/>
+                      <a:ext cx="5394960" cy="3371850"/>
+                    </a:xfrm>
+                    <a:prstGeom prst="rect"/>
+                  </pic:spPr>
+                </pic:pic>
+              </a:graphicData>
+            </a:graphic>
+          </wp:inline>
+        </w:drawing>
+      </w:r>
+    </w:p>
+    <w:p>
+      <w:pPr>
         <w:pStyle w:val="Heading1"/>
       </w:pPr>
       <w:r>
-        <w:t>9. Settings</w:t>
+        <w:t>9. Personalized Calibration</w:t>
+      </w:r>
+    </w:p>
+    <w:p>
+      <w:r>
+        <w:t>Open calibration from Improve detection with calibration or Settings &gt;</w:t>
+      </w:r>
+    </w:p>
+    <w:p>
+      <w:r>
+        <w:t>Train / Calibrate Expressions.</w:t>
+      </w:r>
+    </w:p>
+    <w:p>
+      <w:r>
+        <w:t>The calibration screen includes:</w:t>
+      </w:r>
+    </w:p>
+    <w:p>
+      <w:pPr>
+        <w:pStyle w:val="ListBullet"/>
+      </w:pPr>
+      <w:r>
+        <w:t>Target expression dropdown</w:t>
+      </w:r>
+    </w:p>
+    <w:p>
+      <w:pPr>
+        <w:pStyle w:val="ListBullet"/>
+      </w:pPr>
+      <w:r>
+        <w:t>Local example expression graphic</w:t>
+      </w:r>
+    </w:p>
+    <w:p>
+      <w:pPr>
+        <w:pStyle w:val="ListBullet"/>
+      </w:pPr>
+      <w:r>
+        <w:t>Demo/live preview area</w:t>
+      </w:r>
+    </w:p>
+    <w:p>
+      <w:pPr>
+        <w:pStyle w:val="ListBullet"/>
+      </w:pPr>
+      <w:r>
+        <w:t>Live detected-expression estimate</w:t>
+      </w:r>
+    </w:p>
+    <w:p>
+      <w:pPr>
+        <w:pStyle w:val="ListBullet"/>
+      </w:pPr>
+      <w:r>
+        <w:t>Match helper/checkmark</w:t>
+      </w:r>
+    </w:p>
+    <w:p>
+      <w:pPr>
+        <w:pStyle w:val="ListBullet"/>
+      </w:pPr>
+      <w:r>
+        <w:t>Previous, Start Capture, Re-capture, Next, and Finish</w:t>
+      </w:r>
+    </w:p>
+    <w:p>
+      <w:pPr>
+        <w:pStyle w:val="ListBullet"/>
+      </w:pPr>
+      <w:r>
+        <w:t>Progress, valid sample count, rejected sample count, and quality summary</w:t>
+      </w:r>
+    </w:p>
+    <w:p>
+      <w:r>
+        <w:t>The old Skip button and separate Label Unknown Expression flow were</w:t>
+      </w:r>
+    </w:p>
+    <w:p>
+      <w:r>
+        <w:t>removed. Users now choose the target expression directly from the dropdown.</w:t>
+      </w:r>
+    </w:p>
+    <w:p>
+      <w:pPr>
+        <w:jc w:val="center"/>
+      </w:pPr>
+      <w:r>
+        <w:drawing>
+          <wp:inline xmlns:a="http://schemas.openxmlformats.org/drawingml/2006/main" xmlns:pic="http://schemas.openxmlformats.org/drawingml/2006/picture">
+            <wp:extent cx="5394960" cy="3371850"/>
+            <wp:docPr id="12" name="Picture 12"/>
+            <wp:cNvGraphicFramePr>
+              <a:graphicFrameLocks noChangeAspect="1"/>
+            </wp:cNvGraphicFramePr>
+            <a:graphic>
+              <a:graphicData uri="http://schemas.openxmlformats.org/drawingml/2006/picture">
+                <pic:pic>
+                  <pic:nvPicPr>
+                    <pic:cNvPr id="0" name="09_calibration_overview.png"/>
+                    <pic:cNvPicPr/>
+                  </pic:nvPicPr>
+                  <pic:blipFill>
+                    <a:blip r:embed="rId19"/>
+                    <a:stretch>
+                      <a:fillRect/>
+                    </a:stretch>
+                  </pic:blipFill>
+                  <pic:spPr>
+                    <a:xfrm>
+                      <a:off x="0" y="0"/>
+                      <a:ext cx="5394960" cy="3371850"/>
+                    </a:xfrm>
+                    <a:prstGeom prst="rect"/>
+                  </pic:spPr>
+                </pic:pic>
+              </a:graphicData>
+            </a:graphic>
+          </wp:inline>
+        </w:drawing>
+      </w:r>
+    </w:p>
+    <w:p>
+      <w:pPr>
+        <w:jc w:val="center"/>
+      </w:pPr>
+      <w:r>
+        <w:drawing>
+          <wp:inline xmlns:a="http://schemas.openxmlformats.org/drawingml/2006/main" xmlns:pic="http://schemas.openxmlformats.org/drawingml/2006/picture">
+            <wp:extent cx="5394960" cy="3371850"/>
+            <wp:docPr id="13" name="Picture 13"/>
+            <wp:cNvGraphicFramePr>
+              <a:graphicFrameLocks noChangeAspect="1"/>
+            </wp:cNvGraphicFramePr>
+            <a:graphic>
+              <a:graphicData uri="http://schemas.openxmlformats.org/drawingml/2006/picture">
+                <pic:pic>
+                  <pic:nvPicPr>
+                    <pic:cNvPr id="0" name="10_calibration_expression_dropdown.png"/>
+                    <pic:cNvPicPr/>
+                  </pic:nvPicPr>
+                  <pic:blipFill>
+                    <a:blip r:embed="rId20"/>
+                    <a:stretch>
+                      <a:fillRect/>
+                    </a:stretch>
+                  </pic:blipFill>
+                  <pic:spPr>
+                    <a:xfrm>
+                      <a:off x="0" y="0"/>
+                      <a:ext cx="5394960" cy="3371850"/>
+                    </a:xfrm>
+                    <a:prstGeom prst="rect"/>
+                  </pic:spPr>
+                </pic:pic>
+              </a:graphicData>
+            </a:graphic>
+          </wp:inline>
+        </w:drawing>
+      </w:r>
+    </w:p>
+    <w:p>
+      <w:pPr>
+        <w:jc w:val="center"/>
+      </w:pPr>
+      <w:r>
+        <w:drawing>
+          <wp:inline xmlns:a="http://schemas.openxmlformats.org/drawingml/2006/main" xmlns:pic="http://schemas.openxmlformats.org/drawingml/2006/picture">
+            <wp:extent cx="5394960" cy="3371850"/>
+            <wp:docPr id="14" name="Picture 14"/>
+            <wp:cNvGraphicFramePr>
+              <a:graphicFrameLocks noChangeAspect="1"/>
+            </wp:cNvGraphicFramePr>
+            <a:graphic>
+              <a:graphicData uri="http://schemas.openxmlformats.org/drawingml/2006/picture">
+                <pic:pic>
+                  <pic:nvPicPr>
+                    <pic:cNvPr id="0" name="11_calibration_example_graphic.png"/>
+                    <pic:cNvPicPr/>
+                  </pic:nvPicPr>
+                  <pic:blipFill>
+                    <a:blip r:embed="rId21"/>
+                    <a:stretch>
+                      <a:fillRect/>
+                    </a:stretch>
+                  </pic:blipFill>
+                  <pic:spPr>
+                    <a:xfrm>
+                      <a:off x="0" y="0"/>
+                      <a:ext cx="5394960" cy="3371850"/>
+                    </a:xfrm>
+                    <a:prstGeom prst="rect"/>
+                  </pic:spPr>
+                </pic:pic>
+              </a:graphicData>
+            </a:graphic>
+          </wp:inline>
+        </w:drawing>
+      </w:r>
+    </w:p>
+    <w:p>
+      <w:pPr>
+        <w:jc w:val="center"/>
+      </w:pPr>
+      <w:r>
+        <w:drawing>
+          <wp:inline xmlns:a="http://schemas.openxmlformats.org/drawingml/2006/main" xmlns:pic="http://schemas.openxmlformats.org/drawingml/2006/picture">
+            <wp:extent cx="5394960" cy="3371850"/>
+            <wp:docPr id="15" name="Picture 15"/>
+            <wp:cNvGraphicFramePr>
+              <a:graphicFrameLocks noChangeAspect="1"/>
+            </wp:cNvGraphicFramePr>
+            <a:graphic>
+              <a:graphicData uri="http://schemas.openxmlformats.org/drawingml/2006/picture">
+                <pic:pic>
+                  <pic:nvPicPr>
+                    <pic:cNvPr id="0" name="12_calibration_match_checkmark.png"/>
+                    <pic:cNvPicPr/>
+                  </pic:nvPicPr>
+                  <pic:blipFill>
+                    <a:blip r:embed="rId22"/>
+                    <a:stretch>
+                      <a:fillRect/>
+                    </a:stretch>
+                  </pic:blipFill>
+                  <pic:spPr>
+                    <a:xfrm>
+                      <a:off x="0" y="0"/>
+                      <a:ext cx="5394960" cy="3371850"/>
+                    </a:xfrm>
+                    <a:prstGeom prst="rect"/>
+                  </pic:spPr>
+                </pic:pic>
+              </a:graphicData>
+            </a:graphic>
+          </wp:inline>
+        </w:drawing>
+      </w:r>
+    </w:p>
+    <w:p>
+      <w:pPr>
+        <w:pStyle w:val="Heading1"/>
+      </w:pPr>
+      <w:r>
+        <w:t>10. Settings</w:t>
       </w:r>
     </w:p>
     <w:p>
@@ -1119,12 +1645,12 @@
     </w:p>
     <w:p>
       <w:r>
-        <w:t>Detection, Personalized calibration, Background, Privacy/logging, and Debug</w:t>
+        <w:t>Detection, Expression Detection Mode and External AI, Personalized calibration,</w:t>
       </w:r>
     </w:p>
     <w:p>
       <w:r>
-        <w:t>options.</w:t>
+        <w:t>Background, Privacy/logging, and Debug options.</w:t>
       </w:r>
     </w:p>
     <w:p>
@@ -1153,6 +1679,21 @@
       </w:r>
     </w:p>
     <w:p>
+      <w:r>
+        <w:t>External AI settings include enable/disable, consent, provider, API key,</w:t>
+      </w:r>
+    </w:p>
+    <w:p>
+      <w:r>
+        <w:t>secure-key storage, Test Connection, detection mode, cropped-face-only mode,</w:t>
+      </w:r>
+    </w:p>
+    <w:p>
+      <w:r>
+        <w:t>request interval, timeout, and AI debug info.</w:t>
+      </w:r>
+    </w:p>
+    <w:p>
       <w:pPr>
         <w:jc w:val="center"/>
       </w:pPr>
@@ -1160,7 +1701,7 @@
         <w:drawing>
           <wp:inline xmlns:a="http://schemas.openxmlformats.org/drawingml/2006/main" xmlns:pic="http://schemas.openxmlformats.org/drawingml/2006/picture">
             <wp:extent cx="5394960" cy="3371850"/>
-            <wp:docPr id="11" name="Picture 11"/>
+            <wp:docPr id="16" name="Picture 16"/>
             <wp:cNvGraphicFramePr>
               <a:graphicFrameLocks noChangeAspect="1"/>
             </wp:cNvGraphicFramePr>
@@ -1172,7 +1713,7 @@
                     <pic:cNvPicPr/>
                   </pic:nvPicPr>
                   <pic:blipFill>
-                    <a:blip r:embed="rId18"/>
+                    <a:blip r:embed="rId23"/>
                     <a:stretch>
                       <a:fillRect/>
                     </a:stretch>
@@ -1199,7 +1740,7 @@
         <w:drawing>
           <wp:inline xmlns:a="http://schemas.openxmlformats.org/drawingml/2006/main" xmlns:pic="http://schemas.openxmlformats.org/drawingml/2006/picture">
             <wp:extent cx="5394960" cy="3371850"/>
-            <wp:docPr id="12" name="Picture 12"/>
+            <wp:docPr id="17" name="Picture 17"/>
             <wp:cNvGraphicFramePr>
               <a:graphicFrameLocks noChangeAspect="1"/>
             </wp:cNvGraphicFramePr>
@@ -1211,7 +1752,7 @@
                     <pic:cNvPicPr/>
                   </pic:nvPicPr>
                   <pic:blipFill>
-                    <a:blip r:embed="rId19"/>
+                    <a:blip r:embed="rId24"/>
                     <a:stretch>
                       <a:fillRect/>
                     </a:stretch>
@@ -1238,7 +1779,7 @@
         <w:drawing>
           <wp:inline xmlns:a="http://schemas.openxmlformats.org/drawingml/2006/main" xmlns:pic="http://schemas.openxmlformats.org/drawingml/2006/picture">
             <wp:extent cx="5394960" cy="3371850"/>
-            <wp:docPr id="13" name="Picture 13"/>
+            <wp:docPr id="18" name="Picture 18"/>
             <wp:cNvGraphicFramePr>
               <a:graphicFrameLocks noChangeAspect="1"/>
             </wp:cNvGraphicFramePr>
@@ -1250,7 +1791,7 @@
                     <pic:cNvPicPr/>
                   </pic:nvPicPr>
                   <pic:blipFill>
-                    <a:blip r:embed="rId20"/>
+                    <a:blip r:embed="rId25"/>
                     <a:stretch>
                       <a:fillRect/>
                     </a:stretch>
@@ -1277,7 +1818,7 @@
         <w:drawing>
           <wp:inline xmlns:a="http://schemas.openxmlformats.org/drawingml/2006/main" xmlns:pic="http://schemas.openxmlformats.org/drawingml/2006/picture">
             <wp:extent cx="5394960" cy="3371850"/>
-            <wp:docPr id="14" name="Picture 14"/>
+            <wp:docPr id="19" name="Picture 19"/>
             <wp:cNvGraphicFramePr>
               <a:graphicFrameLocks noChangeAspect="1"/>
             </wp:cNvGraphicFramePr>
@@ -1289,7 +1830,7 @@
                     <pic:cNvPicPr/>
                   </pic:nvPicPr>
                   <pic:blipFill>
-                    <a:blip r:embed="rId19"/>
+                    <a:blip r:embed="rId24"/>
                     <a:stretch>
                       <a:fillRect/>
                     </a:stretch>
@@ -1313,7 +1854,7 @@
         <w:pStyle w:val="Heading1"/>
       </w:pPr>
       <w:r>
-        <w:t>10. Statistics</w:t>
+        <w:t>11. Statistics</w:t>
       </w:r>
     </w:p>
     <w:p>
@@ -1403,7 +1944,7 @@
         <w:drawing>
           <wp:inline xmlns:a="http://schemas.openxmlformats.org/drawingml/2006/main" xmlns:pic="http://schemas.openxmlformats.org/drawingml/2006/picture">
             <wp:extent cx="5394960" cy="3371850"/>
-            <wp:docPr id="15" name="Picture 15"/>
+            <wp:docPr id="20" name="Picture 20"/>
             <wp:cNvGraphicFramePr>
               <a:graphicFrameLocks noChangeAspect="1"/>
             </wp:cNvGraphicFramePr>
@@ -1415,7 +1956,7 @@
                     <pic:cNvPicPr/>
                   </pic:nvPicPr>
                   <pic:blipFill>
-                    <a:blip r:embed="rId21"/>
+                    <a:blip r:embed="rId26"/>
                     <a:stretch>
                       <a:fillRect/>
                     </a:stretch>
@@ -1442,7 +1983,7 @@
         <w:drawing>
           <wp:inline xmlns:a="http://schemas.openxmlformats.org/drawingml/2006/main" xmlns:pic="http://schemas.openxmlformats.org/drawingml/2006/picture">
             <wp:extent cx="5394960" cy="3371850"/>
-            <wp:docPr id="16" name="Picture 16"/>
+            <wp:docPr id="21" name="Picture 21"/>
             <wp:cNvGraphicFramePr>
               <a:graphicFrameLocks noChangeAspect="1"/>
             </wp:cNvGraphicFramePr>
@@ -1454,7 +1995,7 @@
                     <pic:cNvPicPr/>
                   </pic:nvPicPr>
                   <pic:blipFill>
-                    <a:blip r:embed="rId21"/>
+                    <a:blip r:embed="rId26"/>
                     <a:stretch>
                       <a:fillRect/>
                     </a:stretch>
@@ -1481,7 +2022,7 @@
         <w:drawing>
           <wp:inline xmlns:a="http://schemas.openxmlformats.org/drawingml/2006/main" xmlns:pic="http://schemas.openxmlformats.org/drawingml/2006/picture">
             <wp:extent cx="5394960" cy="3371850"/>
-            <wp:docPr id="17" name="Picture 17"/>
+            <wp:docPr id="22" name="Picture 22"/>
             <wp:cNvGraphicFramePr>
               <a:graphicFrameLocks noChangeAspect="1"/>
             </wp:cNvGraphicFramePr>
@@ -1493,7 +2034,7 @@
                     <pic:cNvPicPr/>
                   </pic:nvPicPr>
                   <pic:blipFill>
-                    <a:blip r:embed="rId21"/>
+                    <a:blip r:embed="rId26"/>
                     <a:stretch>
                       <a:fillRect/>
                     </a:stretch>
@@ -1520,7 +2061,7 @@
         <w:drawing>
           <wp:inline xmlns:a="http://schemas.openxmlformats.org/drawingml/2006/main" xmlns:pic="http://schemas.openxmlformats.org/drawingml/2006/picture">
             <wp:extent cx="5394960" cy="3371850"/>
-            <wp:docPr id="18" name="Picture 18"/>
+            <wp:docPr id="23" name="Picture 23"/>
             <wp:cNvGraphicFramePr>
               <a:graphicFrameLocks noChangeAspect="1"/>
             </wp:cNvGraphicFramePr>
@@ -1532,7 +2073,7 @@
                     <pic:cNvPicPr/>
                   </pic:nvPicPr>
                   <pic:blipFill>
-                    <a:blip r:embed="rId21"/>
+                    <a:blip r:embed="rId26"/>
                     <a:stretch>
                       <a:fillRect/>
                     </a:stretch>
@@ -1556,7 +2097,7 @@
         <w:pStyle w:val="Heading1"/>
       </w:pPr>
       <w:r>
-        <w:t>11. User Profile and Optional Daily Email</w:t>
+        <w:t>12. User Profile and Optional Daily Email</w:t>
       </w:r>
     </w:p>
     <w:p>
@@ -1633,7 +2174,7 @@
         <w:drawing>
           <wp:inline xmlns:a="http://schemas.openxmlformats.org/drawingml/2006/main" xmlns:pic="http://schemas.openxmlformats.org/drawingml/2006/picture">
             <wp:extent cx="5394960" cy="3371850"/>
-            <wp:docPr id="19" name="Picture 19"/>
+            <wp:docPr id="24" name="Picture 24"/>
             <wp:cNvGraphicFramePr>
               <a:graphicFrameLocks noChangeAspect="1"/>
             </wp:cNvGraphicFramePr>
@@ -1645,7 +2186,7 @@
                     <pic:cNvPicPr/>
                   </pic:nvPicPr>
                   <pic:blipFill>
-                    <a:blip r:embed="rId18"/>
+                    <a:blip r:embed="rId23"/>
                     <a:stretch>
                       <a:fillRect/>
                     </a:stretch>
@@ -1672,7 +2213,7 @@
         <w:drawing>
           <wp:inline xmlns:a="http://schemas.openxmlformats.org/drawingml/2006/main" xmlns:pic="http://schemas.openxmlformats.org/drawingml/2006/picture">
             <wp:extent cx="5394960" cy="3371850"/>
-            <wp:docPr id="20" name="Picture 20"/>
+            <wp:docPr id="25" name="Picture 25"/>
             <wp:cNvGraphicFramePr>
               <a:graphicFrameLocks noChangeAspect="1"/>
             </wp:cNvGraphicFramePr>
@@ -1684,7 +2225,7 @@
                     <pic:cNvPicPr/>
                   </pic:nvPicPr>
                   <pic:blipFill>
-                    <a:blip r:embed="rId18"/>
+                    <a:blip r:embed="rId23"/>
                     <a:stretch>
                       <a:fillRect/>
                     </a:stretch>
@@ -1708,7 +2249,7 @@
         <w:pStyle w:val="Heading1"/>
       </w:pPr>
       <w:r>
-        <w:t>12. Background Mode</w:t>
+        <w:t>13. Background Mode</w:t>
       </w:r>
     </w:p>
     <w:p>
@@ -1749,7 +2290,7 @@
         <w:drawing>
           <wp:inline xmlns:a="http://schemas.openxmlformats.org/drawingml/2006/main" xmlns:pic="http://schemas.openxmlformats.org/drawingml/2006/picture">
             <wp:extent cx="5394960" cy="3371850"/>
-            <wp:docPr id="21" name="Picture 21"/>
+            <wp:docPr id="26" name="Picture 26"/>
             <wp:cNvGraphicFramePr>
               <a:graphicFrameLocks noChangeAspect="1"/>
             </wp:cNvGraphicFramePr>
@@ -1761,7 +2302,7 @@
                     <pic:cNvPicPr/>
                   </pic:nvPicPr>
                   <pic:blipFill>
-                    <a:blip r:embed="rId22"/>
+                    <a:blip r:embed="rId27"/>
                     <a:stretch>
                       <a:fillRect/>
                     </a:stretch>
@@ -1785,7 +2326,7 @@
         <w:pStyle w:val="Heading1"/>
       </w:pPr>
       <w:r>
-        <w:t>13. Logs and Local Data</w:t>
+        <w:t>14. Logs and Local Data</w:t>
       </w:r>
     </w:p>
     <w:tbl>
@@ -1958,6 +2499,21 @@
       </w:r>
     </w:p>
     <w:p>
+      <w:r>
+        <w:t>AI-related log fields include external_ai_enabled, ai_request_sent,</w:t>
+      </w:r>
+    </w:p>
+    <w:p>
+      <w:r>
+        <w:t>ai_result_label, ai_result_confidence, ai_error, and</w:t>
+      </w:r>
+    </w:p>
+    <w:p>
+      <w:r>
+        <w:t>final_result_source. Logs never include images, base64 data, or API keys.</w:t>
+      </w:r>
+    </w:p>
+    <w:p>
       <w:pPr>
         <w:jc w:val="center"/>
       </w:pPr>
@@ -1965,7 +2521,7 @@
         <w:drawing>
           <wp:inline xmlns:a="http://schemas.openxmlformats.org/drawingml/2006/main" xmlns:pic="http://schemas.openxmlformats.org/drawingml/2006/picture">
             <wp:extent cx="5394960" cy="3371850"/>
-            <wp:docPr id="22" name="Picture 22"/>
+            <wp:docPr id="27" name="Picture 27"/>
             <wp:cNvGraphicFramePr>
               <a:graphicFrameLocks noChangeAspect="1"/>
             </wp:cNvGraphicFramePr>
@@ -1977,7 +2533,7 @@
                     <pic:cNvPicPr/>
                   </pic:nvPicPr>
                   <pic:blipFill>
-                    <a:blip r:embed="rId23"/>
+                    <a:blip r:embed="rId28"/>
                     <a:stretch>
                       <a:fillRect/>
                     </a:stretch>
@@ -2001,7 +2557,7 @@
         <w:pStyle w:val="Heading1"/>
       </w:pPr>
       <w:r>
-        <w:t>14. Demo Walkthrough</w:t>
+        <w:t>15. Demo Walkthrough</w:t>
       </w:r>
     </w:p>
     <w:p>
@@ -2050,6 +2606,56 @@
       </w:pPr>
       <w:r>
         <w:t>Switch Dark to Light and optionally back to Dark.</w:t>
+      </w:r>
+    </w:p>
+    <w:p>
+      <w:pPr>
+        <w:pStyle w:val="ListNumber"/>
+      </w:pPr>
+      <w:r>
+        <w:t>Show Expression Detection Mode and External AI.</w:t>
+      </w:r>
+    </w:p>
+    <w:p>
+      <w:pPr>
+        <w:pStyle w:val="ListNumber"/>
+      </w:pPr>
+      <w:r>
+        <w:t>Explain that AI is off by default, requires consent, requires an API key, and</w:t>
+      </w:r>
+    </w:p>
+    <w:p>
+      <w:r>
+        <w:t>uses cropped-face-only mode by default.</w:t>
+      </w:r>
+    </w:p>
+    <w:p>
+      <w:pPr>
+        <w:pStyle w:val="ListNumber"/>
+      </w:pPr>
+      <w:r>
+        <w:t>Show Test Connection without entering a real key in public screenshots.</w:t>
+      </w:r>
+    </w:p>
+    <w:p>
+      <w:pPr>
+        <w:pStyle w:val="ListNumber"/>
+      </w:pPr>
+      <w:r>
+        <w:t>Switch to Hybrid local + AI and show dashboard AI status/fallback if no</w:t>
+      </w:r>
+    </w:p>
+    <w:p>
+      <w:r>
+        <w:t>key is configured.</w:t>
+      </w:r>
+    </w:p>
+    <w:p>
+      <w:pPr>
+        <w:pStyle w:val="ListNumber"/>
+      </w:pPr>
+      <w:r>
+        <w:t>Disable AI again or return to local/hybrid local mode.</w:t>
       </w:r>
     </w:p>
     <w:p>
@@ -2126,7 +2732,7 @@
         <w:pStyle w:val="Heading1"/>
       </w:pPr>
       <w:r>
-        <w:t>15. Troubleshooting</w:t>
+        <w:t>16. Troubleshooting</w:t>
       </w:r>
     </w:p>
     <w:tbl>
@@ -2348,6 +2954,78 @@
           </w:tcPr>
           <w:p>
             <w:r>
+              <w:t>External AI stays off</w:t>
+            </w:r>
+          </w:p>
+        </w:tc>
+        <w:tc>
+          <w:tcPr>
+            <w:tcW w:type="dxa" w:w="4680"/>
+            <w:vAlign w:val="center"/>
+          </w:tcPr>
+          <w:p>
+            <w:r>
+              <w:t>Check that Enable External AI Analysis and consent are both enabled.</w:t>
+            </w:r>
+          </w:p>
+        </w:tc>
+      </w:tr>
+      <w:tr>
+        <w:tc>
+          <w:tcPr>
+            <w:tcW w:type="dxa" w:w="4680"/>
+            <w:vAlign w:val="center"/>
+          </w:tcPr>
+          <w:p>
+            <w:r>
+              <w:t>External AI says missing key</w:t>
+            </w:r>
+          </w:p>
+        </w:tc>
+        <w:tc>
+          <w:tcPr>
+            <w:tcW w:type="dxa" w:w="4680"/>
+            <w:vAlign w:val="center"/>
+          </w:tcPr>
+          <w:p>
+            <w:r>
+              <w:t>Enter an API key or store one securely, then use Test Connection.</w:t>
+            </w:r>
+          </w:p>
+        </w:tc>
+      </w:tr>
+      <w:tr>
+        <w:tc>
+          <w:tcPr>
+            <w:tcW w:type="dxa" w:w="4680"/>
+            <w:vAlign w:val="center"/>
+          </w:tcPr>
+          <w:p>
+            <w:r>
+              <w:t>External AI errors or times out</w:t>
+            </w:r>
+          </w:p>
+        </w:tc>
+        <w:tc>
+          <w:tcPr>
+            <w:tcW w:type="dxa" w:w="4680"/>
+            <w:vAlign w:val="center"/>
+          </w:tcPr>
+          <w:p>
+            <w:r>
+              <w:t>Check internet access, API key validity, rate limits, model availability, and timeout setting. Local fallback continues.</w:t>
+            </w:r>
+          </w:p>
+        </w:tc>
+      </w:tr>
+      <w:tr>
+        <w:tc>
+          <w:tcPr>
+            <w:tcW w:type="dxa" w:w="4680"/>
+            <w:vAlign w:val="center"/>
+          </w:tcPr>
+          <w:p>
+            <w:r>
               <w:t>Installer is blocked</w:t>
             </w:r>
           </w:p>
@@ -2370,7 +3048,7 @@
         <w:pStyle w:val="Heading1"/>
       </w:pPr>
       <w:r>
-        <w:t>16. Limitations</w:t>
+        <w:t>17. Limitations</w:t>
       </w:r>
     </w:p>
     <w:p>
@@ -2415,10 +3093,31 @@
     </w:p>
     <w:p>
       <w:pPr>
+        <w:pStyle w:val="ListBullet"/>
+      </w:pPr>
+      <w:r>
+        <w:t>External AI analysis requires network access and may send cropped face images</w:t>
+      </w:r>
+    </w:p>
+    <w:p>
+      <w:r>
+        <w:t>or selected frames when explicitly enabled.</w:t>
+      </w:r>
+    </w:p>
+    <w:p>
+      <w:pPr>
+        <w:pStyle w:val="ListBullet"/>
+      </w:pPr>
+      <w:r>
+        <w:t>External AI may improve visible-expression estimates but can still be wrong.</w:t>
+      </w:r>
+    </w:p>
+    <w:p>
+      <w:pPr>
         <w:pStyle w:val="Heading1"/>
       </w:pPr>
       <w:r>
-        <w:t>17. Uninstall and Data Removal</w:t>
+        <w:t>18. Uninstall and Data Removal</w:t>
       </w:r>
     </w:p>
     <w:p>
@@ -2447,7 +3146,7 @@
       </w:r>
     </w:p>
     <w:sectPr>
-      <w:footerReference w:type="default" r:id="rId24"/>
+      <w:footerReference w:type="default" r:id="rId29"/>
       <w:pgSz w:w="12240" w:h="15840"/>
       <w:pgMar w:top="1440" w:right="1440" w:bottom="1440" w:left="1440" w:header="708" w:footer="708" w:gutter="0"/>
       <w:cols w:space="720"/>

</xml_diff>

<commit_message>
Add local Ollama AI backend
</commit_message>
<xml_diff>
--- a/emotioncam/docs/EmotionCam_User_Manual.docx
+++ b/emotioncam/docs/EmotionCam_User_Manual.docx
@@ -65,7 +65,7 @@
           <w:color w:val="52687C"/>
           <w:sz w:val="28"/>
         </w:rPr>
-        <w:t>Local-first visible-expression estimates with optional external AI analysis</w:t>
+        <w:t>Local-first visible-expression estimates with optional Local Ollama or OpenAI AI analysis</w:t>
       </w:r>
     </w:p>
     <w:p>
@@ -73,7 +73,7 @@
         <w:jc w:val="center"/>
       </w:pPr>
       <w:r>
-        <w:t>Version 1.1.0 AI-enabled | Updated June 16, 2026</w:t>
+        <w:t>Version 1.2.0 AI-enabled | Updated June 16, 2026</w:t>
       </w:r>
     </w:p>
     <w:p>
@@ -122,12 +122,12 @@
     </w:p>
     <w:p>
       <w:r>
-        <w:t>EmotionCam 1.1.0 AI-enabled</w:t>
+        <w:t>EmotionCam 1.2.0 AI-enabled</w:t>
       </w:r>
     </w:p>
     <w:p>
       <w:r>
-        <w:t>Local-first visible-expression estimates with optional external AI analysis</w:t>
+        <w:t>Local-first visible-expression estimates with optional Local Ollama or OpenAI AI analysis</w:t>
       </w:r>
     </w:p>
     <w:p>
@@ -199,12 +199,17 @@
     </w:p>
     <w:p>
       <w:r>
-        <w:t>daily text summaries when explicitly enabled, and optionally use external AI</w:t>
+        <w:t>daily text summaries when explicitly enabled, and optionally use AI analysis</w:t>
       </w:r>
     </w:p>
     <w:p>
       <w:r>
-        <w:t>analysis after explicit consent and API-key setup.</w:t>
+        <w:t>after explicit consent. AI providers include Local Ollama on your own computer</w:t>
+      </w:r>
+    </w:p>
+    <w:p>
+      <w:r>
+        <w:t>and OpenAI cloud analysis.</w:t>
       </w:r>
     </w:p>
     <w:p>
@@ -228,12 +233,12 @@
         <w:pStyle w:val="ListBullet"/>
       </w:pPr>
       <w:r>
-        <w:t>External AI analysis is disabled by default and cannot send images unless the</w:t>
+        <w:t>AI analysis is disabled by default and cannot send images unless the user</w:t>
       </w:r>
     </w:p>
     <w:p>
       <w:r>
-        <w:t>user enables it, accepts the consent checkbox, and provides an OpenAI API key.</w:t>
+        <w:t>enables it and accepts the consent checkbox.</w:t>
       </w:r>
     </w:p>
     <w:p>
@@ -241,17 +246,43 @@
         <w:pStyle w:val="ListBullet"/>
       </w:pPr>
       <w:r>
-        <w:t>In External AI mode, EmotionCam sends one selected cropped face image by</w:t>
+        <w:t>Local Ollama mode sends selected cropped face images or frames only to the</w:t>
       </w:r>
     </w:p>
     <w:p>
       <w:r>
-        <w:t>default. Full-frame sending is available only if the user changes the setting,</w:t>
+        <w:t>Ollama service running on this computer. It does not need an OpenAI API key or</w:t>
       </w:r>
     </w:p>
     <w:p>
       <w:r>
-        <w:t>and may include background details.</w:t>
+        <w:t>OpenAI quota.</w:t>
+      </w:r>
+    </w:p>
+    <w:p>
+      <w:pPr>
+        <w:pStyle w:val="ListBullet"/>
+      </w:pPr>
+      <w:r>
+        <w:t>OpenAI mode sends selected cropped face images or frames to OpenAI and needs a</w:t>
+      </w:r>
+    </w:p>
+    <w:p>
+      <w:r>
+        <w:t>valid OpenAI API key, account quota, and internet access.</w:t>
+      </w:r>
+    </w:p>
+    <w:p>
+      <w:pPr>
+        <w:pStyle w:val="ListBullet"/>
+      </w:pPr>
+      <w:r>
+        <w:t>Cropped-face-only mode is enabled by default. Full-frame sending is available</w:t>
+      </w:r>
+    </w:p>
+    <w:p>
+      <w:r>
+        <w:t>only if the user changes the setting, and may include background details.</w:t>
       </w:r>
     </w:p>
     <w:p>
@@ -379,7 +410,7 @@
     </w:p>
     <w:p>
       <w:r>
-        <w:t>EmotionCam_Setup_v1.1.0_AI.exe for the AI-enabled release.</w:t>
+        <w:t>EmotionCam_Setup_v1.2.0_AI.exe for the current AI-enabled release.</w:t>
       </w:r>
     </w:p>
     <w:p>
@@ -446,22 +477,27 @@
     </w:p>
     <w:p>
       <w:r>
-        <w:t>want the External AI option.</w:t>
+        <w:t>want any AI-provider option.</w:t>
       </w:r>
     </w:p>
     <w:p>
       <w:r>
-        <w:t>Choose v1.1.0-ai AI-enabled if you want all local features plus optional</w:t>
+        <w:t>Choose v1.2.0-ai AI-enabled if you want all local features plus optional</w:t>
       </w:r>
     </w:p>
     <w:p>
       <w:r>
-        <w:t>AI-assisted visible-expression analysis and accept that enabling External AI may</w:t>
+        <w:t>AI-assisted visible-expression analysis. Choose Local Ollama inside Settings if</w:t>
       </w:r>
     </w:p>
     <w:p>
       <w:r>
-        <w:t>send selected cropped face images or frames to OpenAI.</w:t>
+        <w:t>you want AI without OpenAI quota. Choose OpenAI only if you accept that selected</w:t>
+      </w:r>
+    </w:p>
+    <w:p>
+      <w:r>
+        <w:t>cropped face images or frames may be sent to OpenAI.</w:t>
       </w:r>
     </w:p>
     <w:p>
@@ -567,12 +603,17 @@
     </w:p>
     <w:p>
       <w:r>
-        <w:t>status, privacy status, detection mode, personalized profile status, External AI</w:t>
+        <w:t>status, privacy status, detection mode, personalized profile status, AI</w:t>
       </w:r>
     </w:p>
     <w:p>
       <w:r>
-        <w:t>status, Statistics, Settings, Open Logs, Run in background, and Exit controls.</w:t>
+        <w:t>provider/status, Statistics, Settings, Open Logs, Run in background, and Exit</w:t>
+      </w:r>
+    </w:p>
+    <w:p>
+      <w:r>
+        <w:t>controls.</w:t>
       </w:r>
     </w:p>
     <w:p>
@@ -958,7 +999,7 @@
     </w:p>
     <w:p>
       <w:r>
-        <w:t>Personalized / Hybrid local, External AI only, and Hybrid local + AI.</w:t>
+        <w:t>Personalized / Hybrid local, AI only, and Hybrid local + AI.</w:t>
       </w:r>
     </w:p>
     <w:p>
@@ -966,32 +1007,205 @@
         <w:pStyle w:val="Heading1"/>
       </w:pPr>
       <w:r>
-        <w:t>8. External AI Analysis</w:t>
+        <w:t>8. AI Analysis: Local Ollama or OpenAI</w:t>
       </w:r>
     </w:p>
     <w:p>
       <w:r>
-        <w:t>External AI Analysis is available in the AI-enabled release and uses the OpenAI</w:t>
+        <w:t>AI Analysis is available in the AI-enabled release. It estimates the visible</w:t>
       </w:r>
     </w:p>
     <w:p>
       <w:r>
-        <w:t>vision API to estimate the visible expression in one selected image. It may help</w:t>
+        <w:t>expression in one selected image at a controlled interval. It may help validate</w:t>
       </w:r>
     </w:p>
     <w:p>
       <w:r>
-        <w:t>validate or improve local estimates, but it is still approximate and does not</w:t>
+        <w:t>or improve local estimates, but it is still approximate and does not know true</w:t>
       </w:r>
     </w:p>
     <w:p>
       <w:r>
-        <w:t>know true internal emotions.</w:t>
+        <w:t>internal emotions.</w:t>
       </w:r>
     </w:p>
     <w:p>
       <w:r>
-        <w:t>External AI is off by default. To enable it:</w:t>
+        <w:t>EmotionCam supports two AI providers:</w:t>
+      </w:r>
+    </w:p>
+    <w:tbl>
+      <w:tblPr>
+        <w:tblStyle w:val="TableGrid"/>
+        <w:tblW w:type="auto" w:w="0"/>
+        <w:tblLayout w:type="fixed"/>
+        <w:tblLook w:firstColumn="1" w:firstRow="1" w:lastColumn="0" w:lastRow="0" w:noHBand="0" w:noVBand="1" w:val="04A0"/>
+      </w:tblPr>
+      <w:tblGrid>
+        <w:gridCol w:w="2340"/>
+        <w:gridCol w:w="2340"/>
+        <w:gridCol w:w="2340"/>
+        <w:gridCol w:w="2340"/>
+      </w:tblGrid>
+      <w:tr>
+        <w:tc>
+          <w:tcPr>
+            <w:tcW w:type="dxa" w:w="2340"/>
+            <w:vAlign w:val="center"/>
+            <w:shd w:fill="E8EEF5"/>
+          </w:tcPr>
+          <w:p>
+            <w:r>
+              <w:rPr>
+                <w:b/>
+              </w:rPr>
+              <w:t>Provider</w:t>
+            </w:r>
+          </w:p>
+        </w:tc>
+        <w:tc>
+          <w:tcPr>
+            <w:tcW w:type="dxa" w:w="2340"/>
+            <w:vAlign w:val="center"/>
+            <w:shd w:fill="E8EEF5"/>
+          </w:tcPr>
+          <w:p>
+            <w:r>
+              <w:rPr>
+                <w:b/>
+              </w:rPr>
+              <w:t>Where it runs</w:t>
+            </w:r>
+          </w:p>
+        </w:tc>
+        <w:tc>
+          <w:tcPr>
+            <w:tcW w:type="dxa" w:w="2340"/>
+            <w:vAlign w:val="center"/>
+            <w:shd w:fill="E8EEF5"/>
+          </w:tcPr>
+          <w:p>
+            <w:r>
+              <w:rPr>
+                <w:b/>
+              </w:rPr>
+              <w:t>Key needed</w:t>
+            </w:r>
+          </w:p>
+        </w:tc>
+        <w:tc>
+          <w:tcPr>
+            <w:tcW w:type="dxa" w:w="2340"/>
+            <w:vAlign w:val="center"/>
+            <w:shd w:fill="E8EEF5"/>
+          </w:tcPr>
+          <w:p>
+            <w:r>
+              <w:rPr>
+                <w:b/>
+              </w:rPr>
+              <w:t>Privacy note</w:t>
+            </w:r>
+          </w:p>
+        </w:tc>
+      </w:tr>
+      <w:tr>
+        <w:tc>
+          <w:tcPr>
+            <w:tcW w:type="dxa" w:w="2340"/>
+            <w:vAlign w:val="center"/>
+          </w:tcPr>
+          <w:p>
+            <w:r>
+              <w:t>Local Ollama</w:t>
+            </w:r>
+          </w:p>
+        </w:tc>
+        <w:tc>
+          <w:tcPr>
+            <w:tcW w:type="dxa" w:w="2340"/>
+            <w:vAlign w:val="center"/>
+          </w:tcPr>
+          <w:p>
+            <w:r>
+              <w:t>On your own computer at http://localhost:11434</w:t>
+            </w:r>
+          </w:p>
+        </w:tc>
+        <w:tc>
+          <w:tcPr>
+            <w:tcW w:type="dxa" w:w="2340"/>
+            <w:vAlign w:val="center"/>
+          </w:tcPr>
+          <w:p>
+            <w:r>
+              <w:t>No OpenAI key</w:t>
+            </w:r>
+          </w:p>
+        </w:tc>
+        <w:tc>
+          <w:tcPr>
+            <w:tcW w:type="dxa" w:w="2340"/>
+            <w:vAlign w:val="center"/>
+          </w:tcPr>
+          <w:p>
+            <w:r>
+              <w:t>Sends selected images only to local Ollama</w:t>
+            </w:r>
+          </w:p>
+        </w:tc>
+      </w:tr>
+      <w:tr>
+        <w:tc>
+          <w:tcPr>
+            <w:tcW w:type="dxa" w:w="2340"/>
+            <w:vAlign w:val="center"/>
+          </w:tcPr>
+          <w:p>
+            <w:r>
+              <w:t>OpenAI</w:t>
+            </w:r>
+          </w:p>
+        </w:tc>
+        <w:tc>
+          <w:tcPr>
+            <w:tcW w:type="dxa" w:w="2340"/>
+            <w:vAlign w:val="center"/>
+          </w:tcPr>
+          <w:p>
+            <w:r>
+              <w:t>OpenAI cloud API</w:t>
+            </w:r>
+          </w:p>
+        </w:tc>
+        <w:tc>
+          <w:tcPr>
+            <w:tcW w:type="dxa" w:w="2340"/>
+            <w:vAlign w:val="center"/>
+          </w:tcPr>
+          <w:p>
+            <w:r>
+              <w:t>OpenAI API key and quota</w:t>
+            </w:r>
+          </w:p>
+        </w:tc>
+        <w:tc>
+          <w:tcPr>
+            <w:tcW w:type="dxa" w:w="2340"/>
+            <w:vAlign w:val="center"/>
+          </w:tcPr>
+          <w:p>
+            <w:r>
+              <w:t>Sends selected images to OpenAI</w:t>
+            </w:r>
+          </w:p>
+        </w:tc>
+      </w:tr>
+    </w:tbl>
+    <w:p>
+      <w:r>
+        <w:t>AI is off by default. To enable Local Ollama:</w:t>
       </w:r>
     </w:p>
     <w:p>
@@ -1007,7 +1221,7 @@
         <w:pStyle w:val="ListNumber"/>
       </w:pPr>
       <w:r>
-        <w:t>Go to Expression Detection Mode and External AI.</w:t>
+        <w:t>Go to Expression Detection Mode and AI Analysis.</w:t>
       </w:r>
     </w:p>
     <w:p>
@@ -1015,7 +1229,7 @@
         <w:pStyle w:val="ListNumber"/>
       </w:pPr>
       <w:r>
-        <w:t>Choose External AI only or Hybrid local + AI.</w:t>
+        <w:t>Choose provider Local Ollama (runs on this computer).</w:t>
       </w:r>
     </w:p>
     <w:p>
@@ -1023,15 +1237,81 @@
         <w:pStyle w:val="ListNumber"/>
       </w:pPr>
       <w:r>
-        <w:t>Check Enable External AI Analysis.</w:t>
+        <w:t>Install Ollama separately if needed, then run ollama pull llava:7b in</w:t>
       </w:r>
     </w:p>
     <w:p>
+      <w:r>
+        <w:t>PowerShell.</w:t>
+      </w:r>
+    </w:p>
+    <w:p>
       <w:pPr>
         <w:pStyle w:val="ListNumber"/>
       </w:pPr>
       <w:r>
-        <w:t>Read and accept the consent checkbox.</w:t>
+        <w:t>Keep endpoint http://localhost:11434.</w:t>
+      </w:r>
+    </w:p>
+    <w:p>
+      <w:pPr>
+        <w:pStyle w:val="ListNumber"/>
+      </w:pPr>
+      <w:r>
+        <w:t>Keep model llava:7b, or enter another local vision model you installed.</w:t>
+      </w:r>
+    </w:p>
+    <w:p>
+      <w:pPr>
+        <w:pStyle w:val="ListNumber"/>
+      </w:pPr>
+      <w:r>
+        <w:t>Click Test Connection.</w:t>
+      </w:r>
+    </w:p>
+    <w:p>
+      <w:pPr>
+        <w:pStyle w:val="ListNumber"/>
+      </w:pPr>
+      <w:r>
+        <w:t>Check Enable AI Analysis.</w:t>
+      </w:r>
+    </w:p>
+    <w:p>
+      <w:pPr>
+        <w:pStyle w:val="ListNumber"/>
+      </w:pPr>
+      <w:r>
+        <w:t>Read and accept the local Ollama consent checkbox.</w:t>
+      </w:r>
+    </w:p>
+    <w:p>
+      <w:pPr>
+        <w:pStyle w:val="ListNumber"/>
+      </w:pPr>
+      <w:r>
+        <w:t>Choose Hybrid local + AI.</w:t>
+      </w:r>
+    </w:p>
+    <w:p>
+      <w:pPr>
+        <w:pStyle w:val="ListNumber"/>
+      </w:pPr>
+      <w:r>
+        <w:t>Save Settings.</w:t>
+      </w:r>
+    </w:p>
+    <w:p>
+      <w:r>
+        <w:t>To enable OpenAI instead:</w:t>
+      </w:r>
+    </w:p>
+    <w:p>
+      <w:pPr>
+        <w:pStyle w:val="ListNumber"/>
+      </w:pPr>
+      <w:r>
+        <w:t>Choose provider OpenAI (cloud / uses API credits).</w:t>
       </w:r>
     </w:p>
     <w:p>
@@ -1047,19 +1327,6 @@
         <w:pStyle w:val="ListNumber"/>
       </w:pPr>
       <w:r>
-        <w:t>Keep Send cropped face only enabled unless you intentionally want to send</w:t>
-      </w:r>
-    </w:p>
-    <w:p>
-      <w:r>
-        <w:t>the selected full frame.</w:t>
-      </w:r>
-    </w:p>
-    <w:p>
-      <w:pPr>
-        <w:pStyle w:val="ListNumber"/>
-      </w:pPr>
-      <w:r>
         <w:t>Click Test Connection.</w:t>
       </w:r>
     </w:p>
@@ -1068,7 +1335,7 @@
         <w:pStyle w:val="ListNumber"/>
       </w:pPr>
       <w:r>
-        <w:t>Save Settings.</w:t>
+        <w:t>Enable AI Analysis, accept consent, choose Hybrid local + AI, and save.</w:t>
       </w:r>
     </w:p>
     <w:p>
@@ -1078,12 +1345,17 @@
     </w:p>
     <w:p>
       <w:r>
-        <w:t>missing, no request is sent. If the API key is missing, invalid, unavailable, or</w:t>
+        <w:t>missing, no request is sent. If Local Ollama is not running, the selected model</w:t>
       </w:r>
     </w:p>
     <w:p>
       <w:r>
-        <w:t>the request times out, EmotionCam falls back to local detection.</w:t>
+        <w:t>is missing, the OpenAI key has no quota, or the request times out, EmotionCam</w:t>
+      </w:r>
+    </w:p>
+    <w:p>
+      <w:r>
+        <w:t>falls back to local detection.</w:t>
       </w:r>
     </w:p>
     <w:p>
@@ -1118,7 +1390,7 @@
     </w:p>
     <w:p>
       <w:r>
-        <w:t>What may be sent when External AI is enabled:</w:t>
+        <w:t>What may be sent when AI is enabled:</w:t>
       </w:r>
     </w:p>
     <w:p>
@@ -1126,7 +1398,20 @@
         <w:pStyle w:val="ListBullet"/>
       </w:pPr>
       <w:r>
-        <w:t>One cropped face image by default.</w:t>
+        <w:t>Local Ollama: one selected cropped face image by default, sent to Ollama on</w:t>
+      </w:r>
+    </w:p>
+    <w:p>
+      <w:r>
+        <w:t>this computer.</w:t>
+      </w:r>
+    </w:p>
+    <w:p>
+      <w:pPr>
+        <w:pStyle w:val="ListBullet"/>
+      </w:pPr>
+      <w:r>
+        <w:t>OpenAI: one selected cropped face image by default, sent to OpenAI.</w:t>
       </w:r>
     </w:p>
     <w:p>
@@ -1645,7 +1930,7 @@
     </w:p>
     <w:p>
       <w:r>
-        <w:t>Detection, Expression Detection Mode and External AI, Personalized calibration,</w:t>
+        <w:t>Detection, Expression Detection Mode and AI Analysis, Personalized calibration,</w:t>
       </w:r>
     </w:p>
     <w:p>
@@ -1680,17 +1965,17 @@
     </w:p>
     <w:p>
       <w:r>
-        <w:t>External AI settings include enable/disable, consent, provider, API key,</w:t>
+        <w:t>AI settings include enable/disable, consent, provider, OpenAI API key fields,</w:t>
       </w:r>
     </w:p>
     <w:p>
       <w:r>
-        <w:t>secure-key storage, Test Connection, detection mode, cropped-face-only mode,</w:t>
+        <w:t>Local Ollama endpoint/model fields, Test Connection, detection mode,</w:t>
       </w:r>
     </w:p>
     <w:p>
       <w:r>
-        <w:t>request interval, timeout, and AI debug info.</w:t>
+        <w:t>cropped-face-only mode, request interval, timeout, and AI debug info.</w:t>
       </w:r>
     </w:p>
     <w:p>
@@ -2500,17 +2785,22 @@
     </w:p>
     <w:p>
       <w:r>
-        <w:t>AI-related log fields include external_ai_enabled, ai_request_sent,</w:t>
+        <w:t>AI-related log fields include external_ai_enabled, ai_provider,</w:t>
       </w:r>
     </w:p>
     <w:p>
       <w:r>
-        <w:t>ai_result_label, ai_result_confidence, ai_error, and</w:t>
+        <w:t>ai_request_sent, ai_result_label, ai_result_confidence,</w:t>
       </w:r>
     </w:p>
     <w:p>
       <w:r>
-        <w:t>final_result_source. Logs never include images, base64 data, or API keys.</w:t>
+        <w:t>ai_result_source, ai_error, and final_result_source. Logs never include</w:t>
+      </w:r>
+    </w:p>
+    <w:p>
+      <w:r>
+        <w:t>images, base64 data, or API keys.</w:t>
       </w:r>
     </w:p>
     <w:p>
@@ -2613,7 +2903,7 @@
         <w:pStyle w:val="ListNumber"/>
       </w:pPr>
       <w:r>
-        <w:t>Show Expression Detection Mode and External AI.</w:t>
+        <w:t>Show Expression Detection Mode and AI Analysis.</w:t>
       </w:r>
     </w:p>
     <w:p>
@@ -2621,12 +2911,12 @@
         <w:pStyle w:val="ListNumber"/>
       </w:pPr>
       <w:r>
-        <w:t>Explain that AI is off by default, requires consent, requires an API key, and</w:t>
+        <w:t>Choose Local Ollama and explain that it runs on this computer, needs</w:t>
       </w:r>
     </w:p>
     <w:p>
       <w:r>
-        <w:t>uses cropped-face-only mode by default.</w:t>
+        <w:t>Ollama plus a local vision model, and does not need OpenAI quota.</w:t>
       </w:r>
     </w:p>
     <w:p>
@@ -2634,7 +2924,25 @@
         <w:pStyle w:val="ListNumber"/>
       </w:pPr>
       <w:r>
-        <w:t>Show Test Connection without entering a real key in public screenshots.</w:t>
+        <w:t>Show Test Connection. If Ollama is not installed, explain the message and</w:t>
+      </w:r>
+    </w:p>
+    <w:p>
+      <w:r>
+        <w:t>the ollama pull llava:7b setup step.</w:t>
+      </w:r>
+    </w:p>
+    <w:p>
+      <w:pPr>
+        <w:pStyle w:val="ListNumber"/>
+      </w:pPr>
+      <w:r>
+        <w:t>Optionally switch to OpenAI and explain that it requires an API key,</w:t>
+      </w:r>
+    </w:p>
+    <w:p>
+      <w:r>
+        <w:t>quota, internet access, and consent before any cloud request can run.</w:t>
       </w:r>
     </w:p>
     <w:p>
@@ -2647,7 +2955,7 @@
     </w:p>
     <w:p>
       <w:r>
-        <w:t>key is configured.</w:t>
+        <w:t>provider is ready.</w:t>
       </w:r>
     </w:p>
     <w:p>
@@ -2954,7 +3262,7 @@
           </w:tcPr>
           <w:p>
             <w:r>
-              <w:t>External AI stays off</w:t>
+              <w:t>AI stays off</w:t>
             </w:r>
           </w:p>
         </w:tc>
@@ -2965,7 +3273,7 @@
           </w:tcPr>
           <w:p>
             <w:r>
-              <w:t>Check that Enable External AI Analysis and consent are both enabled.</w:t>
+              <w:t>Check that Enable AI Analysis and consent are both enabled.</w:t>
             </w:r>
           </w:p>
         </w:tc>
@@ -2978,7 +3286,55 @@
           </w:tcPr>
           <w:p>
             <w:r>
-              <w:t>External AI says missing key</w:t>
+              <w:t>Local Ollama says it cannot connect</w:t>
+            </w:r>
+          </w:p>
+        </w:tc>
+        <w:tc>
+          <w:tcPr>
+            <w:tcW w:type="dxa" w:w="4680"/>
+            <w:vAlign w:val="center"/>
+          </w:tcPr>
+          <w:p>
+            <w:r>
+              <w:t>Install/start Ollama, keep endpoint http://localhost:11434, then click Test Connection.</w:t>
+            </w:r>
+          </w:p>
+        </w:tc>
+      </w:tr>
+      <w:tr>
+        <w:tc>
+          <w:tcPr>
+            <w:tcW w:type="dxa" w:w="4680"/>
+            <w:vAlign w:val="center"/>
+          </w:tcPr>
+          <w:p>
+            <w:r>
+              <w:t>Local Ollama says model is missing</w:t>
+            </w:r>
+          </w:p>
+        </w:tc>
+        <w:tc>
+          <w:tcPr>
+            <w:tcW w:type="dxa" w:w="4680"/>
+            <w:vAlign w:val="center"/>
+          </w:tcPr>
+          <w:p>
+            <w:r>
+              <w:t>Run ollama pull llava:7b, or enter the exact local vision model you installed.</w:t>
+            </w:r>
+          </w:p>
+        </w:tc>
+      </w:tr>
+      <w:tr>
+        <w:tc>
+          <w:tcPr>
+            <w:tcW w:type="dxa" w:w="4680"/>
+            <w:vAlign w:val="center"/>
+          </w:tcPr>
+          <w:p>
+            <w:r>
+              <w:t>OpenAI says missing key</w:t>
             </w:r>
           </w:p>
         </w:tc>
@@ -3002,7 +3358,7 @@
           </w:tcPr>
           <w:p>
             <w:r>
-              <w:t>External AI errors or times out</w:t>
+              <w:t>OpenAI says insufficient quota</w:t>
             </w:r>
           </w:p>
         </w:tc>
@@ -3013,7 +3369,31 @@
           </w:tcPr>
           <w:p>
             <w:r>
-              <w:t>Check internet access, API key validity, rate limits, model availability, and timeout setting. Local fallback continues.</w:t>
+              <w:t>Add billing/credits/quota to the OpenAI project or use Local Ollama instead.</w:t>
+            </w:r>
+          </w:p>
+        </w:tc>
+      </w:tr>
+      <w:tr>
+        <w:tc>
+          <w:tcPr>
+            <w:tcW w:type="dxa" w:w="4680"/>
+            <w:vAlign w:val="center"/>
+          </w:tcPr>
+          <w:p>
+            <w:r>
+              <w:t>AI errors or times out</w:t>
+            </w:r>
+          </w:p>
+        </w:tc>
+        <w:tc>
+          <w:tcPr>
+            <w:tcW w:type="dxa" w:w="4680"/>
+            <w:vAlign w:val="center"/>
+          </w:tcPr>
+          <w:p>
+            <w:r>
+              <w:t>Check provider setup, model availability, timeout setting, and local fallback status.</w:t>
             </w:r>
           </w:p>
         </w:tc>
@@ -3096,12 +3476,20 @@
         <w:pStyle w:val="ListBullet"/>
       </w:pPr>
       <w:r>
-        <w:t>External AI analysis requires network access and may send cropped face images</w:t>
+        <w:t>Local Ollama AI requires Ollama and a local vision model installed separately.</w:t>
+      </w:r>
+    </w:p>
+    <w:p>
+      <w:pPr>
+        <w:pStyle w:val="ListBullet"/>
+      </w:pPr>
+      <w:r>
+        <w:t>OpenAI analysis requires network access, an API key, quota, and explicit</w:t>
       </w:r>
     </w:p>
     <w:p>
       <w:r>
-        <w:t>or selected frames when explicitly enabled.</w:t>
+        <w:t>consent before it can send selected cropped face images or frames.</w:t>
       </w:r>
     </w:p>
     <w:p>
@@ -3109,7 +3497,7 @@
         <w:pStyle w:val="ListBullet"/>
       </w:pPr>
       <w:r>
-        <w:t>External AI may improve visible-expression estimates but can still be wrong.</w:t>
+        <w:t>AI may improve visible-expression estimates but can still be wrong.</w:t>
       </w:r>
     </w:p>
     <w:p>

</xml_diff>